<commit_message>
added payment service and updated docs accordingly
</commit_message>
<xml_diff>
--- a/docs/EventCart-QA-Application-Flow.docx
+++ b/docs/EventCart-QA-Application-Flow.docx
@@ -276,7 +276,7 @@
     </w:p>
     <w:p>
       <w:r>
-        <w:t>The current working slice covers product catalog, cart, order placement, inventory reservation, Redis idempotency, and Kafka-based order status updates.</w:t>
+        <w:t>The current working slice covers product catalog, cart, order placement, inventory reservation, payment simulation, Redis idempotency, and Kafka-based order status updates.</w:t>
       </w:r>
     </w:p>
     <w:tbl>
@@ -556,6 +556,54 @@
               <w:rPr>
                 <w:sz w:val="18"/>
               </w:rPr>
+              <w:t>Payments</w:t>
+            </w:r>
+          </w:p>
+        </w:tc>
+        <w:tc>
+          <w:tcPr>
+            <w:tcW w:type="dxa" w:w="7160"/>
+            <w:tcMar>
+              <w:top w:w="80" w:type="dxa"/>
+              <w:start w:w="120" w:type="dxa"/>
+              <w:bottom w:w="80" w:type="dxa"/>
+              <w:end w:w="120" w:type="dxa"/>
+            </w:tcMar>
+            <w:vAlign w:val="center"/>
+          </w:tcPr>
+          <w:p>
+            <w:pPr>
+              <w:spacing w:after="0"/>
+            </w:pPr>
+            <w:r>
+              <w:rPr>
+                <w:sz w:val="18"/>
+              </w:rPr>
+              <w:t>Consume inventory success events, simulate payment, publish payment result events</w:t>
+            </w:r>
+          </w:p>
+        </w:tc>
+      </w:tr>
+      <w:tr>
+        <w:tc>
+          <w:tcPr>
+            <w:tcW w:type="dxa" w:w="2200"/>
+            <w:tcMar>
+              <w:top w:w="80" w:type="dxa"/>
+              <w:start w:w="120" w:type="dxa"/>
+              <w:bottom w:w="80" w:type="dxa"/>
+              <w:end w:w="120" w:type="dxa"/>
+            </w:tcMar>
+            <w:vAlign w:val="center"/>
+          </w:tcPr>
+          <w:p>
+            <w:pPr>
+              <w:spacing w:after="0"/>
+            </w:pPr>
+            <w:r>
+              <w:rPr>
+                <w:sz w:val="18"/>
+              </w:rPr>
               <w:t>Order status</w:t>
             </w:r>
           </w:p>
@@ -579,7 +627,7 @@
               <w:rPr>
                 <w:sz w:val="18"/>
               </w:rPr>
-              <w:t>Consume inventory result events and update order status</w:t>
+              <w:t>Consume inventory and payment result events and update order status</w:t>
             </w:r>
           </w:p>
         </w:tc>
@@ -1207,6 +1255,100 @@
               <w:rPr>
                 <w:sz w:val="18"/>
               </w:rPr>
+              <w:t>payment-service</w:t>
+            </w:r>
+          </w:p>
+        </w:tc>
+        <w:tc>
+          <w:tcPr>
+            <w:tcW w:type="dxa" w:w="2100"/>
+            <w:tcMar>
+              <w:top w:w="80" w:type="dxa"/>
+              <w:start w:w="120" w:type="dxa"/>
+              <w:bottom w:w="80" w:type="dxa"/>
+              <w:end w:w="120" w:type="dxa"/>
+            </w:tcMar>
+            <w:vAlign w:val="center"/>
+          </w:tcPr>
+          <w:p>
+            <w:pPr>
+              <w:spacing w:after="0"/>
+            </w:pPr>
+            <w:r>
+              <w:rPr>
+                <w:sz w:val="18"/>
+              </w:rPr>
+              <w:t>8085</w:t>
+            </w:r>
+          </w:p>
+        </w:tc>
+        <w:tc>
+          <w:tcPr>
+            <w:tcW w:type="dxa" w:w="2300"/>
+            <w:tcMar>
+              <w:top w:w="80" w:type="dxa"/>
+              <w:start w:w="120" w:type="dxa"/>
+              <w:bottom w:w="80" w:type="dxa"/>
+              <w:end w:w="120" w:type="dxa"/>
+            </w:tcMar>
+            <w:vAlign w:val="center"/>
+          </w:tcPr>
+          <w:p>
+            <w:pPr>
+              <w:spacing w:after="0"/>
+            </w:pPr>
+            <w:r>
+              <w:rPr>
+                <w:sz w:val="18"/>
+              </w:rPr>
+              <w:t>Owns mock payment attempts</w:t>
+            </w:r>
+          </w:p>
+        </w:tc>
+        <w:tc>
+          <w:tcPr>
+            <w:tcW w:type="dxa" w:w="3160"/>
+            <w:tcMar>
+              <w:top w:w="80" w:type="dxa"/>
+              <w:start w:w="120" w:type="dxa"/>
+              <w:bottom w:w="80" w:type="dxa"/>
+              <w:end w:w="120" w:type="dxa"/>
+            </w:tcMar>
+            <w:vAlign w:val="center"/>
+          </w:tcPr>
+          <w:p>
+            <w:pPr>
+              <w:spacing w:after="0"/>
+            </w:pPr>
+            <w:r>
+              <w:rPr>
+                <w:sz w:val="18"/>
+              </w:rPr>
+              <w:t>MongoDB `eventcart_payment.payment_attempts`</w:t>
+            </w:r>
+          </w:p>
+        </w:tc>
+      </w:tr>
+      <w:tr>
+        <w:tc>
+          <w:tcPr>
+            <w:tcW w:type="dxa" w:w="1800"/>
+            <w:tcMar>
+              <w:top w:w="80" w:type="dxa"/>
+              <w:start w:w="120" w:type="dxa"/>
+              <w:bottom w:w="80" w:type="dxa"/>
+              <w:end w:w="120" w:type="dxa"/>
+            </w:tcMar>
+            <w:vAlign w:val="center"/>
+          </w:tcPr>
+          <w:p>
+            <w:pPr>
+              <w:spacing w:after="0"/>
+            </w:pPr>
+            <w:r>
+              <w:rPr>
+                <w:sz w:val="18"/>
+              </w:rPr>
               <w:t>MongoDB</w:t>
             </w:r>
           </w:p>
@@ -1718,6 +1860,90 @@
           <w:rFonts w:ascii="Courier New" w:hAnsi="Courier New"/>
           <w:sz w:val="17"/>
         </w:rPr>
+        <w:t xml:space="preserve">    M --&gt; R["payment-service simulates payment"]</w:t>
+      </w:r>
+    </w:p>
+    <w:p>
+      <w:pPr>
+        <w:spacing w:before="0" w:after="0"/>
+        <w:ind w:left="216"/>
+        <w:shd w:fill="F4F6F9"/>
+      </w:pPr>
+      <w:r>
+        <w:rPr>
+          <w:rFonts w:ascii="Courier New" w:hAnsi="Courier New"/>
+          <w:sz w:val="17"/>
+        </w:rPr>
+        <w:t xml:space="preserve">    R --&gt; S{"Payment accepted?"}</w:t>
+      </w:r>
+    </w:p>
+    <w:p>
+      <w:pPr>
+        <w:spacing w:before="0" w:after="0"/>
+        <w:ind w:left="216"/>
+        <w:shd w:fill="F4F6F9"/>
+      </w:pPr>
+      <w:r>
+        <w:rPr>
+          <w:rFonts w:ascii="Courier New" w:hAnsi="Courier New"/>
+          <w:sz w:val="17"/>
+        </w:rPr>
+        <w:t xml:space="preserve">    S --&gt;|Yes| T["payment-service publishes PaymentCompletedEvent"]</w:t>
+      </w:r>
+    </w:p>
+    <w:p>
+      <w:pPr>
+        <w:spacing w:before="0" w:after="0"/>
+        <w:ind w:left="216"/>
+        <w:shd w:fill="F4F6F9"/>
+      </w:pPr>
+      <w:r>
+        <w:rPr>
+          <w:rFonts w:ascii="Courier New" w:hAnsi="Courier New"/>
+          <w:sz w:val="17"/>
+        </w:rPr>
+        <w:t xml:space="preserve">    S --&gt;|No| U["payment-service publishes PaymentFailedEvent"]</w:t>
+      </w:r>
+    </w:p>
+    <w:p>
+      <w:pPr>
+        <w:spacing w:before="0" w:after="0"/>
+        <w:ind w:left="216"/>
+        <w:shd w:fill="F4F6F9"/>
+      </w:pPr>
+      <w:r>
+        <w:rPr>
+          <w:rFonts w:ascii="Courier New" w:hAnsi="Courier New"/>
+          <w:sz w:val="17"/>
+        </w:rPr>
+        <w:t xml:space="preserve">    T --&gt; V["order-service updates order to PAYMENT_COMPLETED"]</w:t>
+      </w:r>
+    </w:p>
+    <w:p>
+      <w:pPr>
+        <w:spacing w:before="0" w:after="0"/>
+        <w:ind w:left="216"/>
+        <w:shd w:fill="F4F6F9"/>
+      </w:pPr>
+      <w:r>
+        <w:rPr>
+          <w:rFonts w:ascii="Courier New" w:hAnsi="Courier New"/>
+          <w:sz w:val="17"/>
+        </w:rPr>
+        <w:t xml:space="preserve">    U --&gt; W["order-service updates order to PAYMENT_FAILED"]</w:t>
+      </w:r>
+    </w:p>
+    <w:p>
+      <w:pPr>
+        <w:spacing w:before="0" w:after="0"/>
+        <w:ind w:left="216"/>
+        <w:shd w:fill="F4F6F9"/>
+      </w:pPr>
+      <w:r>
+        <w:rPr>
+          <w:rFonts w:ascii="Courier New" w:hAnsi="Courier New"/>
+          <w:sz w:val="17"/>
+        </w:rPr>
         <w:t xml:space="preserve">    N --&gt; Q["order-service updates order to INVENTORY_FAILED"]</w:t>
       </w:r>
     </w:p>
@@ -1869,12 +2095,26 @@
     </w:p>
     <w:p>
       <w:pPr>
+        <w:spacing w:before="0" w:after="0"/>
+        <w:ind w:left="216"/>
+        <w:shd w:fill="F4F6F9"/>
+      </w:pPr>
+      <w:r>
+        <w:rPr>
+          <w:rFonts w:ascii="Courier New" w:hAnsi="Courier New"/>
+          <w:sz w:val="17"/>
+        </w:rPr>
+        <w:t>.\mvnw.cmd -pl services/payment-service spring-boot:run</w:t>
+      </w:r>
+    </w:p>
+    <w:p>
+      <w:pPr>
         <w:spacing w:after="80"/>
       </w:pPr>
     </w:p>
     <w:p>
       <w:r>
-        <w:t>The startup order matters for manual testing because cart-service calls catalog-service, order-service calls cart-service, and inventory/order communicate through Kafka.</w:t>
+        <w:t>The startup order matters for manual testing because cart-service calls catalog-service, order-service calls cart-service, and inventory/order/payment communicate through Kafka.</w:t>
       </w:r>
     </w:p>
     <w:p>
@@ -1944,6 +2184,20 @@
           <w:sz w:val="17"/>
         </w:rPr>
         <w:t>curl http://localhost:8084/actuator/health</w:t>
+      </w:r>
+    </w:p>
+    <w:p>
+      <w:pPr>
+        <w:spacing w:before="0" w:after="0"/>
+        <w:ind w:left="216"/>
+        <w:shd w:fill="F4F6F9"/>
+      </w:pPr>
+      <w:r>
+        <w:rPr>
+          <w:rFonts w:ascii="Courier New" w:hAnsi="Courier New"/>
+          <w:sz w:val="17"/>
+        </w:rPr>
+        <w:t>curl http://localhost:8085/actuator/health</w:t>
       </w:r>
     </w:p>
     <w:p>
@@ -2231,6 +2485,54 @@
           </w:p>
         </w:tc>
       </w:tr>
+      <w:tr>
+        <w:tc>
+          <w:tcPr>
+            <w:tcW w:type="dxa" w:w="2200"/>
+            <w:tcMar>
+              <w:top w:w="80" w:type="dxa"/>
+              <w:start w:w="120" w:type="dxa"/>
+              <w:bottom w:w="80" w:type="dxa"/>
+              <w:end w:w="120" w:type="dxa"/>
+            </w:tcMar>
+            <w:vAlign w:val="center"/>
+          </w:tcPr>
+          <w:p>
+            <w:pPr>
+              <w:spacing w:after="0"/>
+            </w:pPr>
+            <w:r>
+              <w:rPr>
+                <w:sz w:val="18"/>
+              </w:rPr>
+              <w:t>payment-service</w:t>
+            </w:r>
+          </w:p>
+        </w:tc>
+        <w:tc>
+          <w:tcPr>
+            <w:tcW w:type="dxa" w:w="7160"/>
+            <w:tcMar>
+              <w:top w:w="80" w:type="dxa"/>
+              <w:start w:w="120" w:type="dxa"/>
+              <w:bottom w:w="80" w:type="dxa"/>
+              <w:end w:w="120" w:type="dxa"/>
+            </w:tcMar>
+            <w:vAlign w:val="center"/>
+          </w:tcPr>
+          <w:p>
+            <w:pPr>
+              <w:spacing w:after="0"/>
+            </w:pPr>
+            <w:r>
+              <w:rPr>
+                <w:sz w:val="18"/>
+              </w:rPr>
+              <w:t>`http://localhost:8085/swagger-ui.html`</w:t>
+            </w:r>
+          </w:p>
+        </w:tc>
+      </w:tr>
     </w:tbl>
     <w:p>
       <w:pPr>
@@ -3781,6 +4083,31 @@
       </w:r>
     </w:p>
     <w:p>
+      <w:pPr>
+        <w:pStyle w:val="ListBullet"/>
+      </w:pPr>
+      <w:r>
+        <w:rPr>
+          <w:rFonts w:ascii="Courier New" w:hAnsi="Courier New"/>
+          <w:sz w:val="19"/>
+        </w:rPr>
+        <w:t>totalAmount</w:t>
+      </w:r>
+      <w:r>
+        <w:t xml:space="preserve"> and </w:t>
+      </w:r>
+      <w:r>
+        <w:rPr>
+          <w:rFonts w:ascii="Courier New" w:hAnsi="Courier New"/>
+          <w:sz w:val="19"/>
+        </w:rPr>
+        <w:t>currency</w:t>
+      </w:r>
+      <w:r>
+        <w:t xml:space="preserve"> match the order amount. payment-service uses these fields.</w:t>
+      </w:r>
+    </w:p>
+    <w:p>
       <w:r>
         <w:t>Verify inventory item quantities:</w:t>
       </w:r>
@@ -3844,7 +4171,7 @@
         <w:pStyle w:val="Heading2"/>
       </w:pPr>
       <w:r>
-        <w:t>Step 7: Verify Order Status Update</w:t>
+        <w:t>Step 7: Verify Inventory Order Status Update</w:t>
       </w:r>
     </w:p>
     <w:p>
@@ -3898,7 +4225,17 @@
         <w:t>INVENTORY_RESERVED</w:t>
       </w:r>
       <w:r>
-        <w:t>.</w:t>
+        <w:t xml:space="preserve"> before payment result processing completes, or it may already be </w:t>
+      </w:r>
+      <w:r>
+        <w:rPr>
+          <w:rFonts w:ascii="Courier New" w:hAnsi="Courier New"/>
+          <w:sz w:val="19"/>
+        </w:rPr>
+        <w:t>PAYMENT_COMPLETED</w:t>
+      </w:r>
+      <w:r>
+        <w:t xml:space="preserve"> if payment-service and order-service processed the later payment event quickly.</w:t>
       </w:r>
     </w:p>
     <w:p>
@@ -3936,7 +4273,291 @@
         <w:pStyle w:val="Heading2"/>
       </w:pPr>
       <w:r>
-        <w:t>Step 8: Verify Cart Cleanup</w:t>
+        <w:t>Step 8: Verify Payment Attempt</w:t>
+      </w:r>
+    </w:p>
+    <w:p>
+      <w:r>
+        <w:t xml:space="preserve">payment-service consumes </w:t>
+      </w:r>
+      <w:r>
+        <w:rPr>
+          <w:rFonts w:ascii="Courier New" w:hAnsi="Courier New"/>
+          <w:sz w:val="19"/>
+        </w:rPr>
+        <w:t>InventoryReservedEvent</w:t>
+      </w:r>
+      <w:r>
+        <w:t xml:space="preserve"> asynchronously. Wait a few seconds, then call payment-service:</w:t>
+      </w:r>
+    </w:p>
+    <w:p>
+      <w:pPr>
+        <w:spacing w:before="0" w:after="0"/>
+        <w:ind w:left="216"/>
+        <w:shd w:fill="F4F6F9"/>
+      </w:pPr>
+      <w:r>
+        <w:rPr>
+          <w:rFonts w:ascii="Courier New" w:hAnsi="Courier New"/>
+          <w:sz w:val="17"/>
+        </w:rPr>
+        <w:t>curl http://localhost:8085/api/v1/payments/orders/&lt;order-id&gt;</w:t>
+      </w:r>
+    </w:p>
+    <w:p>
+      <w:pPr>
+        <w:spacing w:after="80"/>
+      </w:pPr>
+    </w:p>
+    <w:p>
+      <w:r>
+        <w:t>Expected happy-path result:</w:t>
+      </w:r>
+    </w:p>
+    <w:p>
+      <w:pPr>
+        <w:pStyle w:val="ListBullet"/>
+      </w:pPr>
+      <w:r>
+        <w:t>Payment attempt exists.</w:t>
+      </w:r>
+    </w:p>
+    <w:p>
+      <w:pPr>
+        <w:pStyle w:val="ListBullet"/>
+      </w:pPr>
+      <w:r>
+        <w:rPr>
+          <w:rFonts w:ascii="Courier New" w:hAnsi="Courier New"/>
+          <w:sz w:val="19"/>
+        </w:rPr>
+        <w:t>status</w:t>
+      </w:r>
+      <w:r>
+        <w:t xml:space="preserve"> is </w:t>
+      </w:r>
+      <w:r>
+        <w:rPr>
+          <w:rFonts w:ascii="Courier New" w:hAnsi="Courier New"/>
+          <w:sz w:val="19"/>
+        </w:rPr>
+        <w:t>COMPLETED</w:t>
+      </w:r>
+      <w:r>
+        <w:t>.</w:t>
+      </w:r>
+    </w:p>
+    <w:p>
+      <w:pPr>
+        <w:pStyle w:val="ListBullet"/>
+      </w:pPr>
+      <w:r>
+        <w:rPr>
+          <w:rFonts w:ascii="Courier New" w:hAnsi="Courier New"/>
+          <w:sz w:val="19"/>
+        </w:rPr>
+        <w:t>amount</w:t>
+      </w:r>
+      <w:r>
+        <w:t xml:space="preserve"> and </w:t>
+      </w:r>
+      <w:r>
+        <w:rPr>
+          <w:rFonts w:ascii="Courier New" w:hAnsi="Courier New"/>
+          <w:sz w:val="19"/>
+        </w:rPr>
+        <w:t>currency</w:t>
+      </w:r>
+      <w:r>
+        <w:t xml:space="preserve"> match the order.</w:t>
+      </w:r>
+    </w:p>
+    <w:p>
+      <w:pPr>
+        <w:pStyle w:val="ListBullet"/>
+      </w:pPr>
+      <w:r>
+        <w:rPr>
+          <w:rFonts w:ascii="Courier New" w:hAnsi="Courier New"/>
+          <w:sz w:val="19"/>
+        </w:rPr>
+        <w:t>providerTransactionId</w:t>
+      </w:r>
+      <w:r>
+        <w:t xml:space="preserve"> starts with </w:t>
+      </w:r>
+      <w:r>
+        <w:rPr>
+          <w:rFonts w:ascii="Courier New" w:hAnsi="Courier New"/>
+          <w:sz w:val="19"/>
+        </w:rPr>
+        <w:t>MockPay-</w:t>
+      </w:r>
+      <w:r>
+        <w:t>.</w:t>
+      </w:r>
+    </w:p>
+    <w:p>
+      <w:r>
+        <w:t>Verify through MongoDB:</w:t>
+      </w:r>
+    </w:p>
+    <w:p>
+      <w:pPr>
+        <w:spacing w:before="0" w:after="0"/>
+        <w:ind w:left="216"/>
+        <w:shd w:fill="F4F6F9"/>
+      </w:pPr>
+      <w:r>
+        <w:rPr>
+          <w:rFonts w:ascii="Courier New" w:hAnsi="Courier New"/>
+          <w:sz w:val="17"/>
+        </w:rPr>
+        <w:t>use eventcart_payment</w:t>
+      </w:r>
+    </w:p>
+    <w:p>
+      <w:pPr>
+        <w:spacing w:before="0" w:after="0"/>
+        <w:ind w:left="216"/>
+        <w:shd w:fill="F4F6F9"/>
+      </w:pPr>
+      <w:r>
+        <w:rPr>
+          <w:rFonts w:ascii="Courier New" w:hAnsi="Courier New"/>
+          <w:sz w:val="17"/>
+        </w:rPr>
+        <w:t>db.payment_attempts.find({ orderId: "&lt;order-id&gt;" }).pretty()</w:t>
+      </w:r>
+    </w:p>
+    <w:p>
+      <w:pPr>
+        <w:spacing w:after="80"/>
+      </w:pPr>
+    </w:p>
+    <w:p>
+      <w:r>
+        <w:t>Payment simulation rule:</w:t>
+      </w:r>
+    </w:p>
+    <w:p>
+      <w:pPr>
+        <w:spacing w:before="0" w:after="0"/>
+        <w:ind w:left="216"/>
+        <w:shd w:fill="F4F6F9"/>
+      </w:pPr>
+      <w:r>
+        <w:rPr>
+          <w:rFonts w:ascii="Courier New" w:hAnsi="Courier New"/>
+          <w:sz w:val="17"/>
+        </w:rPr>
+        <w:t>Amounts below 50000.00 complete. Amounts at or above 50000.00 fail.</w:t>
+      </w:r>
+    </w:p>
+    <w:p>
+      <w:pPr>
+        <w:spacing w:after="80"/>
+      </w:pPr>
+    </w:p>
+    <w:p>
+      <w:pPr>
+        <w:pStyle w:val="Heading2"/>
+      </w:pPr>
+      <w:r>
+        <w:t>Step 9: Verify Final Order Status</w:t>
+      </w:r>
+    </w:p>
+    <w:p>
+      <w:r>
+        <w:t>Call order-service again:</w:t>
+      </w:r>
+    </w:p>
+    <w:p>
+      <w:pPr>
+        <w:spacing w:before="0" w:after="0"/>
+        <w:ind w:left="216"/>
+        <w:shd w:fill="F4F6F9"/>
+      </w:pPr>
+      <w:r>
+        <w:rPr>
+          <w:rFonts w:ascii="Courier New" w:hAnsi="Courier New"/>
+          <w:sz w:val="17"/>
+        </w:rPr>
+        <w:t>curl http://localhost:8083/api/v1/orders/&lt;order-id&gt;</w:t>
+      </w:r>
+    </w:p>
+    <w:p>
+      <w:pPr>
+        <w:spacing w:after="80"/>
+      </w:pPr>
+    </w:p>
+    <w:p>
+      <w:r>
+        <w:t>Expected happy-path result:</w:t>
+      </w:r>
+    </w:p>
+    <w:p>
+      <w:pPr>
+        <w:pStyle w:val="ListBullet"/>
+      </w:pPr>
+      <w:r>
+        <w:rPr>
+          <w:rFonts w:ascii="Courier New" w:hAnsi="Courier New"/>
+          <w:sz w:val="19"/>
+        </w:rPr>
+        <w:t>status</w:t>
+      </w:r>
+      <w:r>
+        <w:t xml:space="preserve"> becomes </w:t>
+      </w:r>
+      <w:r>
+        <w:rPr>
+          <w:rFonts w:ascii="Courier New" w:hAnsi="Courier New"/>
+          <w:sz w:val="19"/>
+        </w:rPr>
+        <w:t>PAYMENT_COMPLETED</w:t>
+      </w:r>
+      <w:r>
+        <w:t>.</w:t>
+      </w:r>
+    </w:p>
+    <w:p>
+      <w:pPr>
+        <w:pStyle w:val="ListBullet"/>
+      </w:pPr>
+      <w:r>
+        <w:rPr>
+          <w:rFonts w:ascii="Courier New" w:hAnsi="Courier New"/>
+          <w:sz w:val="19"/>
+        </w:rPr>
+        <w:t>statusReason</w:t>
+      </w:r>
+      <w:r>
+        <w:t xml:space="preserve"> is null.</w:t>
+      </w:r>
+    </w:p>
+    <w:p>
+      <w:r>
+        <w:t xml:space="preserve">If the status is still </w:t>
+      </w:r>
+      <w:r>
+        <w:rPr>
+          <w:rFonts w:ascii="Courier New" w:hAnsi="Courier New"/>
+          <w:sz w:val="19"/>
+        </w:rPr>
+        <w:t>INVENTORY_RESERVED</w:t>
+      </w:r>
+      <w:r>
+        <w:t>, payment-service may still be processing, Kafka may not be running, or order-service may not have consumed the payment result event yet.</w:t>
+      </w:r>
+    </w:p>
+    <w:p>
+      <w:pPr>
+        <w:pStyle w:val="Heading2"/>
+      </w:pPr>
+      <w:r>
+        <w:t>Step 10: Verify Cart Cleanup</w:t>
       </w:r>
     </w:p>
     <w:p>
@@ -4094,6 +4715,34 @@
     </w:p>
     <w:p>
       <w:pPr>
+        <w:spacing w:before="0" w:after="0"/>
+        <w:ind w:left="216"/>
+        <w:shd w:fill="F4F6F9"/>
+      </w:pPr>
+      <w:r>
+        <w:rPr>
+          <w:rFonts w:ascii="Courier New" w:hAnsi="Courier New"/>
+          <w:sz w:val="17"/>
+        </w:rPr>
+        <w:t>eventcart.payments.completed</w:t>
+      </w:r>
+    </w:p>
+    <w:p>
+      <w:pPr>
+        <w:spacing w:before="0" w:after="0"/>
+        <w:ind w:left="216"/>
+        <w:shd w:fill="F4F6F9"/>
+      </w:pPr>
+      <w:r>
+        <w:rPr>
+          <w:rFonts w:ascii="Courier New" w:hAnsi="Courier New"/>
+          <w:sz w:val="17"/>
+        </w:rPr>
+        <w:t>eventcart.payments.failed</w:t>
+      </w:r>
+    </w:p>
+    <w:p>
+      <w:pPr>
         <w:spacing w:after="80"/>
       </w:pPr>
     </w:p>
@@ -4170,6 +4819,54 @@
       </w:pPr>
     </w:p>
     <w:p>
+      <w:r>
+        <w:t>Read payment-completed messages:</w:t>
+      </w:r>
+    </w:p>
+    <w:p>
+      <w:pPr>
+        <w:spacing w:before="0" w:after="0"/>
+        <w:ind w:left="216"/>
+        <w:shd w:fill="F4F6F9"/>
+      </w:pPr>
+      <w:r>
+        <w:rPr>
+          <w:rFonts w:ascii="Courier New" w:hAnsi="Courier New"/>
+          <w:sz w:val="17"/>
+        </w:rPr>
+        <w:t>docker exec -it eventcart-kafka /opt/kafka/bin/kafka-console-consumer.sh --bootstrap-server localhost:9092 --topic eventcart.payments.completed --from-beginning --max-messages 5</w:t>
+      </w:r>
+    </w:p>
+    <w:p>
+      <w:pPr>
+        <w:spacing w:after="80"/>
+      </w:pPr>
+    </w:p>
+    <w:p>
+      <w:r>
+        <w:t>Read payment-failed messages:</w:t>
+      </w:r>
+    </w:p>
+    <w:p>
+      <w:pPr>
+        <w:spacing w:before="0" w:after="0"/>
+        <w:ind w:left="216"/>
+        <w:shd w:fill="F4F6F9"/>
+      </w:pPr>
+      <w:r>
+        <w:rPr>
+          <w:rFonts w:ascii="Courier New" w:hAnsi="Courier New"/>
+          <w:sz w:val="17"/>
+        </w:rPr>
+        <w:t>docker exec -it eventcart-kafka /opt/kafka/bin/kafka-console-consumer.sh --bootstrap-server localhost:9092 --topic eventcart.payments.failed --from-beginning --max-messages 5</w:t>
+      </w:r>
+    </w:p>
+    <w:p>
+      <w:pPr>
+        <w:spacing w:after="80"/>
+      </w:pPr>
+    </w:p>
+    <w:p>
       <w:pPr>
         <w:pStyle w:val="Heading1"/>
       </w:pPr>
@@ -4635,6 +5332,398 @@
           <w:sz w:val="17"/>
         </w:rPr>
         <w:t>curl http://localhost:8084/api/v1/inventory/reservations/&lt;order-id&gt;</w:t>
+      </w:r>
+    </w:p>
+    <w:p>
+      <w:pPr>
+        <w:spacing w:before="0" w:after="0"/>
+        <w:ind w:left="216"/>
+        <w:shd w:fill="F4F6F9"/>
+      </w:pPr>
+      <w:r>
+        <w:rPr>
+          <w:rFonts w:ascii="Courier New" w:hAnsi="Courier New"/>
+          <w:sz w:val="17"/>
+        </w:rPr>
+        <w:t>curl http://localhost:8083/api/v1/orders/&lt;order-id&gt;</w:t>
+      </w:r>
+    </w:p>
+    <w:p>
+      <w:pPr>
+        <w:spacing w:before="0" w:after="0"/>
+        <w:ind w:left="216"/>
+        <w:shd w:fill="F4F6F9"/>
+      </w:pPr>
+      <w:r>
+        <w:rPr>
+          <w:rFonts w:ascii="Courier New" w:hAnsi="Courier New"/>
+          <w:sz w:val="17"/>
+        </w:rPr>
+        <w:t>curl http://localhost:8082/api/v1/carts/customer-1</w:t>
+      </w:r>
+    </w:p>
+    <w:p>
+      <w:pPr>
+        <w:spacing w:after="80"/>
+      </w:pPr>
+    </w:p>
+    <w:p>
+      <w:pPr>
+        <w:pStyle w:val="Heading1"/>
+      </w:pPr>
+      <w:r>
+        <w:t>Negative Flow: Payment Failure</w:t>
+      </w:r>
+    </w:p>
+    <w:p>
+      <w:r>
+        <w:t>Use this to verify payment decline behavior.</w:t>
+      </w:r>
+    </w:p>
+    <w:p>
+      <w:pPr>
+        <w:pStyle w:val="ListNumber"/>
+      </w:pPr>
+      <w:r>
+        <w:t xml:space="preserve">Create or update a product so the order total is at least </w:t>
+      </w:r>
+      <w:r>
+        <w:rPr>
+          <w:rFonts w:ascii="Courier New" w:hAnsi="Courier New"/>
+          <w:sz w:val="19"/>
+        </w:rPr>
+        <w:t>50000.00</w:t>
+      </w:r>
+      <w:r>
+        <w:t>.</w:t>
+      </w:r>
+    </w:p>
+    <w:p>
+      <w:pPr>
+        <w:pStyle w:val="ListNumber"/>
+      </w:pPr>
+      <w:r>
+        <w:t>Seed enough inventory for the product.</w:t>
+      </w:r>
+    </w:p>
+    <w:p>
+      <w:pPr>
+        <w:pStyle w:val="ListNumber"/>
+      </w:pPr>
+      <w:r>
+        <w:t>Add the product to cart.</w:t>
+      </w:r>
+    </w:p>
+    <w:p>
+      <w:pPr>
+        <w:pStyle w:val="ListNumber"/>
+      </w:pPr>
+      <w:r>
+        <w:t>Place the order with a fresh idempotency key.</w:t>
+      </w:r>
+    </w:p>
+    <w:p>
+      <w:r>
+        <w:t>Example high-value product:</w:t>
+      </w:r>
+    </w:p>
+    <w:p>
+      <w:pPr>
+        <w:spacing w:before="0" w:after="0"/>
+        <w:ind w:left="216"/>
+        <w:shd w:fill="F4F6F9"/>
+      </w:pPr>
+      <w:r>
+        <w:rPr>
+          <w:rFonts w:ascii="Courier New" w:hAnsi="Courier New"/>
+          <w:sz w:val="17"/>
+        </w:rPr>
+        <w:t>curl -X POST \</w:t>
+      </w:r>
+    </w:p>
+    <w:p>
+      <w:pPr>
+        <w:spacing w:before="0" w:after="0"/>
+        <w:ind w:left="216"/>
+        <w:shd w:fill="F4F6F9"/>
+      </w:pPr>
+      <w:r>
+        <w:rPr>
+          <w:rFonts w:ascii="Courier New" w:hAnsi="Courier New"/>
+          <w:sz w:val="17"/>
+        </w:rPr>
+        <w:t xml:space="preserve">  http://localhost:8081/api/v1/products \</w:t>
+      </w:r>
+    </w:p>
+    <w:p>
+      <w:pPr>
+        <w:spacing w:before="0" w:after="0"/>
+        <w:ind w:left="216"/>
+        <w:shd w:fill="F4F6F9"/>
+      </w:pPr>
+      <w:r>
+        <w:rPr>
+          <w:rFonts w:ascii="Courier New" w:hAnsi="Courier New"/>
+          <w:sz w:val="17"/>
+        </w:rPr>
+        <w:t xml:space="preserve">  -H "Content-Type: application/json" \</w:t>
+      </w:r>
+    </w:p>
+    <w:p>
+      <w:pPr>
+        <w:spacing w:before="0" w:after="0"/>
+        <w:ind w:left="216"/>
+        <w:shd w:fill="F4F6F9"/>
+      </w:pPr>
+      <w:r>
+        <w:rPr>
+          <w:rFonts w:ascii="Courier New" w:hAnsi="Courier New"/>
+          <w:sz w:val="17"/>
+        </w:rPr>
+        <w:t xml:space="preserve">  -d '{</w:t>
+      </w:r>
+    </w:p>
+    <w:p>
+      <w:pPr>
+        <w:spacing w:before="0" w:after="0"/>
+        <w:ind w:left="216"/>
+        <w:shd w:fill="F4F6F9"/>
+      </w:pPr>
+      <w:r>
+        <w:rPr>
+          <w:rFonts w:ascii="Courier New" w:hAnsi="Courier New"/>
+          <w:sz w:val="17"/>
+        </w:rPr>
+        <w:t xml:space="preserve">    "sku": "SKU-9001",</w:t>
+      </w:r>
+    </w:p>
+    <w:p>
+      <w:pPr>
+        <w:spacing w:before="0" w:after="0"/>
+        <w:ind w:left="216"/>
+        <w:shd w:fill="F4F6F9"/>
+      </w:pPr>
+      <w:r>
+        <w:rPr>
+          <w:rFonts w:ascii="Courier New" w:hAnsi="Courier New"/>
+          <w:sz w:val="17"/>
+        </w:rPr>
+        <w:t xml:space="preserve">    "name": "Premium Workstation",</w:t>
+      </w:r>
+    </w:p>
+    <w:p>
+      <w:pPr>
+        <w:spacing w:before="0" w:after="0"/>
+        <w:ind w:left="216"/>
+        <w:shd w:fill="F4F6F9"/>
+      </w:pPr>
+      <w:r>
+        <w:rPr>
+          <w:rFonts w:ascii="Courier New" w:hAnsi="Courier New"/>
+          <w:sz w:val="17"/>
+        </w:rPr>
+        <w:t xml:space="preserve">    "description": "High-value workstation used to test payment failure",</w:t>
+      </w:r>
+    </w:p>
+    <w:p>
+      <w:pPr>
+        <w:spacing w:before="0" w:after="0"/>
+        <w:ind w:left="216"/>
+        <w:shd w:fill="F4F6F9"/>
+      </w:pPr>
+      <w:r>
+        <w:rPr>
+          <w:rFonts w:ascii="Courier New" w:hAnsi="Courier New"/>
+          <w:sz w:val="17"/>
+        </w:rPr>
+        <w:t xml:space="preserve">    "category": "Electronics",</w:t>
+      </w:r>
+    </w:p>
+    <w:p>
+      <w:pPr>
+        <w:spacing w:before="0" w:after="0"/>
+        <w:ind w:left="216"/>
+        <w:shd w:fill="F4F6F9"/>
+      </w:pPr>
+      <w:r>
+        <w:rPr>
+          <w:rFonts w:ascii="Courier New" w:hAnsi="Courier New"/>
+          <w:sz w:val="17"/>
+        </w:rPr>
+        <w:t xml:space="preserve">    "price": 60000.00,</w:t>
+      </w:r>
+    </w:p>
+    <w:p>
+      <w:pPr>
+        <w:spacing w:before="0" w:after="0"/>
+        <w:ind w:left="216"/>
+        <w:shd w:fill="F4F6F9"/>
+      </w:pPr>
+      <w:r>
+        <w:rPr>
+          <w:rFonts w:ascii="Courier New" w:hAnsi="Courier New"/>
+          <w:sz w:val="17"/>
+        </w:rPr>
+        <w:t xml:space="preserve">    "currency": "INR",</w:t>
+      </w:r>
+    </w:p>
+    <w:p>
+      <w:pPr>
+        <w:spacing w:before="0" w:after="0"/>
+        <w:ind w:left="216"/>
+        <w:shd w:fill="F4F6F9"/>
+      </w:pPr>
+      <w:r>
+        <w:rPr>
+          <w:rFonts w:ascii="Courier New" w:hAnsi="Courier New"/>
+          <w:sz w:val="17"/>
+        </w:rPr>
+        <w:t xml:space="preserve">    "availableQuantity": 5,</w:t>
+      </w:r>
+    </w:p>
+    <w:p>
+      <w:pPr>
+        <w:spacing w:before="0" w:after="0"/>
+        <w:ind w:left="216"/>
+        <w:shd w:fill="F4F6F9"/>
+      </w:pPr>
+      <w:r>
+        <w:rPr>
+          <w:rFonts w:ascii="Courier New" w:hAnsi="Courier New"/>
+          <w:sz w:val="17"/>
+        </w:rPr>
+        <w:t xml:space="preserve">    "tags": ["workstation", "premium"]</w:t>
+      </w:r>
+    </w:p>
+    <w:p>
+      <w:pPr>
+        <w:spacing w:before="0" w:after="0"/>
+        <w:ind w:left="216"/>
+        <w:shd w:fill="F4F6F9"/>
+      </w:pPr>
+      <w:r>
+        <w:rPr>
+          <w:rFonts w:ascii="Courier New" w:hAnsi="Courier New"/>
+          <w:sz w:val="17"/>
+        </w:rPr>
+        <w:t xml:space="preserve">  }'</w:t>
+      </w:r>
+    </w:p>
+    <w:p>
+      <w:pPr>
+        <w:spacing w:after="80"/>
+      </w:pPr>
+    </w:p>
+    <w:p>
+      <w:r>
+        <w:t>Expected result after placing an order:</w:t>
+      </w:r>
+    </w:p>
+    <w:p>
+      <w:pPr>
+        <w:pStyle w:val="ListBullet"/>
+      </w:pPr>
+      <w:r>
+        <w:t>inventory-service reserves stock.</w:t>
+      </w:r>
+    </w:p>
+    <w:p>
+      <w:pPr>
+        <w:pStyle w:val="ListBullet"/>
+      </w:pPr>
+      <w:r>
+        <w:t xml:space="preserve">payment-service creates a payment attempt with status </w:t>
+      </w:r>
+      <w:r>
+        <w:rPr>
+          <w:rFonts w:ascii="Courier New" w:hAnsi="Courier New"/>
+          <w:sz w:val="19"/>
+        </w:rPr>
+        <w:t>FAILED</w:t>
+      </w:r>
+      <w:r>
+        <w:t>.</w:t>
+      </w:r>
+    </w:p>
+    <w:p>
+      <w:pPr>
+        <w:pStyle w:val="ListBullet"/>
+      </w:pPr>
+      <w:r>
+        <w:t xml:space="preserve">payment-service publishes </w:t>
+      </w:r>
+      <w:r>
+        <w:rPr>
+          <w:rFonts w:ascii="Courier New" w:hAnsi="Courier New"/>
+          <w:sz w:val="19"/>
+        </w:rPr>
+        <w:t>PaymentFailedEvent</w:t>
+      </w:r>
+      <w:r>
+        <w:t>.</w:t>
+      </w:r>
+    </w:p>
+    <w:p>
+      <w:pPr>
+        <w:pStyle w:val="ListBullet"/>
+      </w:pPr>
+      <w:r>
+        <w:t xml:space="preserve">order-service updates order status to </w:t>
+      </w:r>
+      <w:r>
+        <w:rPr>
+          <w:rFonts w:ascii="Courier New" w:hAnsi="Courier New"/>
+          <w:sz w:val="19"/>
+        </w:rPr>
+        <w:t>PAYMENT_FAILED</w:t>
+      </w:r>
+      <w:r>
+        <w:t>.</w:t>
+      </w:r>
+    </w:p>
+    <w:p>
+      <w:pPr>
+        <w:pStyle w:val="ListBullet"/>
+      </w:pPr>
+      <w:r>
+        <w:t xml:space="preserve">order response contains </w:t>
+      </w:r>
+      <w:r>
+        <w:rPr>
+          <w:rFonts w:ascii="Courier New" w:hAnsi="Courier New"/>
+          <w:sz w:val="19"/>
+        </w:rPr>
+        <w:t>statusReason</w:t>
+      </w:r>
+      <w:r>
+        <w:t>.</w:t>
+      </w:r>
+    </w:p>
+    <w:p>
+      <w:pPr>
+        <w:pStyle w:val="ListBullet"/>
+      </w:pPr>
+      <w:r>
+        <w:t>cart is still cleared because inventory was successfully reserved before payment failed.</w:t>
+      </w:r>
+    </w:p>
+    <w:p>
+      <w:r>
+        <w:t>Verify:</w:t>
+      </w:r>
+    </w:p>
+    <w:p>
+      <w:pPr>
+        <w:spacing w:before="0" w:after="0"/>
+        <w:ind w:left="216"/>
+        <w:shd w:fill="F4F6F9"/>
+      </w:pPr>
+      <w:r>
+        <w:rPr>
+          <w:rFonts w:ascii="Courier New" w:hAnsi="Courier New"/>
+          <w:sz w:val="17"/>
+        </w:rPr>
+        <w:t>curl http://localhost:8085/api/v1/payments/orders/&lt;order-id&gt;</w:t>
       </w:r>
     </w:p>
     <w:p>
@@ -5732,6 +6821,148 @@
           </w:p>
         </w:tc>
       </w:tr>
+      <w:tr>
+        <w:tc>
+          <w:tcPr>
+            <w:tcW w:type="dxa" w:w="1900"/>
+            <w:tcMar>
+              <w:top w:w="80" w:type="dxa"/>
+              <w:start w:w="120" w:type="dxa"/>
+              <w:bottom w:w="80" w:type="dxa"/>
+              <w:end w:w="120" w:type="dxa"/>
+            </w:tcMar>
+            <w:vAlign w:val="center"/>
+          </w:tcPr>
+          <w:p>
+            <w:pPr>
+              <w:spacing w:after="0"/>
+            </w:pPr>
+            <w:r>
+              <w:rPr>
+                <w:sz w:val="18"/>
+              </w:rPr>
+              <w:t>payment-service</w:t>
+            </w:r>
+          </w:p>
+        </w:tc>
+        <w:tc>
+          <w:tcPr>
+            <w:tcW w:type="dxa" w:w="3100"/>
+            <w:tcMar>
+              <w:top w:w="80" w:type="dxa"/>
+              <w:start w:w="120" w:type="dxa"/>
+              <w:bottom w:w="80" w:type="dxa"/>
+              <w:end w:w="120" w:type="dxa"/>
+            </w:tcMar>
+            <w:vAlign w:val="center"/>
+          </w:tcPr>
+          <w:p>
+            <w:pPr>
+              <w:spacing w:after="0"/>
+            </w:pPr>
+            <w:r>
+              <w:rPr>
+                <w:sz w:val="18"/>
+              </w:rPr>
+              <w:t>Payment processing</w:t>
+            </w:r>
+          </w:p>
+        </w:tc>
+        <w:tc>
+          <w:tcPr>
+            <w:tcW w:type="dxa" w:w="4360"/>
+            <w:tcMar>
+              <w:top w:w="80" w:type="dxa"/>
+              <w:start w:w="120" w:type="dxa"/>
+              <w:bottom w:w="80" w:type="dxa"/>
+              <w:end w:w="120" w:type="dxa"/>
+            </w:tcMar>
+            <w:vAlign w:val="center"/>
+          </w:tcPr>
+          <w:p>
+            <w:pPr>
+              <w:spacing w:after="0"/>
+            </w:pPr>
+            <w:r>
+              <w:rPr>
+                <w:sz w:val="18"/>
+              </w:rPr>
+              <w:t>`Consumed InventoryReserved event`, `Processing payment`, `Payment completed`, `Payment failed`</w:t>
+            </w:r>
+          </w:p>
+        </w:tc>
+      </w:tr>
+      <w:tr>
+        <w:tc>
+          <w:tcPr>
+            <w:tcW w:type="dxa" w:w="1900"/>
+            <w:tcMar>
+              <w:top w:w="80" w:type="dxa"/>
+              <w:start w:w="120" w:type="dxa"/>
+              <w:bottom w:w="80" w:type="dxa"/>
+              <w:end w:w="120" w:type="dxa"/>
+            </w:tcMar>
+            <w:vAlign w:val="center"/>
+          </w:tcPr>
+          <w:p>
+            <w:pPr>
+              <w:spacing w:after="0"/>
+            </w:pPr>
+            <w:r>
+              <w:rPr>
+                <w:sz w:val="18"/>
+              </w:rPr>
+              <w:t>order-service</w:t>
+            </w:r>
+          </w:p>
+        </w:tc>
+        <w:tc>
+          <w:tcPr>
+            <w:tcW w:type="dxa" w:w="3100"/>
+            <w:tcMar>
+              <w:top w:w="80" w:type="dxa"/>
+              <w:start w:w="120" w:type="dxa"/>
+              <w:bottom w:w="80" w:type="dxa"/>
+              <w:end w:w="120" w:type="dxa"/>
+            </w:tcMar>
+            <w:vAlign w:val="center"/>
+          </w:tcPr>
+          <w:p>
+            <w:pPr>
+              <w:spacing w:after="0"/>
+            </w:pPr>
+            <w:r>
+              <w:rPr>
+                <w:sz w:val="18"/>
+              </w:rPr>
+              <w:t>Payment result</w:t>
+            </w:r>
+          </w:p>
+        </w:tc>
+        <w:tc>
+          <w:tcPr>
+            <w:tcW w:type="dxa" w:w="4360"/>
+            <w:tcMar>
+              <w:top w:w="80" w:type="dxa"/>
+              <w:start w:w="120" w:type="dxa"/>
+              <w:bottom w:w="80" w:type="dxa"/>
+              <w:end w:w="120" w:type="dxa"/>
+            </w:tcMar>
+            <w:vAlign w:val="center"/>
+          </w:tcPr>
+          <w:p>
+            <w:pPr>
+              <w:spacing w:after="0"/>
+            </w:pPr>
+            <w:r>
+              <w:rPr>
+                <w:sz w:val="18"/>
+              </w:rPr>
+              <w:t>`Consumed PaymentCompleted event`, `Consumed PaymentFailed event`, `Order status updated after payment`</w:t>
+            </w:r>
+          </w:p>
+        </w:tc>
+      </w:tr>
     </w:tbl>
     <w:p>
       <w:pPr>
@@ -6325,7 +7556,7 @@
               <w:rPr>
                 <w:sz w:val="18"/>
               </w:rPr>
-              <w:t>Order status updated</w:t>
+              <w:t>Inventory order status updated</w:t>
             </w:r>
           </w:p>
         </w:tc>
@@ -6349,6 +7580,150 @@
                 <w:sz w:val="18"/>
               </w:rPr>
               <w:t>Order status becomes `INVENTORY_RESERVED`</w:t>
+            </w:r>
+          </w:p>
+        </w:tc>
+      </w:tr>
+      <w:tr>
+        <w:tc>
+          <w:tcPr>
+            <w:tcW w:type="dxa" w:w="2200"/>
+            <w:tcMar>
+              <w:top w:w="80" w:type="dxa"/>
+              <w:start w:w="120" w:type="dxa"/>
+              <w:bottom w:w="80" w:type="dxa"/>
+              <w:end w:w="120" w:type="dxa"/>
+            </w:tcMar>
+            <w:vAlign w:val="center"/>
+          </w:tcPr>
+          <w:p>
+            <w:pPr>
+              <w:spacing w:after="0"/>
+            </w:pPr>
+            <w:r>
+              <w:rPr>
+                <w:sz w:val="18"/>
+              </w:rPr>
+              <w:t>Payment attempt created</w:t>
+            </w:r>
+          </w:p>
+        </w:tc>
+        <w:tc>
+          <w:tcPr>
+            <w:tcW w:type="dxa" w:w="7160"/>
+            <w:tcMar>
+              <w:top w:w="80" w:type="dxa"/>
+              <w:start w:w="120" w:type="dxa"/>
+              <w:bottom w:w="80" w:type="dxa"/>
+              <w:end w:w="120" w:type="dxa"/>
+            </w:tcMar>
+            <w:vAlign w:val="center"/>
+          </w:tcPr>
+          <w:p>
+            <w:pPr>
+              <w:spacing w:after="0"/>
+            </w:pPr>
+            <w:r>
+              <w:rPr>
+                <w:sz w:val="18"/>
+              </w:rPr>
+              <w:t>Payment exists in `eventcart_payment.payment_attempts`</w:t>
+            </w:r>
+          </w:p>
+        </w:tc>
+      </w:tr>
+      <w:tr>
+        <w:tc>
+          <w:tcPr>
+            <w:tcW w:type="dxa" w:w="2200"/>
+            <w:tcMar>
+              <w:top w:w="80" w:type="dxa"/>
+              <w:start w:w="120" w:type="dxa"/>
+              <w:bottom w:w="80" w:type="dxa"/>
+              <w:end w:w="120" w:type="dxa"/>
+            </w:tcMar>
+            <w:vAlign w:val="center"/>
+          </w:tcPr>
+          <w:p>
+            <w:pPr>
+              <w:spacing w:after="0"/>
+            </w:pPr>
+            <w:r>
+              <w:rPr>
+                <w:sz w:val="18"/>
+              </w:rPr>
+              <w:t>Payment event published</w:t>
+            </w:r>
+          </w:p>
+        </w:tc>
+        <w:tc>
+          <w:tcPr>
+            <w:tcW w:type="dxa" w:w="7160"/>
+            <w:tcMar>
+              <w:top w:w="80" w:type="dxa"/>
+              <w:start w:w="120" w:type="dxa"/>
+              <w:bottom w:w="80" w:type="dxa"/>
+              <w:end w:w="120" w:type="dxa"/>
+            </w:tcMar>
+            <w:vAlign w:val="center"/>
+          </w:tcPr>
+          <w:p>
+            <w:pPr>
+              <w:spacing w:after="0"/>
+            </w:pPr>
+            <w:r>
+              <w:rPr>
+                <w:sz w:val="18"/>
+              </w:rPr>
+              <w:t>Message appears on `eventcart.payments.completed` or `eventcart.payments.failed`</w:t>
+            </w:r>
+          </w:p>
+        </w:tc>
+      </w:tr>
+      <w:tr>
+        <w:tc>
+          <w:tcPr>
+            <w:tcW w:type="dxa" w:w="2200"/>
+            <w:tcMar>
+              <w:top w:w="80" w:type="dxa"/>
+              <w:start w:w="120" w:type="dxa"/>
+              <w:bottom w:w="80" w:type="dxa"/>
+              <w:end w:w="120" w:type="dxa"/>
+            </w:tcMar>
+            <w:vAlign w:val="center"/>
+          </w:tcPr>
+          <w:p>
+            <w:pPr>
+              <w:spacing w:after="0"/>
+            </w:pPr>
+            <w:r>
+              <w:rPr>
+                <w:sz w:val="18"/>
+              </w:rPr>
+              <w:t>Final order status updated</w:t>
+            </w:r>
+          </w:p>
+        </w:tc>
+        <w:tc>
+          <w:tcPr>
+            <w:tcW w:type="dxa" w:w="7160"/>
+            <w:tcMar>
+              <w:top w:w="80" w:type="dxa"/>
+              <w:start w:w="120" w:type="dxa"/>
+              <w:bottom w:w="80" w:type="dxa"/>
+              <w:end w:w="120" w:type="dxa"/>
+            </w:tcMar>
+            <w:vAlign w:val="center"/>
+          </w:tcPr>
+          <w:p>
+            <w:pPr>
+              <w:spacing w:after="0"/>
+            </w:pPr>
+            <w:r>
+              <w:rPr>
+                <w:sz w:val="18"/>
+              </w:rPr>
+              <w:t>Order status becomes `PAYMENT_COMPLETED` or `PAYMENT_FAILED`</w:t>
             </w:r>
           </w:p>
         </w:tc>
@@ -6810,6 +8185,219 @@
               <w:rPr>
                 <w:sz w:val="18"/>
               </w:rPr>
+              <w:t>Payment attempt not found</w:t>
+            </w:r>
+          </w:p>
+        </w:tc>
+        <w:tc>
+          <w:tcPr>
+            <w:tcW w:type="dxa" w:w="3100"/>
+            <w:tcMar>
+              <w:top w:w="80" w:type="dxa"/>
+              <w:start w:w="120" w:type="dxa"/>
+              <w:bottom w:w="80" w:type="dxa"/>
+              <w:end w:w="120" w:type="dxa"/>
+            </w:tcMar>
+            <w:vAlign w:val="center"/>
+          </w:tcPr>
+          <w:p>
+            <w:pPr>
+              <w:spacing w:after="0"/>
+            </w:pPr>
+            <w:r>
+              <w:rPr>
+                <w:sz w:val="18"/>
+              </w:rPr>
+              <w:t>payment-service is not running or did not consume `InventoryReservedEvent`</w:t>
+            </w:r>
+          </w:p>
+        </w:tc>
+        <w:tc>
+          <w:tcPr>
+            <w:tcW w:type="dxa" w:w="4360"/>
+            <w:tcMar>
+              <w:top w:w="80" w:type="dxa"/>
+              <w:start w:w="120" w:type="dxa"/>
+              <w:bottom w:w="80" w:type="dxa"/>
+              <w:end w:w="120" w:type="dxa"/>
+            </w:tcMar>
+            <w:vAlign w:val="center"/>
+          </w:tcPr>
+          <w:p>
+            <w:pPr>
+              <w:spacing w:after="0"/>
+            </w:pPr>
+            <w:r>
+              <w:rPr>
+                <w:sz w:val="18"/>
+              </w:rPr>
+              <w:t>Check payment-service health and Kafka topic `eventcart.inventory.reserved`</w:t>
+            </w:r>
+          </w:p>
+        </w:tc>
+      </w:tr>
+      <w:tr>
+        <w:tc>
+          <w:tcPr>
+            <w:tcW w:type="dxa" w:w="1900"/>
+            <w:tcMar>
+              <w:top w:w="80" w:type="dxa"/>
+              <w:start w:w="120" w:type="dxa"/>
+              <w:bottom w:w="80" w:type="dxa"/>
+              <w:end w:w="120" w:type="dxa"/>
+            </w:tcMar>
+            <w:vAlign w:val="center"/>
+          </w:tcPr>
+          <w:p>
+            <w:pPr>
+              <w:spacing w:after="0"/>
+            </w:pPr>
+            <w:r>
+              <w:rPr>
+                <w:sz w:val="18"/>
+              </w:rPr>
+              <w:t>Order stays `INVENTORY_RESERVED`</w:t>
+            </w:r>
+          </w:p>
+        </w:tc>
+        <w:tc>
+          <w:tcPr>
+            <w:tcW w:type="dxa" w:w="3100"/>
+            <w:tcMar>
+              <w:top w:w="80" w:type="dxa"/>
+              <w:start w:w="120" w:type="dxa"/>
+              <w:bottom w:w="80" w:type="dxa"/>
+              <w:end w:w="120" w:type="dxa"/>
+            </w:tcMar>
+            <w:vAlign w:val="center"/>
+          </w:tcPr>
+          <w:p>
+            <w:pPr>
+              <w:spacing w:after="0"/>
+            </w:pPr>
+            <w:r>
+              <w:rPr>
+                <w:sz w:val="18"/>
+              </w:rPr>
+              <w:t>payment-service or order-service payment consumer has not processed payment result</w:t>
+            </w:r>
+          </w:p>
+        </w:tc>
+        <w:tc>
+          <w:tcPr>
+            <w:tcW w:type="dxa" w:w="4360"/>
+            <w:tcMar>
+              <w:top w:w="80" w:type="dxa"/>
+              <w:start w:w="120" w:type="dxa"/>
+              <w:bottom w:w="80" w:type="dxa"/>
+              <w:end w:w="120" w:type="dxa"/>
+            </w:tcMar>
+            <w:vAlign w:val="center"/>
+          </w:tcPr>
+          <w:p>
+            <w:pPr>
+              <w:spacing w:after="0"/>
+            </w:pPr>
+            <w:r>
+              <w:rPr>
+                <w:sz w:val="18"/>
+              </w:rPr>
+              <w:t>Check payment-service logs and payment topics</w:t>
+            </w:r>
+          </w:p>
+        </w:tc>
+      </w:tr>
+      <w:tr>
+        <w:tc>
+          <w:tcPr>
+            <w:tcW w:type="dxa" w:w="1900"/>
+            <w:tcMar>
+              <w:top w:w="80" w:type="dxa"/>
+              <w:start w:w="120" w:type="dxa"/>
+              <w:bottom w:w="80" w:type="dxa"/>
+              <w:end w:w="120" w:type="dxa"/>
+            </w:tcMar>
+            <w:vAlign w:val="center"/>
+          </w:tcPr>
+          <w:p>
+            <w:pPr>
+              <w:spacing w:after="0"/>
+            </w:pPr>
+            <w:r>
+              <w:rPr>
+                <w:sz w:val="18"/>
+              </w:rPr>
+              <w:t>Order becomes `PAYMENT_FAILED`</w:t>
+            </w:r>
+          </w:p>
+        </w:tc>
+        <w:tc>
+          <w:tcPr>
+            <w:tcW w:type="dxa" w:w="3100"/>
+            <w:tcMar>
+              <w:top w:w="80" w:type="dxa"/>
+              <w:start w:w="120" w:type="dxa"/>
+              <w:bottom w:w="80" w:type="dxa"/>
+              <w:end w:w="120" w:type="dxa"/>
+            </w:tcMar>
+            <w:vAlign w:val="center"/>
+          </w:tcPr>
+          <w:p>
+            <w:pPr>
+              <w:spacing w:after="0"/>
+            </w:pPr>
+            <w:r>
+              <w:rPr>
+                <w:sz w:val="18"/>
+              </w:rPr>
+              <w:t>Mock payment amount is at or above `50000.00`</w:t>
+            </w:r>
+          </w:p>
+        </w:tc>
+        <w:tc>
+          <w:tcPr>
+            <w:tcW w:type="dxa" w:w="4360"/>
+            <w:tcMar>
+              <w:top w:w="80" w:type="dxa"/>
+              <w:start w:w="120" w:type="dxa"/>
+              <w:bottom w:w="80" w:type="dxa"/>
+              <w:end w:w="120" w:type="dxa"/>
+            </w:tcMar>
+            <w:vAlign w:val="center"/>
+          </w:tcPr>
+          <w:p>
+            <w:pPr>
+              <w:spacing w:after="0"/>
+            </w:pPr>
+            <w:r>
+              <w:rPr>
+                <w:sz w:val="18"/>
+              </w:rPr>
+              <w:t>Check payment attempt failure reason</w:t>
+            </w:r>
+          </w:p>
+        </w:tc>
+      </w:tr>
+      <w:tr>
+        <w:tc>
+          <w:tcPr>
+            <w:tcW w:type="dxa" w:w="1900"/>
+            <w:tcMar>
+              <w:top w:w="80" w:type="dxa"/>
+              <w:start w:w="120" w:type="dxa"/>
+              <w:bottom w:w="80" w:type="dxa"/>
+              <w:end w:w="120" w:type="dxa"/>
+            </w:tcMar>
+            <w:vAlign w:val="center"/>
+          </w:tcPr>
+          <w:p>
+            <w:pPr>
+              <w:spacing w:after="0"/>
+            </w:pPr>
+            <w:r>
+              <w:rPr>
+                <w:sz w:val="18"/>
+              </w:rPr>
               <w:t>Cart not cleared after success</w:t>
             </w:r>
           </w:p>
@@ -7139,6 +8727,42 @@
       </w:pPr>
       <w:r>
         <w:t>Why cart cleanup happens after inventory is reserved, not immediately after order creation.</w:t>
+      </w:r>
+    </w:p>
+    <w:p>
+      <w:pPr>
+        <w:pStyle w:val="ListBullet"/>
+      </w:pPr>
+      <w:r>
+        <w:t xml:space="preserve">Why payment-service consumes </w:t>
+      </w:r>
+      <w:r>
+        <w:rPr>
+          <w:rFonts w:ascii="Courier New" w:hAnsi="Courier New"/>
+          <w:sz w:val="19"/>
+        </w:rPr>
+        <w:t>InventoryReservedEvent</w:t>
+      </w:r>
+      <w:r>
+        <w:t xml:space="preserve"> instead of </w:t>
+      </w:r>
+      <w:r>
+        <w:rPr>
+          <w:rFonts w:ascii="Courier New" w:hAnsi="Courier New"/>
+          <w:sz w:val="19"/>
+        </w:rPr>
+        <w:t>OrderCreatedEvent</w:t>
+      </w:r>
+      <w:r>
+        <w:t>.</w:t>
+      </w:r>
+    </w:p>
+    <w:p>
+      <w:pPr>
+        <w:pStyle w:val="ListBullet"/>
+      </w:pPr>
+      <w:r>
+        <w:t>How payment-service handles duplicate Kafka messages.</w:t>
       </w:r>
     </w:p>
     <w:p>

</xml_diff>

<commit_message>
Implemented payment-failure compensation in inventory-service.
</commit_message>
<xml_diff>
--- a/docs/EventCart-QA-Application-Flow.docx
+++ b/docs/EventCart-QA-Application-Flow.docx
@@ -1944,6 +1944,34 @@
           <w:rFonts w:ascii="Courier New" w:hAnsi="Courier New"/>
           <w:sz w:val="17"/>
         </w:rPr>
+        <w:t xml:space="preserve">    U --&gt; X["inventory-service releases reserved stock"]</w:t>
+      </w:r>
+    </w:p>
+    <w:p>
+      <w:pPr>
+        <w:spacing w:before="0" w:after="0"/>
+        <w:ind w:left="216"/>
+        <w:shd w:fill="F4F6F9"/>
+      </w:pPr>
+      <w:r>
+        <w:rPr>
+          <w:rFonts w:ascii="Courier New" w:hAnsi="Courier New"/>
+          <w:sz w:val="17"/>
+        </w:rPr>
+        <w:t xml:space="preserve">    X --&gt; Y["inventory reservation becomes RELEASED"]</w:t>
+      </w:r>
+    </w:p>
+    <w:p>
+      <w:pPr>
+        <w:spacing w:before="0" w:after="0"/>
+        <w:ind w:left="216"/>
+        <w:shd w:fill="F4F6F9"/>
+      </w:pPr>
+      <w:r>
+        <w:rPr>
+          <w:rFonts w:ascii="Courier New" w:hAnsi="Courier New"/>
+          <w:sz w:val="17"/>
+        </w:rPr>
         <w:t xml:space="preserve">    N --&gt; Q["order-service updates order to INVENTORY_FAILED"]</w:t>
       </w:r>
     </w:p>
@@ -5686,6 +5714,50 @@
         <w:pStyle w:val="ListBullet"/>
       </w:pPr>
       <w:r>
+        <w:t xml:space="preserve">inventory-service consumes </w:t>
+      </w:r>
+      <w:r>
+        <w:rPr>
+          <w:rFonts w:ascii="Courier New" w:hAnsi="Courier New"/>
+          <w:sz w:val="19"/>
+        </w:rPr>
+        <w:t>PaymentFailedEvent</w:t>
+      </w:r>
+      <w:r>
+        <w:t>.</w:t>
+      </w:r>
+    </w:p>
+    <w:p>
+      <w:pPr>
+        <w:pStyle w:val="ListBullet"/>
+      </w:pPr>
+      <w:r>
+        <w:t>inventory-service releases the reserved stock.</w:t>
+      </w:r>
+    </w:p>
+    <w:p>
+      <w:pPr>
+        <w:pStyle w:val="ListBullet"/>
+      </w:pPr>
+      <w:r>
+        <w:t xml:space="preserve">inventory reservation status becomes </w:t>
+      </w:r>
+      <w:r>
+        <w:rPr>
+          <w:rFonts w:ascii="Courier New" w:hAnsi="Courier New"/>
+          <w:sz w:val="19"/>
+        </w:rPr>
+        <w:t>RELEASED</w:t>
+      </w:r>
+      <w:r>
+        <w:t>.</w:t>
+      </w:r>
+    </w:p>
+    <w:p>
+      <w:pPr>
+        <w:pStyle w:val="ListBullet"/>
+      </w:pPr>
+      <w:r>
         <w:t xml:space="preserve">order response contains </w:t>
       </w:r>
       <w:r>
@@ -5756,8 +5828,131 @@
     </w:p>
     <w:p>
       <w:pPr>
+        <w:spacing w:before="0" w:after="0"/>
+        <w:ind w:left="216"/>
+        <w:shd w:fill="F4F6F9"/>
+      </w:pPr>
+      <w:r>
+        <w:rPr>
+          <w:rFonts w:ascii="Courier New" w:hAnsi="Courier New"/>
+          <w:sz w:val="17"/>
+        </w:rPr>
+        <w:t>curl http://localhost:8084/api/v1/inventory/reservations/&lt;order-id&gt;</w:t>
+      </w:r>
+    </w:p>
+    <w:p>
+      <w:pPr>
+        <w:spacing w:before="0" w:after="0"/>
+        <w:ind w:left="216"/>
+        <w:shd w:fill="F4F6F9"/>
+      </w:pPr>
+      <w:r>
+        <w:rPr>
+          <w:rFonts w:ascii="Courier New" w:hAnsi="Courier New"/>
+          <w:sz w:val="17"/>
+        </w:rPr>
+        <w:t>curl http://localhost:8084/api/v1/inventory/&lt;product-id&gt;</w:t>
+      </w:r>
+    </w:p>
+    <w:p>
+      <w:pPr>
         <w:spacing w:after="80"/>
       </w:pPr>
+    </w:p>
+    <w:p>
+      <w:r>
+        <w:t>Expected compensation result:</w:t>
+      </w:r>
+    </w:p>
+    <w:p>
+      <w:pPr>
+        <w:pStyle w:val="ListBullet"/>
+      </w:pPr>
+      <w:r>
+        <w:t xml:space="preserve">Payment attempt status is </w:t>
+      </w:r>
+      <w:r>
+        <w:rPr>
+          <w:rFonts w:ascii="Courier New" w:hAnsi="Courier New"/>
+          <w:sz w:val="19"/>
+        </w:rPr>
+        <w:t>FAILED</w:t>
+      </w:r>
+      <w:r>
+        <w:t>.</w:t>
+      </w:r>
+    </w:p>
+    <w:p>
+      <w:pPr>
+        <w:pStyle w:val="ListBullet"/>
+      </w:pPr>
+      <w:r>
+        <w:t xml:space="preserve">Order status is </w:t>
+      </w:r>
+      <w:r>
+        <w:rPr>
+          <w:rFonts w:ascii="Courier New" w:hAnsi="Courier New"/>
+          <w:sz w:val="19"/>
+        </w:rPr>
+        <w:t>PAYMENT_FAILED</w:t>
+      </w:r>
+      <w:r>
+        <w:t>.</w:t>
+      </w:r>
+    </w:p>
+    <w:p>
+      <w:pPr>
+        <w:pStyle w:val="ListBullet"/>
+      </w:pPr>
+      <w:r>
+        <w:t xml:space="preserve">Reservation status is </w:t>
+      </w:r>
+      <w:r>
+        <w:rPr>
+          <w:rFonts w:ascii="Courier New" w:hAnsi="Courier New"/>
+          <w:sz w:val="19"/>
+        </w:rPr>
+        <w:t>RELEASED</w:t>
+      </w:r>
+      <w:r>
+        <w:t>.</w:t>
+      </w:r>
+    </w:p>
+    <w:p>
+      <w:pPr>
+        <w:pStyle w:val="ListBullet"/>
+      </w:pPr>
+      <w:r>
+        <w:t xml:space="preserve">Inventory </w:t>
+      </w:r>
+      <w:r>
+        <w:rPr>
+          <w:rFonts w:ascii="Courier New" w:hAnsi="Courier New"/>
+          <w:sz w:val="19"/>
+        </w:rPr>
+        <w:t>reservedQuantity</w:t>
+      </w:r>
+      <w:r>
+        <w:t xml:space="preserve"> decreases by the order quantity.</w:t>
+      </w:r>
+    </w:p>
+    <w:p>
+      <w:pPr>
+        <w:pStyle w:val="ListBullet"/>
+      </w:pPr>
+      <w:r>
+        <w:t xml:space="preserve">Inventory </w:t>
+      </w:r>
+      <w:r>
+        <w:rPr>
+          <w:rFonts w:ascii="Courier New" w:hAnsi="Courier New"/>
+          <w:sz w:val="19"/>
+        </w:rPr>
+        <w:t>availableQuantity</w:t>
+      </w:r>
+      <w:r>
+        <w:t xml:space="preserve"> increases by the order quantity.</w:t>
+      </w:r>
     </w:p>
     <w:p>
       <w:pPr>
@@ -6963,6 +7158,77 @@
           </w:p>
         </w:tc>
       </w:tr>
+      <w:tr>
+        <w:tc>
+          <w:tcPr>
+            <w:tcW w:type="dxa" w:w="1900"/>
+            <w:tcMar>
+              <w:top w:w="80" w:type="dxa"/>
+              <w:start w:w="120" w:type="dxa"/>
+              <w:bottom w:w="80" w:type="dxa"/>
+              <w:end w:w="120" w:type="dxa"/>
+            </w:tcMar>
+            <w:vAlign w:val="center"/>
+          </w:tcPr>
+          <w:p>
+            <w:pPr>
+              <w:spacing w:after="0"/>
+            </w:pPr>
+            <w:r>
+              <w:rPr>
+                <w:sz w:val="18"/>
+              </w:rPr>
+              <w:t>inventory-service</w:t>
+            </w:r>
+          </w:p>
+        </w:tc>
+        <w:tc>
+          <w:tcPr>
+            <w:tcW w:type="dxa" w:w="3100"/>
+            <w:tcMar>
+              <w:top w:w="80" w:type="dxa"/>
+              <w:start w:w="120" w:type="dxa"/>
+              <w:bottom w:w="80" w:type="dxa"/>
+              <w:end w:w="120" w:type="dxa"/>
+            </w:tcMar>
+            <w:vAlign w:val="center"/>
+          </w:tcPr>
+          <w:p>
+            <w:pPr>
+              <w:spacing w:after="0"/>
+            </w:pPr>
+            <w:r>
+              <w:rPr>
+                <w:sz w:val="18"/>
+              </w:rPr>
+              <w:t>Payment compensation</w:t>
+            </w:r>
+          </w:p>
+        </w:tc>
+        <w:tc>
+          <w:tcPr>
+            <w:tcW w:type="dxa" w:w="4360"/>
+            <w:tcMar>
+              <w:top w:w="80" w:type="dxa"/>
+              <w:start w:w="120" w:type="dxa"/>
+              <w:bottom w:w="80" w:type="dxa"/>
+              <w:end w:w="120" w:type="dxa"/>
+            </w:tcMar>
+            <w:vAlign w:val="center"/>
+          </w:tcPr>
+          <w:p>
+            <w:pPr>
+              <w:spacing w:after="0"/>
+            </w:pPr>
+            <w:r>
+              <w:rPr>
+                <w:sz w:val="18"/>
+              </w:rPr>
+              <w:t>`Consumed PaymentFailed event`, `Releasing inventory after payment failure`, `Inventory released after payment failure`</w:t>
+            </w:r>
+          </w:p>
+        </w:tc>
+      </w:tr>
     </w:tbl>
     <w:p>
       <w:pPr>
@@ -7776,6 +8042,54 @@
           </w:p>
         </w:tc>
       </w:tr>
+      <w:tr>
+        <w:tc>
+          <w:tcPr>
+            <w:tcW w:type="dxa" w:w="2200"/>
+            <w:tcMar>
+              <w:top w:w="80" w:type="dxa"/>
+              <w:start w:w="120" w:type="dxa"/>
+              <w:bottom w:w="80" w:type="dxa"/>
+              <w:end w:w="120" w:type="dxa"/>
+            </w:tcMar>
+            <w:vAlign w:val="center"/>
+          </w:tcPr>
+          <w:p>
+            <w:pPr>
+              <w:spacing w:after="0"/>
+            </w:pPr>
+            <w:r>
+              <w:rPr>
+                <w:sz w:val="18"/>
+              </w:rPr>
+              <w:t>Failed payment compensation</w:t>
+            </w:r>
+          </w:p>
+        </w:tc>
+        <w:tc>
+          <w:tcPr>
+            <w:tcW w:type="dxa" w:w="7160"/>
+            <w:tcMar>
+              <w:top w:w="80" w:type="dxa"/>
+              <w:start w:w="120" w:type="dxa"/>
+              <w:bottom w:w="80" w:type="dxa"/>
+              <w:end w:w="120" w:type="dxa"/>
+            </w:tcMar>
+            <w:vAlign w:val="center"/>
+          </w:tcPr>
+          <w:p>
+            <w:pPr>
+              <w:spacing w:after="0"/>
+            </w:pPr>
+            <w:r>
+              <w:rPr>
+                <w:sz w:val="18"/>
+              </w:rPr>
+              <w:t>Reservation becomes `RELEASED` and stock is returned</w:t>
+            </w:r>
+          </w:p>
+        </w:tc>
+      </w:tr>
     </w:tbl>
     <w:p>
       <w:pPr>
@@ -8398,6 +8712,77 @@
               <w:rPr>
                 <w:sz w:val="18"/>
               </w:rPr>
+              <w:t>Reservation stays `RESERVED` after payment failure</w:t>
+            </w:r>
+          </w:p>
+        </w:tc>
+        <w:tc>
+          <w:tcPr>
+            <w:tcW w:type="dxa" w:w="3100"/>
+            <w:tcMar>
+              <w:top w:w="80" w:type="dxa"/>
+              <w:start w:w="120" w:type="dxa"/>
+              <w:bottom w:w="80" w:type="dxa"/>
+              <w:end w:w="120" w:type="dxa"/>
+            </w:tcMar>
+            <w:vAlign w:val="center"/>
+          </w:tcPr>
+          <w:p>
+            <w:pPr>
+              <w:spacing w:after="0"/>
+            </w:pPr>
+            <w:r>
+              <w:rPr>
+                <w:sz w:val="18"/>
+              </w:rPr>
+              <w:t>inventory-service did not consume `PaymentFailedEvent`</w:t>
+            </w:r>
+          </w:p>
+        </w:tc>
+        <w:tc>
+          <w:tcPr>
+            <w:tcW w:type="dxa" w:w="4360"/>
+            <w:tcMar>
+              <w:top w:w="80" w:type="dxa"/>
+              <w:start w:w="120" w:type="dxa"/>
+              <w:bottom w:w="80" w:type="dxa"/>
+              <w:end w:w="120" w:type="dxa"/>
+            </w:tcMar>
+            <w:vAlign w:val="center"/>
+          </w:tcPr>
+          <w:p>
+            <w:pPr>
+              <w:spacing w:after="0"/>
+            </w:pPr>
+            <w:r>
+              <w:rPr>
+                <w:sz w:val="18"/>
+              </w:rPr>
+              <w:t>Check inventory-service logs and Kafka topic `eventcart.payments.failed`</w:t>
+            </w:r>
+          </w:p>
+        </w:tc>
+      </w:tr>
+      <w:tr>
+        <w:tc>
+          <w:tcPr>
+            <w:tcW w:type="dxa" w:w="1900"/>
+            <w:tcMar>
+              <w:top w:w="80" w:type="dxa"/>
+              <w:start w:w="120" w:type="dxa"/>
+              <w:bottom w:w="80" w:type="dxa"/>
+              <w:end w:w="120" w:type="dxa"/>
+            </w:tcMar>
+            <w:vAlign w:val="center"/>
+          </w:tcPr>
+          <w:p>
+            <w:pPr>
+              <w:spacing w:after="0"/>
+            </w:pPr>
+            <w:r>
+              <w:rPr>
+                <w:sz w:val="18"/>
+              </w:rPr>
               <w:t>Cart not cleared after success</w:t>
             </w:r>
           </w:p>
@@ -8763,6 +9148,14 @@
       </w:pPr>
       <w:r>
         <w:t>How payment-service handles duplicate Kafka messages.</w:t>
+      </w:r>
+    </w:p>
+    <w:p>
+      <w:pPr>
+        <w:pStyle w:val="ListBullet"/>
+      </w:pPr>
+      <w:r>
+        <w:t>Why inventory-service performs a compensating release after payment failure.</w:t>
       </w:r>
     </w:p>
     <w:p>

</xml_diff>

<commit_message>
added shared common-security, shared common-kafka, Keycloak realm setup, Kafka retry/DLQ handling, order-service transactional outbox, Testcontainers integration test setup, and observability support with correlation IDs, tracing config, and Prometheus metrics.
</commit_message>
<xml_diff>
--- a/docs/EventCart-QA-Application-Flow.docx
+++ b/docs/EventCart-QA-Application-Flow.docx
@@ -135,7 +135,7 @@
               <w:rPr>
                 <w:sz w:val="19"/>
               </w:rPr>
-              <w:t>Catalog, cart, order, inventory, Redis idempotency, Kafka order status flow</w:t>
+              <w:t>Gateway, JWT security, catalog, cart, order, outbox, inventory, payment, notification, DLQ, observability</w:t>
             </w:r>
           </w:p>
         </w:tc>
@@ -255,7 +255,7 @@
         <w:pStyle w:val="ListBullet"/>
       </w:pPr>
       <w:r>
-        <w:t>Debug common local issues such as empty carts, missing stock, duplicate order retries, and Kafka processing delays.</w:t>
+        <w:t>Debug common local issues such as empty carts, missing stock, duplicate order retries, authorization failures, DLQ messages, and Kafka processing delays.</w:t>
       </w:r>
     </w:p>
     <w:p>
@@ -276,7 +276,7 @@
     </w:p>
     <w:p>
       <w:r>
-        <w:t>The current working slice covers product catalog, cart, order placement, inventory reservation, payment simulation, Redis idempotency, and Kafka-based order status updates.</w:t>
+        <w:t>The current working slice covers API Gateway routing, Keycloak JWT security, product catalog, cart, order placement, outbox publishing, inventory reservation, payment simulation, notification history, Redis idempotency, Kafka retry/DLQ handling, and Kafka-based order status updates.</w:t>
       </w:r>
     </w:p>
     <w:tbl>
@@ -580,6 +580,246 @@
                 <w:sz w:val="18"/>
               </w:rPr>
               <w:t>Consume inventory success events, simulate payment, publish payment result events</w:t>
+            </w:r>
+          </w:p>
+        </w:tc>
+      </w:tr>
+      <w:tr>
+        <w:tc>
+          <w:tcPr>
+            <w:tcW w:type="dxa" w:w="2200"/>
+            <w:tcMar>
+              <w:top w:w="80" w:type="dxa"/>
+              <w:start w:w="120" w:type="dxa"/>
+              <w:bottom w:w="80" w:type="dxa"/>
+              <w:end w:w="120" w:type="dxa"/>
+            </w:tcMar>
+            <w:vAlign w:val="center"/>
+          </w:tcPr>
+          <w:p>
+            <w:pPr>
+              <w:spacing w:after="0"/>
+            </w:pPr>
+            <w:r>
+              <w:rPr>
+                <w:sz w:val="18"/>
+              </w:rPr>
+              <w:t>Notifications</w:t>
+            </w:r>
+          </w:p>
+        </w:tc>
+        <w:tc>
+          <w:tcPr>
+            <w:tcW w:type="dxa" w:w="7160"/>
+            <w:tcMar>
+              <w:top w:w="80" w:type="dxa"/>
+              <w:start w:w="120" w:type="dxa"/>
+              <w:bottom w:w="80" w:type="dxa"/>
+              <w:end w:w="120" w:type="dxa"/>
+            </w:tcMar>
+            <w:vAlign w:val="center"/>
+          </w:tcPr>
+          <w:p>
+            <w:pPr>
+              <w:spacing w:after="0"/>
+            </w:pPr>
+            <w:r>
+              <w:rPr>
+                <w:sz w:val="18"/>
+              </w:rPr>
+              <w:t>Consume order/payment events and store customer notification history</w:t>
+            </w:r>
+          </w:p>
+        </w:tc>
+      </w:tr>
+      <w:tr>
+        <w:tc>
+          <w:tcPr>
+            <w:tcW w:type="dxa" w:w="2200"/>
+            <w:tcMar>
+              <w:top w:w="80" w:type="dxa"/>
+              <w:start w:w="120" w:type="dxa"/>
+              <w:bottom w:w="80" w:type="dxa"/>
+              <w:end w:w="120" w:type="dxa"/>
+            </w:tcMar>
+            <w:vAlign w:val="center"/>
+          </w:tcPr>
+          <w:p>
+            <w:pPr>
+              <w:spacing w:after="0"/>
+            </w:pPr>
+            <w:r>
+              <w:rPr>
+                <w:sz w:val="18"/>
+              </w:rPr>
+              <w:t>API Gateway</w:t>
+            </w:r>
+          </w:p>
+        </w:tc>
+        <w:tc>
+          <w:tcPr>
+            <w:tcW w:type="dxa" w:w="7160"/>
+            <w:tcMar>
+              <w:top w:w="80" w:type="dxa"/>
+              <w:start w:w="120" w:type="dxa"/>
+              <w:bottom w:w="80" w:type="dxa"/>
+              <w:end w:w="120" w:type="dxa"/>
+            </w:tcMar>
+            <w:vAlign w:val="center"/>
+          </w:tcPr>
+          <w:p>
+            <w:pPr>
+              <w:spacing w:after="0"/>
+            </w:pPr>
+            <w:r>
+              <w:rPr>
+                <w:sz w:val="18"/>
+              </w:rPr>
+              <w:t>Route client APIs and enforce JWT role checks</w:t>
+            </w:r>
+          </w:p>
+        </w:tc>
+      </w:tr>
+      <w:tr>
+        <w:tc>
+          <w:tcPr>
+            <w:tcW w:type="dxa" w:w="2200"/>
+            <w:tcMar>
+              <w:top w:w="80" w:type="dxa"/>
+              <w:start w:w="120" w:type="dxa"/>
+              <w:bottom w:w="80" w:type="dxa"/>
+              <w:end w:w="120" w:type="dxa"/>
+            </w:tcMar>
+            <w:vAlign w:val="center"/>
+          </w:tcPr>
+          <w:p>
+            <w:pPr>
+              <w:spacing w:after="0"/>
+            </w:pPr>
+            <w:r>
+              <w:rPr>
+                <w:sz w:val="18"/>
+              </w:rPr>
+              <w:t>Security</w:t>
+            </w:r>
+          </w:p>
+        </w:tc>
+        <w:tc>
+          <w:tcPr>
+            <w:tcW w:type="dxa" w:w="7160"/>
+            <w:tcMar>
+              <w:top w:w="80" w:type="dxa"/>
+              <w:start w:w="120" w:type="dxa"/>
+              <w:bottom w:w="80" w:type="dxa"/>
+              <w:end w:w="120" w:type="dxa"/>
+            </w:tcMar>
+            <w:vAlign w:val="center"/>
+          </w:tcPr>
+          <w:p>
+            <w:pPr>
+              <w:spacing w:after="0"/>
+            </w:pPr>
+            <w:r>
+              <w:rPr>
+                <w:sz w:val="18"/>
+              </w:rPr>
+              <w:t>Keycloak realm with `ADMIN`, `CUSTOMER`, and `SUPPORT` roles</w:t>
+            </w:r>
+          </w:p>
+        </w:tc>
+      </w:tr>
+      <w:tr>
+        <w:tc>
+          <w:tcPr>
+            <w:tcW w:type="dxa" w:w="2200"/>
+            <w:tcMar>
+              <w:top w:w="80" w:type="dxa"/>
+              <w:start w:w="120" w:type="dxa"/>
+              <w:bottom w:w="80" w:type="dxa"/>
+              <w:end w:w="120" w:type="dxa"/>
+            </w:tcMar>
+            <w:vAlign w:val="center"/>
+          </w:tcPr>
+          <w:p>
+            <w:pPr>
+              <w:spacing w:after="0"/>
+            </w:pPr>
+            <w:r>
+              <w:rPr>
+                <w:sz w:val="18"/>
+              </w:rPr>
+              <w:t>Outbox</w:t>
+            </w:r>
+          </w:p>
+        </w:tc>
+        <w:tc>
+          <w:tcPr>
+            <w:tcW w:type="dxa" w:w="7160"/>
+            <w:tcMar>
+              <w:top w:w="80" w:type="dxa"/>
+              <w:start w:w="120" w:type="dxa"/>
+              <w:bottom w:w="80" w:type="dxa"/>
+              <w:end w:w="120" w:type="dxa"/>
+            </w:tcMar>
+            <w:vAlign w:val="center"/>
+          </w:tcPr>
+          <w:p>
+            <w:pPr>
+              <w:spacing w:after="0"/>
+            </w:pPr>
+            <w:r>
+              <w:rPr>
+                <w:sz w:val="18"/>
+              </w:rPr>
+              <w:t>Store order-created events before Kafka publication</w:t>
+            </w:r>
+          </w:p>
+        </w:tc>
+      </w:tr>
+      <w:tr>
+        <w:tc>
+          <w:tcPr>
+            <w:tcW w:type="dxa" w:w="2200"/>
+            <w:tcMar>
+              <w:top w:w="80" w:type="dxa"/>
+              <w:start w:w="120" w:type="dxa"/>
+              <w:bottom w:w="80" w:type="dxa"/>
+              <w:end w:w="120" w:type="dxa"/>
+            </w:tcMar>
+            <w:vAlign w:val="center"/>
+          </w:tcPr>
+          <w:p>
+            <w:pPr>
+              <w:spacing w:after="0"/>
+            </w:pPr>
+            <w:r>
+              <w:rPr>
+                <w:sz w:val="18"/>
+              </w:rPr>
+              <w:t>Kafka retry/DLQ</w:t>
+            </w:r>
+          </w:p>
+        </w:tc>
+        <w:tc>
+          <w:tcPr>
+            <w:tcW w:type="dxa" w:w="7160"/>
+            <w:tcMar>
+              <w:top w:w="80" w:type="dxa"/>
+              <w:start w:w="120" w:type="dxa"/>
+              <w:bottom w:w="80" w:type="dxa"/>
+              <w:end w:w="120" w:type="dxa"/>
+            </w:tcMar>
+            <w:vAlign w:val="center"/>
+          </w:tcPr>
+          <w:p>
+            <w:pPr>
+              <w:spacing w:after="0"/>
+            </w:pPr>
+            <w:r>
+              <w:rPr>
+                <w:sz w:val="18"/>
+              </w:rPr>
+              <w:t>Retry failed consumers and route exhausted messages to `&lt;topic&gt;.dlq`</w:t>
             </w:r>
           </w:p>
         </w:tc>
@@ -1349,6 +1589,194 @@
               <w:rPr>
                 <w:sz w:val="18"/>
               </w:rPr>
+              <w:t>notification-service</w:t>
+            </w:r>
+          </w:p>
+        </w:tc>
+        <w:tc>
+          <w:tcPr>
+            <w:tcW w:type="dxa" w:w="2100"/>
+            <w:tcMar>
+              <w:top w:w="80" w:type="dxa"/>
+              <w:start w:w="120" w:type="dxa"/>
+              <w:bottom w:w="80" w:type="dxa"/>
+              <w:end w:w="120" w:type="dxa"/>
+            </w:tcMar>
+            <w:vAlign w:val="center"/>
+          </w:tcPr>
+          <w:p>
+            <w:pPr>
+              <w:spacing w:after="0"/>
+            </w:pPr>
+            <w:r>
+              <w:rPr>
+                <w:sz w:val="18"/>
+              </w:rPr>
+              <w:t>8086</w:t>
+            </w:r>
+          </w:p>
+        </w:tc>
+        <w:tc>
+          <w:tcPr>
+            <w:tcW w:type="dxa" w:w="2300"/>
+            <w:tcMar>
+              <w:top w:w="80" w:type="dxa"/>
+              <w:start w:w="120" w:type="dxa"/>
+              <w:bottom w:w="80" w:type="dxa"/>
+              <w:end w:w="120" w:type="dxa"/>
+            </w:tcMar>
+            <w:vAlign w:val="center"/>
+          </w:tcPr>
+          <w:p>
+            <w:pPr>
+              <w:spacing w:after="0"/>
+            </w:pPr>
+            <w:r>
+              <w:rPr>
+                <w:sz w:val="18"/>
+              </w:rPr>
+              <w:t>Owns customer notifications</w:t>
+            </w:r>
+          </w:p>
+        </w:tc>
+        <w:tc>
+          <w:tcPr>
+            <w:tcW w:type="dxa" w:w="3160"/>
+            <w:tcMar>
+              <w:top w:w="80" w:type="dxa"/>
+              <w:start w:w="120" w:type="dxa"/>
+              <w:bottom w:w="80" w:type="dxa"/>
+              <w:end w:w="120" w:type="dxa"/>
+            </w:tcMar>
+            <w:vAlign w:val="center"/>
+          </w:tcPr>
+          <w:p>
+            <w:pPr>
+              <w:spacing w:after="0"/>
+            </w:pPr>
+            <w:r>
+              <w:rPr>
+                <w:sz w:val="18"/>
+              </w:rPr>
+              <w:t>MongoDB `eventcart_notification.notifications`</w:t>
+            </w:r>
+          </w:p>
+        </w:tc>
+      </w:tr>
+      <w:tr>
+        <w:tc>
+          <w:tcPr>
+            <w:tcW w:type="dxa" w:w="1800"/>
+            <w:tcMar>
+              <w:top w:w="80" w:type="dxa"/>
+              <w:start w:w="120" w:type="dxa"/>
+              <w:bottom w:w="80" w:type="dxa"/>
+              <w:end w:w="120" w:type="dxa"/>
+            </w:tcMar>
+            <w:vAlign w:val="center"/>
+          </w:tcPr>
+          <w:p>
+            <w:pPr>
+              <w:spacing w:after="0"/>
+            </w:pPr>
+            <w:r>
+              <w:rPr>
+                <w:sz w:val="18"/>
+              </w:rPr>
+              <w:t>api-gateway</w:t>
+            </w:r>
+          </w:p>
+        </w:tc>
+        <w:tc>
+          <w:tcPr>
+            <w:tcW w:type="dxa" w:w="2100"/>
+            <w:tcMar>
+              <w:top w:w="80" w:type="dxa"/>
+              <w:start w:w="120" w:type="dxa"/>
+              <w:bottom w:w="80" w:type="dxa"/>
+              <w:end w:w="120" w:type="dxa"/>
+            </w:tcMar>
+            <w:vAlign w:val="center"/>
+          </w:tcPr>
+          <w:p>
+            <w:pPr>
+              <w:spacing w:after="0"/>
+            </w:pPr>
+            <w:r>
+              <w:rPr>
+                <w:sz w:val="18"/>
+              </w:rPr>
+              <w:t>8080</w:t>
+            </w:r>
+          </w:p>
+        </w:tc>
+        <w:tc>
+          <w:tcPr>
+            <w:tcW w:type="dxa" w:w="2300"/>
+            <w:tcMar>
+              <w:top w:w="80" w:type="dxa"/>
+              <w:start w:w="120" w:type="dxa"/>
+              <w:bottom w:w="80" w:type="dxa"/>
+              <w:end w:w="120" w:type="dxa"/>
+            </w:tcMar>
+            <w:vAlign w:val="center"/>
+          </w:tcPr>
+          <w:p>
+            <w:pPr>
+              <w:spacing w:after="0"/>
+            </w:pPr>
+            <w:r>
+              <w:rPr>
+                <w:sz w:val="18"/>
+              </w:rPr>
+              <w:t>Single secured entry point</w:t>
+            </w:r>
+          </w:p>
+        </w:tc>
+        <w:tc>
+          <w:tcPr>
+            <w:tcW w:type="dxa" w:w="3160"/>
+            <w:tcMar>
+              <w:top w:w="80" w:type="dxa"/>
+              <w:start w:w="120" w:type="dxa"/>
+              <w:bottom w:w="80" w:type="dxa"/>
+              <w:end w:w="120" w:type="dxa"/>
+            </w:tcMar>
+            <w:vAlign w:val="center"/>
+          </w:tcPr>
+          <w:p>
+            <w:pPr>
+              <w:spacing w:after="0"/>
+            </w:pPr>
+            <w:r>
+              <w:rPr>
+                <w:sz w:val="18"/>
+              </w:rPr>
+              <w:t>Routes to backend services</w:t>
+            </w:r>
+          </w:p>
+        </w:tc>
+      </w:tr>
+      <w:tr>
+        <w:tc>
+          <w:tcPr>
+            <w:tcW w:type="dxa" w:w="1800"/>
+            <w:tcMar>
+              <w:top w:w="80" w:type="dxa"/>
+              <w:start w:w="120" w:type="dxa"/>
+              <w:bottom w:w="80" w:type="dxa"/>
+              <w:end w:w="120" w:type="dxa"/>
+            </w:tcMar>
+            <w:vAlign w:val="center"/>
+          </w:tcPr>
+          <w:p>
+            <w:pPr>
+              <w:spacing w:after="0"/>
+            </w:pPr>
+            <w:r>
+              <w:rPr>
+                <w:sz w:val="18"/>
+              </w:rPr>
               <w:t>MongoDB</w:t>
             </w:r>
           </w:p>
@@ -1611,6 +2039,100 @@
           </w:p>
         </w:tc>
       </w:tr>
+      <w:tr>
+        <w:tc>
+          <w:tcPr>
+            <w:tcW w:type="dxa" w:w="1800"/>
+            <w:tcMar>
+              <w:top w:w="80" w:type="dxa"/>
+              <w:start w:w="120" w:type="dxa"/>
+              <w:bottom w:w="80" w:type="dxa"/>
+              <w:end w:w="120" w:type="dxa"/>
+            </w:tcMar>
+            <w:vAlign w:val="center"/>
+          </w:tcPr>
+          <w:p>
+            <w:pPr>
+              <w:spacing w:after="0"/>
+            </w:pPr>
+            <w:r>
+              <w:rPr>
+                <w:sz w:val="18"/>
+              </w:rPr>
+              <w:t>Keycloak</w:t>
+            </w:r>
+          </w:p>
+        </w:tc>
+        <w:tc>
+          <w:tcPr>
+            <w:tcW w:type="dxa" w:w="2100"/>
+            <w:tcMar>
+              <w:top w:w="80" w:type="dxa"/>
+              <w:start w:w="120" w:type="dxa"/>
+              <w:bottom w:w="80" w:type="dxa"/>
+              <w:end w:w="120" w:type="dxa"/>
+            </w:tcMar>
+            <w:vAlign w:val="center"/>
+          </w:tcPr>
+          <w:p>
+            <w:pPr>
+              <w:spacing w:after="0"/>
+            </w:pPr>
+            <w:r>
+              <w:rPr>
+                <w:sz w:val="18"/>
+              </w:rPr>
+              <w:t>8088</w:t>
+            </w:r>
+          </w:p>
+        </w:tc>
+        <w:tc>
+          <w:tcPr>
+            <w:tcW w:type="dxa" w:w="2300"/>
+            <w:tcMar>
+              <w:top w:w="80" w:type="dxa"/>
+              <w:start w:w="120" w:type="dxa"/>
+              <w:bottom w:w="80" w:type="dxa"/>
+              <w:end w:w="120" w:type="dxa"/>
+            </w:tcMar>
+            <w:vAlign w:val="center"/>
+          </w:tcPr>
+          <w:p>
+            <w:pPr>
+              <w:spacing w:after="0"/>
+            </w:pPr>
+            <w:r>
+              <w:rPr>
+                <w:sz w:val="18"/>
+              </w:rPr>
+              <w:t>Local identity provider</w:t>
+            </w:r>
+          </w:p>
+        </w:tc>
+        <w:tc>
+          <w:tcPr>
+            <w:tcW w:type="dxa" w:w="3160"/>
+            <w:tcMar>
+              <w:top w:w="80" w:type="dxa"/>
+              <w:start w:w="120" w:type="dxa"/>
+              <w:bottom w:w="80" w:type="dxa"/>
+              <w:end w:w="120" w:type="dxa"/>
+            </w:tcMar>
+            <w:vAlign w:val="center"/>
+          </w:tcPr>
+          <w:p>
+            <w:pPr>
+              <w:spacing w:after="0"/>
+            </w:pPr>
+            <w:r>
+              <w:rPr>
+                <w:sz w:val="18"/>
+              </w:rPr>
+              <w:t>Docker container `eventcart-keycloak`</w:t>
+            </w:r>
+          </w:p>
+        </w:tc>
+      </w:tr>
     </w:tbl>
     <w:p>
       <w:pPr>
@@ -1734,7 +2256,7 @@
           <w:rFonts w:ascii="Courier New" w:hAnsi="Courier New"/>
           <w:sz w:val="17"/>
         </w:rPr>
-        <w:t xml:space="preserve">    F --&gt; H["order-service publishes OrderCreatedEvent"]</w:t>
+        <w:t xml:space="preserve">    F --&gt; H["order-service stores OrderCreatedEvent in outbox"]</w:t>
       </w:r>
     </w:p>
     <w:p>
@@ -1748,7 +2270,35 @@
           <w:rFonts w:ascii="Courier New" w:hAnsi="Courier New"/>
           <w:sz w:val="17"/>
         </w:rPr>
-        <w:t xml:space="preserve">    H --&gt; I["inventory-service consumes OrderCreatedEvent"]</w:t>
+        <w:t xml:space="preserve">    H --&gt; Z1["order-service outbox publisher sends OrderCreatedEvent"]</w:t>
+      </w:r>
+    </w:p>
+    <w:p>
+      <w:pPr>
+        <w:spacing w:before="0" w:after="0"/>
+        <w:ind w:left="216"/>
+        <w:shd w:fill="F4F6F9"/>
+      </w:pPr>
+      <w:r>
+        <w:rPr>
+          <w:rFonts w:ascii="Courier New" w:hAnsi="Courier New"/>
+          <w:sz w:val="17"/>
+        </w:rPr>
+        <w:t xml:space="preserve">    Z1 --&gt; I["inventory-service consumes OrderCreatedEvent"]</w:t>
+      </w:r>
+    </w:p>
+    <w:p>
+      <w:pPr>
+        <w:spacing w:before="0" w:after="0"/>
+        <w:ind w:left="216"/>
+        <w:shd w:fill="F4F6F9"/>
+      </w:pPr>
+      <w:r>
+        <w:rPr>
+          <w:rFonts w:ascii="Courier New" w:hAnsi="Courier New"/>
+          <w:sz w:val="17"/>
+        </w:rPr>
+        <w:t xml:space="preserve">    Z1 --&gt; Z2["notification-service records order notification"]</w:t>
       </w:r>
     </w:p>
     <w:p>
@@ -1930,7 +2480,35 @@
           <w:rFonts w:ascii="Courier New" w:hAnsi="Courier New"/>
           <w:sz w:val="17"/>
         </w:rPr>
+        <w:t xml:space="preserve">    T --&gt; Z3["notification-service records payment success notification"]</w:t>
+      </w:r>
+    </w:p>
+    <w:p>
+      <w:pPr>
+        <w:spacing w:before="0" w:after="0"/>
+        <w:ind w:left="216"/>
+        <w:shd w:fill="F4F6F9"/>
+      </w:pPr>
+      <w:r>
+        <w:rPr>
+          <w:rFonts w:ascii="Courier New" w:hAnsi="Courier New"/>
+          <w:sz w:val="17"/>
+        </w:rPr>
         <w:t xml:space="preserve">    U --&gt; W["order-service updates order to PAYMENT_FAILED"]</w:t>
+      </w:r>
+    </w:p>
+    <w:p>
+      <w:pPr>
+        <w:spacing w:before="0" w:after="0"/>
+        <w:ind w:left="216"/>
+        <w:shd w:fill="F4F6F9"/>
+      </w:pPr>
+      <w:r>
+        <w:rPr>
+          <w:rFonts w:ascii="Courier New" w:hAnsi="Courier New"/>
+          <w:sz w:val="17"/>
+        </w:rPr>
+        <w:t xml:space="preserve">    U --&gt; Z4["notification-service records payment failure notification"]</w:t>
       </w:r>
     </w:p>
     <w:p>
@@ -1977,6 +2555,20 @@
     </w:p>
     <w:p>
       <w:pPr>
+        <w:spacing w:before="0" w:after="0"/>
+        <w:ind w:left="216"/>
+        <w:shd w:fill="F4F6F9"/>
+      </w:pPr>
+      <w:r>
+        <w:rPr>
+          <w:rFonts w:ascii="Courier New" w:hAnsi="Courier New"/>
+          <w:sz w:val="17"/>
+        </w:rPr>
+        <w:t xml:space="preserve">    N --&gt; Z5["notification-service records inventory failure notification"]</w:t>
+      </w:r>
+    </w:p>
+    <w:p>
+      <w:pPr>
         <w:spacing w:after="80"/>
       </w:pPr>
     </w:p>
@@ -2137,12 +2729,286 @@
     </w:p>
     <w:p>
       <w:pPr>
+        <w:spacing w:before="0" w:after="0"/>
+        <w:ind w:left="216"/>
+        <w:shd w:fill="F4F6F9"/>
+      </w:pPr>
+      <w:r>
+        <w:rPr>
+          <w:rFonts w:ascii="Courier New" w:hAnsi="Courier New"/>
+          <w:sz w:val="17"/>
+        </w:rPr>
+        <w:t>.\mvnw.cmd -pl services/notification-service spring-boot:run</w:t>
+      </w:r>
+    </w:p>
+    <w:p>
+      <w:pPr>
+        <w:spacing w:before="0" w:after="0"/>
+        <w:ind w:left="216"/>
+        <w:shd w:fill="F4F6F9"/>
+      </w:pPr>
+      <w:r>
+        <w:rPr>
+          <w:rFonts w:ascii="Courier New" w:hAnsi="Courier New"/>
+          <w:sz w:val="17"/>
+        </w:rPr>
+        <w:t>.\mvnw.cmd -pl services/api-gateway spring-boot:run</w:t>
+      </w:r>
+    </w:p>
+    <w:p>
+      <w:pPr>
         <w:spacing w:after="80"/>
       </w:pPr>
     </w:p>
     <w:p>
       <w:r>
-        <w:t>The startup order matters for manual testing because cart-service calls catalog-service, order-service calls cart-service, and inventory/order/payment communicate through Kafka.</w:t>
+        <w:t>The startup order matters for manual testing because cart-service calls catalog-service, order-service calls cart-service, api-gateway routes to every backend service, and inventory/order/payment/notification communicate through Kafka.</w:t>
+      </w:r>
+    </w:p>
+    <w:p>
+      <w:pPr>
+        <w:pStyle w:val="Heading1"/>
+      </w:pPr>
+      <w:r>
+        <w:t>Security Tokens</w:t>
+      </w:r>
+    </w:p>
+    <w:p>
+      <w:r>
+        <w:t xml:space="preserve">Keycloak imports realm </w:t>
+      </w:r>
+      <w:r>
+        <w:rPr>
+          <w:rFonts w:ascii="Courier New" w:hAnsi="Courier New"/>
+          <w:sz w:val="19"/>
+        </w:rPr>
+        <w:t>eventcart</w:t>
+      </w:r>
+      <w:r>
+        <w:t xml:space="preserve"> from </w:t>
+      </w:r>
+      <w:r>
+        <w:rPr>
+          <w:rFonts w:ascii="Courier New" w:hAnsi="Courier New"/>
+          <w:sz w:val="19"/>
+        </w:rPr>
+        <w:t>ops/keycloak/eventcart-realm.json</w:t>
+      </w:r>
+      <w:r>
+        <w:t>.</w:t>
+      </w:r>
+    </w:p>
+    <w:p>
+      <w:r>
+        <w:t>Use an admin token for product and inventory management:</w:t>
+      </w:r>
+    </w:p>
+    <w:p>
+      <w:pPr>
+        <w:spacing w:before="0" w:after="0"/>
+        <w:ind w:left="216"/>
+        <w:shd w:fill="F4F6F9"/>
+      </w:pPr>
+      <w:r>
+        <w:rPr>
+          <w:rFonts w:ascii="Courier New" w:hAnsi="Courier New"/>
+          <w:sz w:val="17"/>
+        </w:rPr>
+        <w:t>$tokenResponse = Invoke-RestMethod -Method Post `</w:t>
+      </w:r>
+    </w:p>
+    <w:p>
+      <w:pPr>
+        <w:spacing w:before="0" w:after="0"/>
+        <w:ind w:left="216"/>
+        <w:shd w:fill="F4F6F9"/>
+      </w:pPr>
+      <w:r>
+        <w:rPr>
+          <w:rFonts w:ascii="Courier New" w:hAnsi="Courier New"/>
+          <w:sz w:val="17"/>
+        </w:rPr>
+        <w:t xml:space="preserve">  -Uri "http://localhost:8088/realms/eventcart/protocol/openid-connect/token" `</w:t>
+      </w:r>
+    </w:p>
+    <w:p>
+      <w:pPr>
+        <w:spacing w:before="0" w:after="0"/>
+        <w:ind w:left="216"/>
+        <w:shd w:fill="F4F6F9"/>
+      </w:pPr>
+      <w:r>
+        <w:rPr>
+          <w:rFonts w:ascii="Courier New" w:hAnsi="Courier New"/>
+          <w:sz w:val="17"/>
+        </w:rPr>
+        <w:t xml:space="preserve">  -ContentType "application/x-www-form-urlencoded" `</w:t>
+      </w:r>
+    </w:p>
+    <w:p>
+      <w:pPr>
+        <w:spacing w:before="0" w:after="0"/>
+        <w:ind w:left="216"/>
+        <w:shd w:fill="F4F6F9"/>
+      </w:pPr>
+      <w:r>
+        <w:rPr>
+          <w:rFonts w:ascii="Courier New" w:hAnsi="Courier New"/>
+          <w:sz w:val="17"/>
+        </w:rPr>
+        <w:t xml:space="preserve">  -Body "grant_type=password&amp;client_id=eventcart-gateway&amp;username=admin-user&amp;password=admin"</w:t>
+      </w:r>
+    </w:p>
+    <w:p>
+      <w:pPr>
+        <w:spacing w:before="0" w:after="0"/>
+        <w:ind w:left="216"/>
+        <w:shd w:fill="F4F6F9"/>
+      </w:pPr>
+      <w:r>
+        <w:rPr>
+          <w:rFonts w:ascii="Courier New" w:hAnsi="Courier New"/>
+          <w:sz w:val="17"/>
+        </w:rPr>
+        <w:t xml:space="preserve"> </w:t>
+      </w:r>
+    </w:p>
+    <w:p>
+      <w:pPr>
+        <w:spacing w:before="0" w:after="0"/>
+        <w:ind w:left="216"/>
+        <w:shd w:fill="F4F6F9"/>
+      </w:pPr>
+      <w:r>
+        <w:rPr>
+          <w:rFonts w:ascii="Courier New" w:hAnsi="Courier New"/>
+          <w:sz w:val="17"/>
+        </w:rPr>
+        <w:t>$adminToken = $tokenResponse.access_token</w:t>
+      </w:r>
+    </w:p>
+    <w:p>
+      <w:pPr>
+        <w:spacing w:after="80"/>
+      </w:pPr>
+    </w:p>
+    <w:p>
+      <w:r>
+        <w:t>Use a customer token for cart, order, and notification APIs:</w:t>
+      </w:r>
+    </w:p>
+    <w:p>
+      <w:pPr>
+        <w:spacing w:before="0" w:after="0"/>
+        <w:ind w:left="216"/>
+        <w:shd w:fill="F4F6F9"/>
+      </w:pPr>
+      <w:r>
+        <w:rPr>
+          <w:rFonts w:ascii="Courier New" w:hAnsi="Courier New"/>
+          <w:sz w:val="17"/>
+        </w:rPr>
+        <w:t>$tokenResponse = Invoke-RestMethod -Method Post `</w:t>
+      </w:r>
+    </w:p>
+    <w:p>
+      <w:pPr>
+        <w:spacing w:before="0" w:after="0"/>
+        <w:ind w:left="216"/>
+        <w:shd w:fill="F4F6F9"/>
+      </w:pPr>
+      <w:r>
+        <w:rPr>
+          <w:rFonts w:ascii="Courier New" w:hAnsi="Courier New"/>
+          <w:sz w:val="17"/>
+        </w:rPr>
+        <w:t xml:space="preserve">  -Uri "http://localhost:8088/realms/eventcart/protocol/openid-connect/token" `</w:t>
+      </w:r>
+    </w:p>
+    <w:p>
+      <w:pPr>
+        <w:spacing w:before="0" w:after="0"/>
+        <w:ind w:left="216"/>
+        <w:shd w:fill="F4F6F9"/>
+      </w:pPr>
+      <w:r>
+        <w:rPr>
+          <w:rFonts w:ascii="Courier New" w:hAnsi="Courier New"/>
+          <w:sz w:val="17"/>
+        </w:rPr>
+        <w:t xml:space="preserve">  -ContentType "application/x-www-form-urlencoded" `</w:t>
+      </w:r>
+    </w:p>
+    <w:p>
+      <w:pPr>
+        <w:spacing w:before="0" w:after="0"/>
+        <w:ind w:left="216"/>
+        <w:shd w:fill="F4F6F9"/>
+      </w:pPr>
+      <w:r>
+        <w:rPr>
+          <w:rFonts w:ascii="Courier New" w:hAnsi="Courier New"/>
+          <w:sz w:val="17"/>
+        </w:rPr>
+        <w:t xml:space="preserve">  -Body "grant_type=password&amp;client_id=eventcart-gateway&amp;username=customer-user&amp;password=customer"</w:t>
+      </w:r>
+    </w:p>
+    <w:p>
+      <w:pPr>
+        <w:spacing w:before="0" w:after="0"/>
+        <w:ind w:left="216"/>
+        <w:shd w:fill="F4F6F9"/>
+      </w:pPr>
+      <w:r>
+        <w:rPr>
+          <w:rFonts w:ascii="Courier New" w:hAnsi="Courier New"/>
+          <w:sz w:val="17"/>
+        </w:rPr>
+        <w:t xml:space="preserve"> </w:t>
+      </w:r>
+    </w:p>
+    <w:p>
+      <w:pPr>
+        <w:spacing w:before="0" w:after="0"/>
+        <w:ind w:left="216"/>
+        <w:shd w:fill="F4F6F9"/>
+      </w:pPr>
+      <w:r>
+        <w:rPr>
+          <w:rFonts w:ascii="Courier New" w:hAnsi="Courier New"/>
+          <w:sz w:val="17"/>
+        </w:rPr>
+        <w:t>$customerToken = $tokenResponse.access_token</w:t>
+      </w:r>
+    </w:p>
+    <w:p>
+      <w:pPr>
+        <w:spacing w:after="80"/>
+      </w:pPr>
+    </w:p>
+    <w:p>
+      <w:r>
+        <w:t xml:space="preserve">The curl examples below show </w:t>
+      </w:r>
+      <w:r>
+        <w:rPr>
+          <w:rFonts w:ascii="Courier New" w:hAnsi="Courier New"/>
+          <w:sz w:val="19"/>
+        </w:rPr>
+        <w:t>&lt;admin-token&gt;</w:t>
+      </w:r>
+      <w:r>
+        <w:t xml:space="preserve"> or </w:t>
+      </w:r>
+      <w:r>
+        <w:rPr>
+          <w:rFonts w:ascii="Courier New" w:hAnsi="Courier New"/>
+          <w:sz w:val="19"/>
+        </w:rPr>
+        <w:t>&lt;customer-token&gt;</w:t>
+      </w:r>
+      <w:r>
+        <w:t>. Replace those placeholders with the token value or call the same API through PowerShell using the variables above.</w:t>
       </w:r>
     </w:p>
     <w:p>
@@ -2226,6 +3092,34 @@
           <w:sz w:val="17"/>
         </w:rPr>
         <w:t>curl http://localhost:8085/actuator/health</w:t>
+      </w:r>
+    </w:p>
+    <w:p>
+      <w:pPr>
+        <w:spacing w:before="0" w:after="0"/>
+        <w:ind w:left="216"/>
+        <w:shd w:fill="F4F6F9"/>
+      </w:pPr>
+      <w:r>
+        <w:rPr>
+          <w:rFonts w:ascii="Courier New" w:hAnsi="Courier New"/>
+          <w:sz w:val="17"/>
+        </w:rPr>
+        <w:t>curl http://localhost:8086/actuator/health</w:t>
+      </w:r>
+    </w:p>
+    <w:p>
+      <w:pPr>
+        <w:spacing w:before="0" w:after="0"/>
+        <w:ind w:left="216"/>
+        <w:shd w:fill="F4F6F9"/>
+      </w:pPr>
+      <w:r>
+        <w:rPr>
+          <w:rFonts w:ascii="Courier New" w:hAnsi="Courier New"/>
+          <w:sz w:val="17"/>
+        </w:rPr>
+        <w:t>curl http://localhost:8080/actuator/health</w:t>
       </w:r>
     </w:p>
     <w:p>
@@ -2561,6 +3455,102 @@
           </w:p>
         </w:tc>
       </w:tr>
+      <w:tr>
+        <w:tc>
+          <w:tcPr>
+            <w:tcW w:type="dxa" w:w="2200"/>
+            <w:tcMar>
+              <w:top w:w="80" w:type="dxa"/>
+              <w:start w:w="120" w:type="dxa"/>
+              <w:bottom w:w="80" w:type="dxa"/>
+              <w:end w:w="120" w:type="dxa"/>
+            </w:tcMar>
+            <w:vAlign w:val="center"/>
+          </w:tcPr>
+          <w:p>
+            <w:pPr>
+              <w:spacing w:after="0"/>
+            </w:pPr>
+            <w:r>
+              <w:rPr>
+                <w:sz w:val="18"/>
+              </w:rPr>
+              <w:t>notification-service</w:t>
+            </w:r>
+          </w:p>
+        </w:tc>
+        <w:tc>
+          <w:tcPr>
+            <w:tcW w:type="dxa" w:w="7160"/>
+            <w:tcMar>
+              <w:top w:w="80" w:type="dxa"/>
+              <w:start w:w="120" w:type="dxa"/>
+              <w:bottom w:w="80" w:type="dxa"/>
+              <w:end w:w="120" w:type="dxa"/>
+            </w:tcMar>
+            <w:vAlign w:val="center"/>
+          </w:tcPr>
+          <w:p>
+            <w:pPr>
+              <w:spacing w:after="0"/>
+            </w:pPr>
+            <w:r>
+              <w:rPr>
+                <w:sz w:val="18"/>
+              </w:rPr>
+              <w:t>`http://localhost:8086/swagger-ui.html`</w:t>
+            </w:r>
+          </w:p>
+        </w:tc>
+      </w:tr>
+      <w:tr>
+        <w:tc>
+          <w:tcPr>
+            <w:tcW w:type="dxa" w:w="2200"/>
+            <w:tcMar>
+              <w:top w:w="80" w:type="dxa"/>
+              <w:start w:w="120" w:type="dxa"/>
+              <w:bottom w:w="80" w:type="dxa"/>
+              <w:end w:w="120" w:type="dxa"/>
+            </w:tcMar>
+            <w:vAlign w:val="center"/>
+          </w:tcPr>
+          <w:p>
+            <w:pPr>
+              <w:spacing w:after="0"/>
+            </w:pPr>
+            <w:r>
+              <w:rPr>
+                <w:sz w:val="18"/>
+              </w:rPr>
+              <w:t>api-gateway</w:t>
+            </w:r>
+          </w:p>
+        </w:tc>
+        <w:tc>
+          <w:tcPr>
+            <w:tcW w:type="dxa" w:w="7160"/>
+            <w:tcMar>
+              <w:top w:w="80" w:type="dxa"/>
+              <w:start w:w="120" w:type="dxa"/>
+              <w:bottom w:w="80" w:type="dxa"/>
+              <w:end w:w="120" w:type="dxa"/>
+            </w:tcMar>
+            <w:vAlign w:val="center"/>
+          </w:tcPr>
+          <w:p>
+            <w:pPr>
+              <w:spacing w:after="0"/>
+            </w:pPr>
+            <w:r>
+              <w:rPr>
+                <w:sz w:val="18"/>
+              </w:rPr>
+              <w:t>`http://localhost:8080/swagger-ui.html`</w:t>
+            </w:r>
+          </w:p>
+        </w:tc>
+      </w:tr>
     </w:tbl>
     <w:p>
       <w:pPr>
@@ -2632,6 +3622,20 @@
           <w:rFonts w:ascii="Courier New" w:hAnsi="Courier New"/>
           <w:sz w:val="17"/>
         </w:rPr>
+        <w:t xml:space="preserve">  -H "Authorization: Bearer &lt;admin-token&gt;" \</w:t>
+      </w:r>
+    </w:p>
+    <w:p>
+      <w:pPr>
+        <w:spacing w:before="0" w:after="0"/>
+        <w:ind w:left="216"/>
+        <w:shd w:fill="F4F6F9"/>
+      </w:pPr>
+      <w:r>
+        <w:rPr>
+          <w:rFonts w:ascii="Courier New" w:hAnsi="Courier New"/>
+          <w:sz w:val="17"/>
+        </w:rPr>
         <w:t xml:space="preserve">  -H "Content-Type: application/json" \</w:t>
       </w:r>
     </w:p>
@@ -3006,6 +4010,20 @@
           <w:rFonts w:ascii="Courier New" w:hAnsi="Courier New"/>
           <w:sz w:val="17"/>
         </w:rPr>
+        <w:t xml:space="preserve">  -H "Authorization: Bearer &lt;admin-token&gt;" \</w:t>
+      </w:r>
+    </w:p>
+    <w:p>
+      <w:pPr>
+        <w:spacing w:before="0" w:after="0"/>
+        <w:ind w:left="216"/>
+        <w:shd w:fill="F4F6F9"/>
+      </w:pPr>
+      <w:r>
+        <w:rPr>
+          <w:rFonts w:ascii="Courier New" w:hAnsi="Courier New"/>
+          <w:sz w:val="17"/>
+        </w:rPr>
         <w:t xml:space="preserve">  -H "Content-Type: application/json" \</w:t>
       </w:r>
     </w:p>
@@ -3213,7 +4231,21 @@
           <w:rFonts w:ascii="Courier New" w:hAnsi="Courier New"/>
           <w:sz w:val="17"/>
         </w:rPr>
-        <w:t>curl http://localhost:8082/api/v1/carts/customer-1</w:t>
+        <w:t>curl http://localhost:8082/api/v1/carts/customer-1 \</w:t>
+      </w:r>
+    </w:p>
+    <w:p>
+      <w:pPr>
+        <w:spacing w:before="0" w:after="0"/>
+        <w:ind w:left="216"/>
+        <w:shd w:fill="F4F6F9"/>
+      </w:pPr>
+      <w:r>
+        <w:rPr>
+          <w:rFonts w:ascii="Courier New" w:hAnsi="Courier New"/>
+          <w:sz w:val="17"/>
+        </w:rPr>
+        <w:t xml:space="preserve">  -H "Authorization: Bearer &lt;customer-token&gt;"</w:t>
       </w:r>
     </w:p>
     <w:p>
@@ -3323,6 +4355,20 @@
           <w:rFonts w:ascii="Courier New" w:hAnsi="Courier New"/>
           <w:sz w:val="17"/>
         </w:rPr>
+        <w:t xml:space="preserve">  -H "Authorization: Bearer &lt;customer-token&gt;" \</w:t>
+      </w:r>
+    </w:p>
+    <w:p>
+      <w:pPr>
+        <w:spacing w:before="0" w:after="0"/>
+        <w:ind w:left="216"/>
+        <w:shd w:fill="F4F6F9"/>
+      </w:pPr>
+      <w:r>
+        <w:rPr>
+          <w:rFonts w:ascii="Courier New" w:hAnsi="Courier New"/>
+          <w:sz w:val="17"/>
+        </w:rPr>
         <w:t xml:space="preserve">  -H "Content-Type: application/json" \</w:t>
       </w:r>
     </w:p>
@@ -3515,7 +4561,21 @@
           <w:rFonts w:ascii="Courier New" w:hAnsi="Courier New"/>
           <w:sz w:val="17"/>
         </w:rPr>
-        <w:t>curl http://localhost:8082/api/v1/carts/customer-1</w:t>
+        <w:t>curl http://localhost:8082/api/v1/carts/customer-1 \</w:t>
+      </w:r>
+    </w:p>
+    <w:p>
+      <w:pPr>
+        <w:spacing w:before="0" w:after="0"/>
+        <w:ind w:left="216"/>
+        <w:shd w:fill="F4F6F9"/>
+      </w:pPr>
+      <w:r>
+        <w:rPr>
+          <w:rFonts w:ascii="Courier New" w:hAnsi="Courier New"/>
+          <w:sz w:val="17"/>
+        </w:rPr>
+        <w:t xml:space="preserve">  -H "Authorization: Bearer &lt;customer-token&gt;"</w:t>
       </w:r>
     </w:p>
     <w:p>
@@ -3688,6 +4748,20 @@
           <w:rFonts w:ascii="Courier New" w:hAnsi="Courier New"/>
           <w:sz w:val="17"/>
         </w:rPr>
+        <w:t xml:space="preserve">  -H "Authorization: Bearer &lt;customer-token&gt;" \</w:t>
+      </w:r>
+    </w:p>
+    <w:p>
+      <w:pPr>
+        <w:spacing w:before="0" w:after="0"/>
+        <w:ind w:left="216"/>
+        <w:shd w:fill="F4F6F9"/>
+      </w:pPr>
+      <w:r>
+        <w:rPr>
+          <w:rFonts w:ascii="Courier New" w:hAnsi="Courier New"/>
+          <w:sz w:val="17"/>
+        </w:rPr>
         <w:t xml:space="preserve">  -H "Content-Type: application/json" \</w:t>
       </w:r>
     </w:p>
@@ -3786,7 +4860,7 @@
         <w:pStyle w:val="ListBullet"/>
       </w:pPr>
       <w:r>
-        <w:t xml:space="preserve">order-service publishes </w:t>
+        <w:t xml:space="preserve">order-service stores </w:t>
       </w:r>
       <w:r>
         <w:rPr>
@@ -3796,7 +4870,25 @@
         <w:t>OrderCreatedEvent</w:t>
       </w:r>
       <w:r>
-        <w:t xml:space="preserve"> to Kafka topic </w:t>
+        <w:t xml:space="preserve"> in MongoDB collection </w:t>
+      </w:r>
+      <w:r>
+        <w:rPr>
+          <w:rFonts w:ascii="Courier New" w:hAnsi="Courier New"/>
+          <w:sz w:val="19"/>
+        </w:rPr>
+        <w:t>outbox_events</w:t>
+      </w:r>
+      <w:r>
+        <w:t>.</w:t>
+      </w:r>
+    </w:p>
+    <w:p>
+      <w:pPr>
+        <w:pStyle w:val="ListBullet"/>
+      </w:pPr>
+      <w:r>
+        <w:t xml:space="preserve">order-service outbox publisher publishes pending events to Kafka topic </w:t>
       </w:r>
       <w:r>
         <w:rPr>
@@ -3897,7 +4989,21 @@
           <w:rFonts w:ascii="Courier New" w:hAnsi="Courier New"/>
           <w:sz w:val="17"/>
         </w:rPr>
-        <w:t>curl http://localhost:8083/api/v1/orders/&lt;order-id&gt;</w:t>
+        <w:t>curl http://localhost:8083/api/v1/orders/&lt;order-id&gt; \</w:t>
+      </w:r>
+    </w:p>
+    <w:p>
+      <w:pPr>
+        <w:spacing w:before="0" w:after="0"/>
+        <w:ind w:left="216"/>
+        <w:shd w:fill="F4F6F9"/>
+      </w:pPr>
+      <w:r>
+        <w:rPr>
+          <w:rFonts w:ascii="Courier New" w:hAnsi="Courier New"/>
+          <w:sz w:val="17"/>
+        </w:rPr>
+        <w:t xml:space="preserve">  -H "Authorization: Bearer &lt;customer-token&gt;"</w:t>
       </w:r>
     </w:p>
     <w:p>
@@ -3940,6 +5046,20 @@
     </w:p>
     <w:p>
       <w:pPr>
+        <w:spacing w:before="0" w:after="0"/>
+        <w:ind w:left="216"/>
+        <w:shd w:fill="F4F6F9"/>
+      </w:pPr>
+      <w:r>
+        <w:rPr>
+          <w:rFonts w:ascii="Courier New" w:hAnsi="Courier New"/>
+          <w:sz w:val="17"/>
+        </w:rPr>
+        <w:t>db.outbox_events.find({ aggregateId: "&lt;order-id&gt;" }).pretty()</w:t>
+      </w:r>
+    </w:p>
+    <w:p>
+      <w:pPr>
         <w:spacing w:after="80"/>
       </w:pPr>
     </w:p>
@@ -4063,7 +5183,21 @@
           <w:rFonts w:ascii="Courier New" w:hAnsi="Courier New"/>
           <w:sz w:val="17"/>
         </w:rPr>
-        <w:t>curl http://localhost:8084/api/v1/inventory/reservations/&lt;order-id&gt;</w:t>
+        <w:t>curl http://localhost:8084/api/v1/inventory/reservations/&lt;order-id&gt; \</w:t>
+      </w:r>
+    </w:p>
+    <w:p>
+      <w:pPr>
+        <w:spacing w:before="0" w:after="0"/>
+        <w:ind w:left="216"/>
+        <w:shd w:fill="F4F6F9"/>
+      </w:pPr>
+      <w:r>
+        <w:rPr>
+          <w:rFonts w:ascii="Courier New" w:hAnsi="Courier New"/>
+          <w:sz w:val="17"/>
+        </w:rPr>
+        <w:t xml:space="preserve">  -H "Authorization: Bearer &lt;admin-token&gt;"</w:t>
       </w:r>
     </w:p>
     <w:p>
@@ -4151,7 +5285,21 @@
           <w:rFonts w:ascii="Courier New" w:hAnsi="Courier New"/>
           <w:sz w:val="17"/>
         </w:rPr>
-        <w:t>curl http://localhost:8084/api/v1/inventory/&lt;product-id&gt;</w:t>
+        <w:t>curl http://localhost:8084/api/v1/inventory/&lt;product-id&gt; \</w:t>
+      </w:r>
+    </w:p>
+    <w:p>
+      <w:pPr>
+        <w:spacing w:before="0" w:after="0"/>
+        <w:ind w:left="216"/>
+        <w:shd w:fill="F4F6F9"/>
+      </w:pPr>
+      <w:r>
+        <w:rPr>
+          <w:rFonts w:ascii="Courier New" w:hAnsi="Courier New"/>
+          <w:sz w:val="17"/>
+        </w:rPr>
+        <w:t xml:space="preserve">  -H "Authorization: Bearer &lt;admin-token&gt;"</w:t>
       </w:r>
     </w:p>
     <w:p>
@@ -4218,7 +5366,21 @@
           <w:rFonts w:ascii="Courier New" w:hAnsi="Courier New"/>
           <w:sz w:val="17"/>
         </w:rPr>
-        <w:t>curl http://localhost:8083/api/v1/orders/&lt;order-id&gt;</w:t>
+        <w:t>curl http://localhost:8083/api/v1/orders/&lt;order-id&gt; \</w:t>
+      </w:r>
+    </w:p>
+    <w:p>
+      <w:pPr>
+        <w:spacing w:before="0" w:after="0"/>
+        <w:ind w:left="216"/>
+        <w:shd w:fill="F4F6F9"/>
+      </w:pPr>
+      <w:r>
+        <w:rPr>
+          <w:rFonts w:ascii="Courier New" w:hAnsi="Courier New"/>
+          <w:sz w:val="17"/>
+        </w:rPr>
+        <w:t xml:space="preserve">  -H "Authorization: Bearer &lt;customer-token&gt;"</w:t>
       </w:r>
     </w:p>
     <w:p>
@@ -4330,7 +5492,21 @@
           <w:rFonts w:ascii="Courier New" w:hAnsi="Courier New"/>
           <w:sz w:val="17"/>
         </w:rPr>
-        <w:t>curl http://localhost:8085/api/v1/payments/orders/&lt;order-id&gt;</w:t>
+        <w:t>curl http://localhost:8085/api/v1/payments/orders/&lt;order-id&gt; \</w:t>
+      </w:r>
+    </w:p>
+    <w:p>
+      <w:pPr>
+        <w:spacing w:before="0" w:after="0"/>
+        <w:ind w:left="216"/>
+        <w:shd w:fill="F4F6F9"/>
+      </w:pPr>
+      <w:r>
+        <w:rPr>
+          <w:rFonts w:ascii="Courier New" w:hAnsi="Courier New"/>
+          <w:sz w:val="17"/>
+        </w:rPr>
+        <w:t xml:space="preserve">  -H "Authorization: Bearer &lt;admin-token&gt;"</w:t>
       </w:r>
     </w:p>
     <w:p>
@@ -4512,7 +5688,21 @@
           <w:rFonts w:ascii="Courier New" w:hAnsi="Courier New"/>
           <w:sz w:val="17"/>
         </w:rPr>
-        <w:t>curl http://localhost:8083/api/v1/orders/&lt;order-id&gt;</w:t>
+        <w:t>curl http://localhost:8083/api/v1/orders/&lt;order-id&gt; \</w:t>
+      </w:r>
+    </w:p>
+    <w:p>
+      <w:pPr>
+        <w:spacing w:before="0" w:after="0"/>
+        <w:ind w:left="216"/>
+        <w:shd w:fill="F4F6F9"/>
+      </w:pPr>
+      <w:r>
+        <w:rPr>
+          <w:rFonts w:ascii="Courier New" w:hAnsi="Courier New"/>
+          <w:sz w:val="17"/>
+        </w:rPr>
+        <w:t xml:space="preserve">  -H "Authorization: Bearer &lt;customer-token&gt;"</w:t>
       </w:r>
     </w:p>
     <w:p>
@@ -4604,7 +5794,21 @@
           <w:rFonts w:ascii="Courier New" w:hAnsi="Courier New"/>
           <w:sz w:val="17"/>
         </w:rPr>
-        <w:t>curl http://localhost:8082/api/v1/carts/customer-1</w:t>
+        <w:t>curl http://localhost:8082/api/v1/carts/customer-1 \</w:t>
+      </w:r>
+    </w:p>
+    <w:p>
+      <w:pPr>
+        <w:spacing w:before="0" w:after="0"/>
+        <w:ind w:left="216"/>
+        <w:shd w:fill="F4F6F9"/>
+      </w:pPr>
+      <w:r>
+        <w:rPr>
+          <w:rFonts w:ascii="Courier New" w:hAnsi="Courier New"/>
+          <w:sz w:val="17"/>
+        </w:rPr>
+        <w:t xml:space="preserve">  -H "Authorization: Bearer &lt;customer-token&gt;"</w:t>
       </w:r>
     </w:p>
     <w:p>
@@ -4771,6 +5975,76 @@
     </w:p>
     <w:p>
       <w:pPr>
+        <w:spacing w:before="0" w:after="0"/>
+        <w:ind w:left="216"/>
+        <w:shd w:fill="F4F6F9"/>
+      </w:pPr>
+      <w:r>
+        <w:rPr>
+          <w:rFonts w:ascii="Courier New" w:hAnsi="Courier New"/>
+          <w:sz w:val="17"/>
+        </w:rPr>
+        <w:t>eventcart.orders.created.dlq</w:t>
+      </w:r>
+    </w:p>
+    <w:p>
+      <w:pPr>
+        <w:spacing w:before="0" w:after="0"/>
+        <w:ind w:left="216"/>
+        <w:shd w:fill="F4F6F9"/>
+      </w:pPr>
+      <w:r>
+        <w:rPr>
+          <w:rFonts w:ascii="Courier New" w:hAnsi="Courier New"/>
+          <w:sz w:val="17"/>
+        </w:rPr>
+        <w:t>eventcart.inventory.reserved.dlq</w:t>
+      </w:r>
+    </w:p>
+    <w:p>
+      <w:pPr>
+        <w:spacing w:before="0" w:after="0"/>
+        <w:ind w:left="216"/>
+        <w:shd w:fill="F4F6F9"/>
+      </w:pPr>
+      <w:r>
+        <w:rPr>
+          <w:rFonts w:ascii="Courier New" w:hAnsi="Courier New"/>
+          <w:sz w:val="17"/>
+        </w:rPr>
+        <w:t>eventcart.inventory.failed.dlq</w:t>
+      </w:r>
+    </w:p>
+    <w:p>
+      <w:pPr>
+        <w:spacing w:before="0" w:after="0"/>
+        <w:ind w:left="216"/>
+        <w:shd w:fill="F4F6F9"/>
+      </w:pPr>
+      <w:r>
+        <w:rPr>
+          <w:rFonts w:ascii="Courier New" w:hAnsi="Courier New"/>
+          <w:sz w:val="17"/>
+        </w:rPr>
+        <w:t>eventcart.payments.completed.dlq</w:t>
+      </w:r>
+    </w:p>
+    <w:p>
+      <w:pPr>
+        <w:spacing w:before="0" w:after="0"/>
+        <w:ind w:left="216"/>
+        <w:shd w:fill="F4F6F9"/>
+      </w:pPr>
+      <w:r>
+        <w:rPr>
+          <w:rFonts w:ascii="Courier New" w:hAnsi="Courier New"/>
+          <w:sz w:val="17"/>
+        </w:rPr>
+        <w:t>eventcart.payments.failed.dlq</w:t>
+      </w:r>
+    </w:p>
+    <w:p>
+      <w:pPr>
         <w:spacing w:after="80"/>
       </w:pPr>
     </w:p>
@@ -4895,6 +6169,248 @@
       </w:pPr>
     </w:p>
     <w:p>
+      <w:r>
+        <w:t>Read a DLQ topic when a consumer keeps failing after retries:</w:t>
+      </w:r>
+    </w:p>
+    <w:p>
+      <w:pPr>
+        <w:spacing w:before="0" w:after="0"/>
+        <w:ind w:left="216"/>
+        <w:shd w:fill="F4F6F9"/>
+      </w:pPr>
+      <w:r>
+        <w:rPr>
+          <w:rFonts w:ascii="Courier New" w:hAnsi="Courier New"/>
+          <w:sz w:val="17"/>
+        </w:rPr>
+        <w:t>docker exec -it eventcart-kafka /opt/kafka/bin/kafka-console-consumer.sh --bootstrap-server localhost:9092 --topic eventcart.orders.created.dlq --from-beginning --max-messages 5</w:t>
+      </w:r>
+    </w:p>
+    <w:p>
+      <w:pPr>
+        <w:spacing w:after="80"/>
+      </w:pPr>
+    </w:p>
+    <w:p>
+      <w:pPr>
+        <w:pStyle w:val="Heading1"/>
+      </w:pPr>
+      <w:r>
+        <w:t>Notification Verification</w:t>
+      </w:r>
+    </w:p>
+    <w:p>
+      <w:r>
+        <w:t>notification-service creates in-app notifications asynchronously from Kafka events.</w:t>
+      </w:r>
+    </w:p>
+    <w:p>
+      <w:r>
+        <w:t>List customer notifications:</w:t>
+      </w:r>
+    </w:p>
+    <w:p>
+      <w:pPr>
+        <w:spacing w:before="0" w:after="0"/>
+        <w:ind w:left="216"/>
+        <w:shd w:fill="F4F6F9"/>
+      </w:pPr>
+      <w:r>
+        <w:rPr>
+          <w:rFonts w:ascii="Courier New" w:hAnsi="Courier New"/>
+          <w:sz w:val="17"/>
+        </w:rPr>
+        <w:t>curl http://localhost:8086/api/v1/notifications/customers/customer-1 \</w:t>
+      </w:r>
+    </w:p>
+    <w:p>
+      <w:pPr>
+        <w:spacing w:before="0" w:after="0"/>
+        <w:ind w:left="216"/>
+        <w:shd w:fill="F4F6F9"/>
+      </w:pPr>
+      <w:r>
+        <w:rPr>
+          <w:rFonts w:ascii="Courier New" w:hAnsi="Courier New"/>
+          <w:sz w:val="17"/>
+        </w:rPr>
+        <w:t xml:space="preserve">  -H "Authorization: Bearer &lt;customer-token&gt;"</w:t>
+      </w:r>
+    </w:p>
+    <w:p>
+      <w:pPr>
+        <w:spacing w:after="80"/>
+      </w:pPr>
+    </w:p>
+    <w:p>
+      <w:r>
+        <w:t>Expected result:</w:t>
+      </w:r>
+    </w:p>
+    <w:p>
+      <w:pPr>
+        <w:pStyle w:val="ListBullet"/>
+      </w:pPr>
+      <w:r>
+        <w:t xml:space="preserve">At least one </w:t>
+      </w:r>
+      <w:r>
+        <w:rPr>
+          <w:rFonts w:ascii="Courier New" w:hAnsi="Courier New"/>
+          <w:sz w:val="19"/>
+        </w:rPr>
+        <w:t>ORDER_CREATED</w:t>
+      </w:r>
+      <w:r>
+        <w:t xml:space="preserve"> notification exists after order placement.</w:t>
+      </w:r>
+    </w:p>
+    <w:p>
+      <w:pPr>
+        <w:pStyle w:val="ListBullet"/>
+      </w:pPr>
+      <w:r>
+        <w:t xml:space="preserve">A </w:t>
+      </w:r>
+      <w:r>
+        <w:rPr>
+          <w:rFonts w:ascii="Courier New" w:hAnsi="Courier New"/>
+          <w:sz w:val="19"/>
+        </w:rPr>
+        <w:t>PAYMENT_COMPLETED</w:t>
+      </w:r>
+      <w:r>
+        <w:t xml:space="preserve"> notification exists on the happy path.</w:t>
+      </w:r>
+    </w:p>
+    <w:p>
+      <w:pPr>
+        <w:pStyle w:val="ListBullet"/>
+      </w:pPr>
+      <w:r>
+        <w:t xml:space="preserve">A </w:t>
+      </w:r>
+      <w:r>
+        <w:rPr>
+          <w:rFonts w:ascii="Courier New" w:hAnsi="Courier New"/>
+          <w:sz w:val="19"/>
+        </w:rPr>
+        <w:t>PAYMENT_FAILED</w:t>
+      </w:r>
+      <w:r>
+        <w:t xml:space="preserve"> notification exists on payment failure.</w:t>
+      </w:r>
+    </w:p>
+    <w:p>
+      <w:pPr>
+        <w:pStyle w:val="ListBullet"/>
+      </w:pPr>
+      <w:r>
+        <w:t xml:space="preserve">An </w:t>
+      </w:r>
+      <w:r>
+        <w:rPr>
+          <w:rFonts w:ascii="Courier New" w:hAnsi="Courier New"/>
+          <w:sz w:val="19"/>
+        </w:rPr>
+        <w:t>INVENTORY_FAILED</w:t>
+      </w:r>
+      <w:r>
+        <w:t xml:space="preserve"> notification exists on insufficient-stock failure.</w:t>
+      </w:r>
+    </w:p>
+    <w:p>
+      <w:r>
+        <w:t>Verify through MongoDB:</w:t>
+      </w:r>
+    </w:p>
+    <w:p>
+      <w:pPr>
+        <w:spacing w:before="0" w:after="0"/>
+        <w:ind w:left="216"/>
+        <w:shd w:fill="F4F6F9"/>
+      </w:pPr>
+      <w:r>
+        <w:rPr>
+          <w:rFonts w:ascii="Courier New" w:hAnsi="Courier New"/>
+          <w:sz w:val="17"/>
+        </w:rPr>
+        <w:t>use eventcart_notification</w:t>
+      </w:r>
+    </w:p>
+    <w:p>
+      <w:pPr>
+        <w:spacing w:before="0" w:after="0"/>
+        <w:ind w:left="216"/>
+        <w:shd w:fill="F4F6F9"/>
+      </w:pPr>
+      <w:r>
+        <w:rPr>
+          <w:rFonts w:ascii="Courier New" w:hAnsi="Courier New"/>
+          <w:sz w:val="17"/>
+        </w:rPr>
+        <w:t>db.notifications.find({ customerId: "customer-1" }).pretty()</w:t>
+      </w:r>
+    </w:p>
+    <w:p>
+      <w:pPr>
+        <w:spacing w:after="80"/>
+      </w:pPr>
+    </w:p>
+    <w:p>
+      <w:r>
+        <w:t>Mark a notification read:</w:t>
+      </w:r>
+    </w:p>
+    <w:p>
+      <w:pPr>
+        <w:spacing w:before="0" w:after="0"/>
+        <w:ind w:left="216"/>
+        <w:shd w:fill="F4F6F9"/>
+      </w:pPr>
+      <w:r>
+        <w:rPr>
+          <w:rFonts w:ascii="Courier New" w:hAnsi="Courier New"/>
+          <w:sz w:val="17"/>
+        </w:rPr>
+        <w:t>curl -X PUT \</w:t>
+      </w:r>
+    </w:p>
+    <w:p>
+      <w:pPr>
+        <w:spacing w:before="0" w:after="0"/>
+        <w:ind w:left="216"/>
+        <w:shd w:fill="F4F6F9"/>
+      </w:pPr>
+      <w:r>
+        <w:rPr>
+          <w:rFonts w:ascii="Courier New" w:hAnsi="Courier New"/>
+          <w:sz w:val="17"/>
+        </w:rPr>
+        <w:t xml:space="preserve">  http://localhost:8086/api/v1/notifications/&lt;notification-id&gt;/read \</w:t>
+      </w:r>
+    </w:p>
+    <w:p>
+      <w:pPr>
+        <w:spacing w:before="0" w:after="0"/>
+        <w:ind w:left="216"/>
+        <w:shd w:fill="F4F6F9"/>
+      </w:pPr>
+      <w:r>
+        <w:rPr>
+          <w:rFonts w:ascii="Courier New" w:hAnsi="Courier New"/>
+          <w:sz w:val="17"/>
+        </w:rPr>
+        <w:t xml:space="preserve">  -H "Authorization: Bearer &lt;customer-token&gt;"</w:t>
+      </w:r>
+    </w:p>
+    <w:p>
+      <w:pPr>
+        <w:spacing w:after="80"/>
+      </w:pPr>
+    </w:p>
+    <w:p>
       <w:pPr>
         <w:pStyle w:val="Heading1"/>
       </w:pPr>
@@ -4946,6 +6462,20 @@
           <w:rFonts w:ascii="Courier New" w:hAnsi="Courier New"/>
           <w:sz w:val="17"/>
         </w:rPr>
+        <w:t xml:space="preserve">  -H "Authorization: Bearer &lt;customer-token&gt;" \</w:t>
+      </w:r>
+    </w:p>
+    <w:p>
+      <w:pPr>
+        <w:spacing w:before="0" w:after="0"/>
+        <w:ind w:left="216"/>
+        <w:shd w:fill="F4F6F9"/>
+      </w:pPr>
+      <w:r>
+        <w:rPr>
+          <w:rFonts w:ascii="Courier New" w:hAnsi="Courier New"/>
+          <w:sz w:val="17"/>
+        </w:rPr>
         <w:t xml:space="preserve">  -H "Content-Type: application/json" \</w:t>
       </w:r>
     </w:p>
@@ -5190,6 +6720,20 @@
           <w:rFonts w:ascii="Courier New" w:hAnsi="Courier New"/>
           <w:sz w:val="17"/>
         </w:rPr>
+        <w:t xml:space="preserve">  -H "Authorization: Bearer &lt;admin-token&gt;" \</w:t>
+      </w:r>
+    </w:p>
+    <w:p>
+      <w:pPr>
+        <w:spacing w:before="0" w:after="0"/>
+        <w:ind w:left="216"/>
+        <w:shd w:fill="F4F6F9"/>
+      </w:pPr>
+      <w:r>
+        <w:rPr>
+          <w:rFonts w:ascii="Courier New" w:hAnsi="Courier New"/>
+          <w:sz w:val="17"/>
+        </w:rPr>
         <w:t xml:space="preserve">  -H "Content-Type: application/json" \</w:t>
       </w:r>
     </w:p>
@@ -5359,7 +6903,7 @@
           <w:rFonts w:ascii="Courier New" w:hAnsi="Courier New"/>
           <w:sz w:val="17"/>
         </w:rPr>
-        <w:t>curl http://localhost:8084/api/v1/inventory/reservations/&lt;order-id&gt;</w:t>
+        <w:t>curl http://localhost:8084/api/v1/inventory/reservations/&lt;order-id&gt; -H "Authorization: Bearer &lt;admin-token&gt;"</w:t>
       </w:r>
     </w:p>
     <w:p>
@@ -5373,7 +6917,7 @@
           <w:rFonts w:ascii="Courier New" w:hAnsi="Courier New"/>
           <w:sz w:val="17"/>
         </w:rPr>
-        <w:t>curl http://localhost:8083/api/v1/orders/&lt;order-id&gt;</w:t>
+        <w:t>curl http://localhost:8083/api/v1/orders/&lt;order-id&gt; -H "Authorization: Bearer &lt;customer-token&gt;"</w:t>
       </w:r>
     </w:p>
     <w:p>
@@ -5387,7 +6931,7 @@
           <w:rFonts w:ascii="Courier New" w:hAnsi="Courier New"/>
           <w:sz w:val="17"/>
         </w:rPr>
-        <w:t>curl http://localhost:8082/api/v1/carts/customer-1</w:t>
+        <w:t>curl http://localhost:8082/api/v1/carts/customer-1 -H "Authorization: Bearer &lt;customer-token&gt;"</w:t>
       </w:r>
     </w:p>
     <w:p>
@@ -5494,6 +7038,20 @@
           <w:rFonts w:ascii="Courier New" w:hAnsi="Courier New"/>
           <w:sz w:val="17"/>
         </w:rPr>
+        <w:t xml:space="preserve">  -H "Authorization: Bearer &lt;admin-token&gt;" \</w:t>
+      </w:r>
+    </w:p>
+    <w:p>
+      <w:pPr>
+        <w:spacing w:before="0" w:after="0"/>
+        <w:ind w:left="216"/>
+        <w:shd w:fill="F4F6F9"/>
+      </w:pPr>
+      <w:r>
+        <w:rPr>
+          <w:rFonts w:ascii="Courier New" w:hAnsi="Courier New"/>
+          <w:sz w:val="17"/>
+        </w:rPr>
         <w:t xml:space="preserve">  -H "Content-Type: application/json" \</w:t>
       </w:r>
     </w:p>
@@ -5795,7 +7353,7 @@
           <w:rFonts w:ascii="Courier New" w:hAnsi="Courier New"/>
           <w:sz w:val="17"/>
         </w:rPr>
-        <w:t>curl http://localhost:8085/api/v1/payments/orders/&lt;order-id&gt;</w:t>
+        <w:t>curl http://localhost:8085/api/v1/payments/orders/&lt;order-id&gt; -H "Authorization: Bearer &lt;admin-token&gt;"</w:t>
       </w:r>
     </w:p>
     <w:p>
@@ -5809,7 +7367,7 @@
           <w:rFonts w:ascii="Courier New" w:hAnsi="Courier New"/>
           <w:sz w:val="17"/>
         </w:rPr>
-        <w:t>curl http://localhost:8083/api/v1/orders/&lt;order-id&gt;</w:t>
+        <w:t>curl http://localhost:8083/api/v1/orders/&lt;order-id&gt; -H "Authorization: Bearer &lt;customer-token&gt;"</w:t>
       </w:r>
     </w:p>
     <w:p>
@@ -5823,7 +7381,7 @@
           <w:rFonts w:ascii="Courier New" w:hAnsi="Courier New"/>
           <w:sz w:val="17"/>
         </w:rPr>
-        <w:t>curl http://localhost:8082/api/v1/carts/customer-1</w:t>
+        <w:t>curl http://localhost:8082/api/v1/carts/customer-1 -H "Authorization: Bearer &lt;customer-token&gt;"</w:t>
       </w:r>
     </w:p>
     <w:p>
@@ -5837,7 +7395,7 @@
           <w:rFonts w:ascii="Courier New" w:hAnsi="Courier New"/>
           <w:sz w:val="17"/>
         </w:rPr>
-        <w:t>curl http://localhost:8084/api/v1/inventory/reservations/&lt;order-id&gt;</w:t>
+        <w:t>curl http://localhost:8084/api/v1/inventory/reservations/&lt;order-id&gt; -H "Authorization: Bearer &lt;admin-token&gt;"</w:t>
       </w:r>
     </w:p>
     <w:p>
@@ -5851,7 +7409,7 @@
           <w:rFonts w:ascii="Courier New" w:hAnsi="Courier New"/>
           <w:sz w:val="17"/>
         </w:rPr>
-        <w:t>curl http://localhost:8084/api/v1/inventory/&lt;product-id&gt;</w:t>
+        <w:t>curl http://localhost:8084/api/v1/inventory/&lt;product-id&gt; -H "Authorization: Bearer &lt;admin-token&gt;"</w:t>
       </w:r>
     </w:p>
     <w:p>
@@ -6016,6 +7574,20 @@
           <w:rFonts w:ascii="Courier New" w:hAnsi="Courier New"/>
           <w:sz w:val="17"/>
         </w:rPr>
+        <w:t xml:space="preserve">  -H "Authorization: Bearer &lt;customer-token&gt;" \</w:t>
+      </w:r>
+    </w:p>
+    <w:p>
+      <w:pPr>
+        <w:spacing w:before="0" w:after="0"/>
+        <w:ind w:left="216"/>
+        <w:shd w:fill="F4F6F9"/>
+      </w:pPr>
+      <w:r>
+        <w:rPr>
+          <w:rFonts w:ascii="Courier New" w:hAnsi="Courier New"/>
+          <w:sz w:val="17"/>
+        </w:rPr>
         <w:t xml:space="preserve">  -H "Content-Type: application/json" \</w:t>
       </w:r>
     </w:p>
@@ -6238,7 +7810,7 @@
           <w:rFonts w:ascii="Courier New" w:hAnsi="Courier New"/>
           <w:sz w:val="17"/>
         </w:rPr>
-        <w:t>curl -X DELETE http://localhost:8081/api/v1/products/&lt;product-id&gt;</w:t>
+        <w:t>curl -X DELETE http://localhost:8081/api/v1/products/&lt;product-id&gt; -H "Authorization: Bearer &lt;admin-token&gt;"</w:t>
       </w:r>
     </w:p>
     <w:p>
@@ -6267,6 +7839,20 @@
           <w:sz w:val="17"/>
         </w:rPr>
         <w:t xml:space="preserve">  http://localhost:8082/api/v1/carts/customer-1/items \</w:t>
+      </w:r>
+    </w:p>
+    <w:p>
+      <w:pPr>
+        <w:spacing w:before="0" w:after="0"/>
+        <w:ind w:left="216"/>
+        <w:shd w:fill="F4F6F9"/>
+      </w:pPr>
+      <w:r>
+        <w:rPr>
+          <w:rFonts w:ascii="Courier New" w:hAnsi="Courier New"/>
+          <w:sz w:val="17"/>
+        </w:rPr>
+        <w:t xml:space="preserve">  -H "Authorization: Bearer &lt;customer-token&gt;" \</w:t>
       </w:r>
     </w:p>
     <w:p>
@@ -6657,6 +8243,77 @@
                 <w:sz w:val="18"/>
               </w:rPr>
               <w:t>`Placing order`, `Order saved`, `Publishing OrderCreated event`</w:t>
+            </w:r>
+          </w:p>
+        </w:tc>
+      </w:tr>
+      <w:tr>
+        <w:tc>
+          <w:tcPr>
+            <w:tcW w:type="dxa" w:w="1900"/>
+            <w:tcMar>
+              <w:top w:w="80" w:type="dxa"/>
+              <w:start w:w="120" w:type="dxa"/>
+              <w:bottom w:w="80" w:type="dxa"/>
+              <w:end w:w="120" w:type="dxa"/>
+            </w:tcMar>
+            <w:vAlign w:val="center"/>
+          </w:tcPr>
+          <w:p>
+            <w:pPr>
+              <w:spacing w:after="0"/>
+            </w:pPr>
+            <w:r>
+              <w:rPr>
+                <w:sz w:val="18"/>
+              </w:rPr>
+              <w:t>order-service</w:t>
+            </w:r>
+          </w:p>
+        </w:tc>
+        <w:tc>
+          <w:tcPr>
+            <w:tcW w:type="dxa" w:w="3100"/>
+            <w:tcMar>
+              <w:top w:w="80" w:type="dxa"/>
+              <w:start w:w="120" w:type="dxa"/>
+              <w:bottom w:w="80" w:type="dxa"/>
+              <w:end w:w="120" w:type="dxa"/>
+            </w:tcMar>
+            <w:vAlign w:val="center"/>
+          </w:tcPr>
+          <w:p>
+            <w:pPr>
+              <w:spacing w:after="0"/>
+            </w:pPr>
+            <w:r>
+              <w:rPr>
+                <w:sz w:val="18"/>
+              </w:rPr>
+              <w:t>Outbox</w:t>
+            </w:r>
+          </w:p>
+        </w:tc>
+        <w:tc>
+          <w:tcPr>
+            <w:tcW w:type="dxa" w:w="4360"/>
+            <w:tcMar>
+              <w:top w:w="80" w:type="dxa"/>
+              <w:start w:w="120" w:type="dxa"/>
+              <w:bottom w:w="80" w:type="dxa"/>
+              <w:end w:w="120" w:type="dxa"/>
+            </w:tcMar>
+            <w:vAlign w:val="center"/>
+          </w:tcPr>
+          <w:p>
+            <w:pPr>
+              <w:spacing w:after="0"/>
+            </w:pPr>
+            <w:r>
+              <w:rPr>
+                <w:sz w:val="18"/>
+              </w:rPr>
+              <w:t>`OrderCreated event stored in outbox`, `Outbox event published`</w:t>
             </w:r>
           </w:p>
         </w:tc>
@@ -7229,6 +8886,148 @@
           </w:p>
         </w:tc>
       </w:tr>
+      <w:tr>
+        <w:tc>
+          <w:tcPr>
+            <w:tcW w:type="dxa" w:w="1900"/>
+            <w:tcMar>
+              <w:top w:w="80" w:type="dxa"/>
+              <w:start w:w="120" w:type="dxa"/>
+              <w:bottom w:w="80" w:type="dxa"/>
+              <w:end w:w="120" w:type="dxa"/>
+            </w:tcMar>
+            <w:vAlign w:val="center"/>
+          </w:tcPr>
+          <w:p>
+            <w:pPr>
+              <w:spacing w:after="0"/>
+            </w:pPr>
+            <w:r>
+              <w:rPr>
+                <w:sz w:val="18"/>
+              </w:rPr>
+              <w:t>notification-service</w:t>
+            </w:r>
+          </w:p>
+        </w:tc>
+        <w:tc>
+          <w:tcPr>
+            <w:tcW w:type="dxa" w:w="3100"/>
+            <w:tcMar>
+              <w:top w:w="80" w:type="dxa"/>
+              <w:start w:w="120" w:type="dxa"/>
+              <w:bottom w:w="80" w:type="dxa"/>
+              <w:end w:w="120" w:type="dxa"/>
+            </w:tcMar>
+            <w:vAlign w:val="center"/>
+          </w:tcPr>
+          <w:p>
+            <w:pPr>
+              <w:spacing w:after="0"/>
+            </w:pPr>
+            <w:r>
+              <w:rPr>
+                <w:sz w:val="18"/>
+              </w:rPr>
+              <w:t>Notifications</w:t>
+            </w:r>
+          </w:p>
+        </w:tc>
+        <w:tc>
+          <w:tcPr>
+            <w:tcW w:type="dxa" w:w="4360"/>
+            <w:tcMar>
+              <w:top w:w="80" w:type="dxa"/>
+              <w:start w:w="120" w:type="dxa"/>
+              <w:bottom w:w="80" w:type="dxa"/>
+              <w:end w:w="120" w:type="dxa"/>
+            </w:tcMar>
+            <w:vAlign w:val="center"/>
+          </w:tcPr>
+          <w:p>
+            <w:pPr>
+              <w:spacing w:after="0"/>
+            </w:pPr>
+            <w:r>
+              <w:rPr>
+                <w:sz w:val="18"/>
+              </w:rPr>
+              <w:t>`Consumed OrderCreated event for notification`, `Notification stored`, `Notification marked read`</w:t>
+            </w:r>
+          </w:p>
+        </w:tc>
+      </w:tr>
+      <w:tr>
+        <w:tc>
+          <w:tcPr>
+            <w:tcW w:type="dxa" w:w="1900"/>
+            <w:tcMar>
+              <w:top w:w="80" w:type="dxa"/>
+              <w:start w:w="120" w:type="dxa"/>
+              <w:bottom w:w="80" w:type="dxa"/>
+              <w:end w:w="120" w:type="dxa"/>
+            </w:tcMar>
+            <w:vAlign w:val="center"/>
+          </w:tcPr>
+          <w:p>
+            <w:pPr>
+              <w:spacing w:after="0"/>
+            </w:pPr>
+            <w:r>
+              <w:rPr>
+                <w:sz w:val="18"/>
+              </w:rPr>
+              <w:t>api-gateway</w:t>
+            </w:r>
+          </w:p>
+        </w:tc>
+        <w:tc>
+          <w:tcPr>
+            <w:tcW w:type="dxa" w:w="3100"/>
+            <w:tcMar>
+              <w:top w:w="80" w:type="dxa"/>
+              <w:start w:w="120" w:type="dxa"/>
+              <w:bottom w:w="80" w:type="dxa"/>
+              <w:end w:w="120" w:type="dxa"/>
+            </w:tcMar>
+            <w:vAlign w:val="center"/>
+          </w:tcPr>
+          <w:p>
+            <w:pPr>
+              <w:spacing w:after="0"/>
+            </w:pPr>
+            <w:r>
+              <w:rPr>
+                <w:sz w:val="18"/>
+              </w:rPr>
+              <w:t>Routing/security</w:t>
+            </w:r>
+          </w:p>
+        </w:tc>
+        <w:tc>
+          <w:tcPr>
+            <w:tcW w:type="dxa" w:w="4360"/>
+            <w:tcMar>
+              <w:top w:w="80" w:type="dxa"/>
+              <w:start w:w="120" w:type="dxa"/>
+              <w:bottom w:w="80" w:type="dxa"/>
+              <w:end w:w="120" w:type="dxa"/>
+            </w:tcMar>
+            <w:vAlign w:val="center"/>
+          </w:tcPr>
+          <w:p>
+            <w:pPr>
+              <w:spacing w:after="0"/>
+            </w:pPr>
+            <w:r>
+              <w:rPr>
+                <w:sz w:val="18"/>
+              </w:rPr>
+              <w:t>Gateway route logs and `X-Correlation-Id` response header</w:t>
+            </w:r>
+          </w:p>
+        </w:tc>
+      </w:tr>
     </w:tbl>
     <w:p>
       <w:pPr>
@@ -7413,7 +9212,7 @@
               <w:rPr>
                 <w:sz w:val="18"/>
               </w:rPr>
-              <w:t>MongoDB, Kafka, and Redis are healthy</w:t>
+              <w:t>MongoDB, Kafka, Redis, and Keycloak are healthy</w:t>
             </w:r>
           </w:p>
         </w:tc>
@@ -7462,6 +9261,54 @@
                 <w:sz w:val="18"/>
               </w:rPr>
               <w:t>`/actuator/health` returns `UP`</w:t>
+            </w:r>
+          </w:p>
+        </w:tc>
+      </w:tr>
+      <w:tr>
+        <w:tc>
+          <w:tcPr>
+            <w:tcW w:type="dxa" w:w="2200"/>
+            <w:tcMar>
+              <w:top w:w="80" w:type="dxa"/>
+              <w:start w:w="120" w:type="dxa"/>
+              <w:bottom w:w="80" w:type="dxa"/>
+              <w:end w:w="120" w:type="dxa"/>
+            </w:tcMar>
+            <w:vAlign w:val="center"/>
+          </w:tcPr>
+          <w:p>
+            <w:pPr>
+              <w:spacing w:after="0"/>
+            </w:pPr>
+            <w:r>
+              <w:rPr>
+                <w:sz w:val="18"/>
+              </w:rPr>
+              <w:t>Keycloak token works</w:t>
+            </w:r>
+          </w:p>
+        </w:tc>
+        <w:tc>
+          <w:tcPr>
+            <w:tcW w:type="dxa" w:w="7160"/>
+            <w:tcMar>
+              <w:top w:w="80" w:type="dxa"/>
+              <w:start w:w="120" w:type="dxa"/>
+              <w:bottom w:w="80" w:type="dxa"/>
+              <w:end w:w="120" w:type="dxa"/>
+            </w:tcMar>
+            <w:vAlign w:val="center"/>
+          </w:tcPr>
+          <w:p>
+            <w:pPr>
+              <w:spacing w:after="0"/>
+            </w:pPr>
+            <w:r>
+              <w:rPr>
+                <w:sz w:val="18"/>
+              </w:rPr>
+              <w:t>Customer/admin token can call role-appropriate APIs</w:t>
             </w:r>
           </w:p>
         </w:tc>
@@ -7702,6 +9549,54 @@
                 <w:sz w:val="18"/>
               </w:rPr>
               <w:t>Idempotency key value is `ORDER:&lt;order-id&gt;`</w:t>
+            </w:r>
+          </w:p>
+        </w:tc>
+      </w:tr>
+      <w:tr>
+        <w:tc>
+          <w:tcPr>
+            <w:tcW w:type="dxa" w:w="2200"/>
+            <w:tcMar>
+              <w:top w:w="80" w:type="dxa"/>
+              <w:start w:w="120" w:type="dxa"/>
+              <w:bottom w:w="80" w:type="dxa"/>
+              <w:end w:w="120" w:type="dxa"/>
+            </w:tcMar>
+            <w:vAlign w:val="center"/>
+          </w:tcPr>
+          <w:p>
+            <w:pPr>
+              <w:spacing w:after="0"/>
+            </w:pPr>
+            <w:r>
+              <w:rPr>
+                <w:sz w:val="18"/>
+              </w:rPr>
+              <w:t>Outbox event stored</w:t>
+            </w:r>
+          </w:p>
+        </w:tc>
+        <w:tc>
+          <w:tcPr>
+            <w:tcW w:type="dxa" w:w="7160"/>
+            <w:tcMar>
+              <w:top w:w="80" w:type="dxa"/>
+              <w:start w:w="120" w:type="dxa"/>
+              <w:bottom w:w="80" w:type="dxa"/>
+              <w:end w:w="120" w:type="dxa"/>
+            </w:tcMar>
+            <w:vAlign w:val="center"/>
+          </w:tcPr>
+          <w:p>
+            <w:pPr>
+              <w:spacing w:after="0"/>
+            </w:pPr>
+            <w:r>
+              <w:rPr>
+                <w:sz w:val="18"/>
+              </w:rPr>
+              <w:t>`eventcart_order.outbox_events` contains the order-created event</w:t>
             </w:r>
           </w:p>
         </w:tc>
@@ -8090,6 +9985,150 @@
           </w:p>
         </w:tc>
       </w:tr>
+      <w:tr>
+        <w:tc>
+          <w:tcPr>
+            <w:tcW w:type="dxa" w:w="2200"/>
+            <w:tcMar>
+              <w:top w:w="80" w:type="dxa"/>
+              <w:start w:w="120" w:type="dxa"/>
+              <w:bottom w:w="80" w:type="dxa"/>
+              <w:end w:w="120" w:type="dxa"/>
+            </w:tcMar>
+            <w:vAlign w:val="center"/>
+          </w:tcPr>
+          <w:p>
+            <w:pPr>
+              <w:spacing w:after="0"/>
+            </w:pPr>
+            <w:r>
+              <w:rPr>
+                <w:sz w:val="18"/>
+              </w:rPr>
+              <w:t>Notifications created</w:t>
+            </w:r>
+          </w:p>
+        </w:tc>
+        <w:tc>
+          <w:tcPr>
+            <w:tcW w:type="dxa" w:w="7160"/>
+            <w:tcMar>
+              <w:top w:w="80" w:type="dxa"/>
+              <w:start w:w="120" w:type="dxa"/>
+              <w:bottom w:w="80" w:type="dxa"/>
+              <w:end w:w="120" w:type="dxa"/>
+            </w:tcMar>
+            <w:vAlign w:val="center"/>
+          </w:tcPr>
+          <w:p>
+            <w:pPr>
+              <w:spacing w:after="0"/>
+            </w:pPr>
+            <w:r>
+              <w:rPr>
+                <w:sz w:val="18"/>
+              </w:rPr>
+              <w:t>`eventcart_notification.notifications` contains order/payment notifications</w:t>
+            </w:r>
+          </w:p>
+        </w:tc>
+      </w:tr>
+      <w:tr>
+        <w:tc>
+          <w:tcPr>
+            <w:tcW w:type="dxa" w:w="2200"/>
+            <w:tcMar>
+              <w:top w:w="80" w:type="dxa"/>
+              <w:start w:w="120" w:type="dxa"/>
+              <w:bottom w:w="80" w:type="dxa"/>
+              <w:end w:w="120" w:type="dxa"/>
+            </w:tcMar>
+            <w:vAlign w:val="center"/>
+          </w:tcPr>
+          <w:p>
+            <w:pPr>
+              <w:spacing w:after="0"/>
+            </w:pPr>
+            <w:r>
+              <w:rPr>
+                <w:sz w:val="18"/>
+              </w:rPr>
+              <w:t>Correlation ID present</w:t>
+            </w:r>
+          </w:p>
+        </w:tc>
+        <w:tc>
+          <w:tcPr>
+            <w:tcW w:type="dxa" w:w="7160"/>
+            <w:tcMar>
+              <w:top w:w="80" w:type="dxa"/>
+              <w:start w:w="120" w:type="dxa"/>
+              <w:bottom w:w="80" w:type="dxa"/>
+              <w:end w:w="120" w:type="dxa"/>
+            </w:tcMar>
+            <w:vAlign w:val="center"/>
+          </w:tcPr>
+          <w:p>
+            <w:pPr>
+              <w:spacing w:after="0"/>
+            </w:pPr>
+            <w:r>
+              <w:rPr>
+                <w:sz w:val="18"/>
+              </w:rPr>
+              <w:t>Responses include `X-Correlation-Id`, and logs show the same ID</w:t>
+            </w:r>
+          </w:p>
+        </w:tc>
+      </w:tr>
+      <w:tr>
+        <w:tc>
+          <w:tcPr>
+            <w:tcW w:type="dxa" w:w="2200"/>
+            <w:tcMar>
+              <w:top w:w="80" w:type="dxa"/>
+              <w:start w:w="120" w:type="dxa"/>
+              <w:bottom w:w="80" w:type="dxa"/>
+              <w:end w:w="120" w:type="dxa"/>
+            </w:tcMar>
+            <w:vAlign w:val="center"/>
+          </w:tcPr>
+          <w:p>
+            <w:pPr>
+              <w:spacing w:after="0"/>
+            </w:pPr>
+            <w:r>
+              <w:rPr>
+                <w:sz w:val="18"/>
+              </w:rPr>
+              <w:t>DLQ topics exist</w:t>
+            </w:r>
+          </w:p>
+        </w:tc>
+        <w:tc>
+          <w:tcPr>
+            <w:tcW w:type="dxa" w:w="7160"/>
+            <w:tcMar>
+              <w:top w:w="80" w:type="dxa"/>
+              <w:start w:w="120" w:type="dxa"/>
+              <w:bottom w:w="80" w:type="dxa"/>
+              <w:end w:w="120" w:type="dxa"/>
+            </w:tcMar>
+            <w:vAlign w:val="center"/>
+          </w:tcPr>
+          <w:p>
+            <w:pPr>
+              <w:spacing w:after="0"/>
+            </w:pPr>
+            <w:r>
+              <w:rPr>
+                <w:sz w:val="18"/>
+              </w:rPr>
+              <w:t>`&lt;topic&gt;.dlq` topics appear in Kafka topic list</w:t>
+            </w:r>
+          </w:p>
+        </w:tc>
+      </w:tr>
     </w:tbl>
     <w:p>
       <w:pPr>
@@ -8286,6 +10325,148 @@
               <w:rPr>
                 <w:sz w:val="18"/>
               </w:rPr>
+              <w:t>`401 Unauthorized`</w:t>
+            </w:r>
+          </w:p>
+        </w:tc>
+        <w:tc>
+          <w:tcPr>
+            <w:tcW w:type="dxa" w:w="3100"/>
+            <w:tcMar>
+              <w:top w:w="80" w:type="dxa"/>
+              <w:start w:w="120" w:type="dxa"/>
+              <w:bottom w:w="80" w:type="dxa"/>
+              <w:end w:w="120" w:type="dxa"/>
+            </w:tcMar>
+            <w:vAlign w:val="center"/>
+          </w:tcPr>
+          <w:p>
+            <w:pPr>
+              <w:spacing w:after="0"/>
+            </w:pPr>
+            <w:r>
+              <w:rPr>
+                <w:sz w:val="18"/>
+              </w:rPr>
+              <w:t>Missing or expired JWT token</w:t>
+            </w:r>
+          </w:p>
+        </w:tc>
+        <w:tc>
+          <w:tcPr>
+            <w:tcW w:type="dxa" w:w="4360"/>
+            <w:tcMar>
+              <w:top w:w="80" w:type="dxa"/>
+              <w:start w:w="120" w:type="dxa"/>
+              <w:bottom w:w="80" w:type="dxa"/>
+              <w:end w:w="120" w:type="dxa"/>
+            </w:tcMar>
+            <w:vAlign w:val="center"/>
+          </w:tcPr>
+          <w:p>
+            <w:pPr>
+              <w:spacing w:after="0"/>
+            </w:pPr>
+            <w:r>
+              <w:rPr>
+                <w:sz w:val="18"/>
+              </w:rPr>
+              <w:t>Fetch a fresh Keycloak token and send `Authorization: Bearer &lt;token&gt;`</w:t>
+            </w:r>
+          </w:p>
+        </w:tc>
+      </w:tr>
+      <w:tr>
+        <w:tc>
+          <w:tcPr>
+            <w:tcW w:type="dxa" w:w="1900"/>
+            <w:tcMar>
+              <w:top w:w="80" w:type="dxa"/>
+              <w:start w:w="120" w:type="dxa"/>
+              <w:bottom w:w="80" w:type="dxa"/>
+              <w:end w:w="120" w:type="dxa"/>
+            </w:tcMar>
+            <w:vAlign w:val="center"/>
+          </w:tcPr>
+          <w:p>
+            <w:pPr>
+              <w:spacing w:after="0"/>
+            </w:pPr>
+            <w:r>
+              <w:rPr>
+                <w:sz w:val="18"/>
+              </w:rPr>
+              <w:t>`403 Forbidden`</w:t>
+            </w:r>
+          </w:p>
+        </w:tc>
+        <w:tc>
+          <w:tcPr>
+            <w:tcW w:type="dxa" w:w="3100"/>
+            <w:tcMar>
+              <w:top w:w="80" w:type="dxa"/>
+              <w:start w:w="120" w:type="dxa"/>
+              <w:bottom w:w="80" w:type="dxa"/>
+              <w:end w:w="120" w:type="dxa"/>
+            </w:tcMar>
+            <w:vAlign w:val="center"/>
+          </w:tcPr>
+          <w:p>
+            <w:pPr>
+              <w:spacing w:after="0"/>
+            </w:pPr>
+            <w:r>
+              <w:rPr>
+                <w:sz w:val="18"/>
+              </w:rPr>
+              <w:t>Token role is not allowed for that API</w:t>
+            </w:r>
+          </w:p>
+        </w:tc>
+        <w:tc>
+          <w:tcPr>
+            <w:tcW w:type="dxa" w:w="4360"/>
+            <w:tcMar>
+              <w:top w:w="80" w:type="dxa"/>
+              <w:start w:w="120" w:type="dxa"/>
+              <w:bottom w:w="80" w:type="dxa"/>
+              <w:end w:w="120" w:type="dxa"/>
+            </w:tcMar>
+            <w:vAlign w:val="center"/>
+          </w:tcPr>
+          <w:p>
+            <w:pPr>
+              <w:spacing w:after="0"/>
+            </w:pPr>
+            <w:r>
+              <w:rPr>
+                <w:sz w:val="18"/>
+              </w:rPr>
+              <w:t>Use `ADMIN` for product/inventory, `CUSTOMER` for cart/order/notifications, or `SUPPORT` for lookup APIs</w:t>
+            </w:r>
+          </w:p>
+        </w:tc>
+      </w:tr>
+      <w:tr>
+        <w:tc>
+          <w:tcPr>
+            <w:tcW w:type="dxa" w:w="1900"/>
+            <w:tcMar>
+              <w:top w:w="80" w:type="dxa"/>
+              <w:start w:w="120" w:type="dxa"/>
+              <w:bottom w:w="80" w:type="dxa"/>
+              <w:end w:w="120" w:type="dxa"/>
+            </w:tcMar>
+            <w:vAlign w:val="center"/>
+          </w:tcPr>
+          <w:p>
+            <w:pPr>
+              <w:spacing w:after="0"/>
+            </w:pPr>
+            <w:r>
+              <w:rPr>
+                <w:sz w:val="18"/>
+              </w:rPr>
               <w:t>Cart add fails</w:t>
             </w:r>
           </w:p>
@@ -8333,6 +10514,77 @@
                 <w:sz w:val="18"/>
               </w:rPr>
               <w:t>Check product API and cart-service logs</w:t>
+            </w:r>
+          </w:p>
+        </w:tc>
+      </w:tr>
+      <w:tr>
+        <w:tc>
+          <w:tcPr>
+            <w:tcW w:type="dxa" w:w="1900"/>
+            <w:tcMar>
+              <w:top w:w="80" w:type="dxa"/>
+              <w:start w:w="120" w:type="dxa"/>
+              <w:bottom w:w="80" w:type="dxa"/>
+              <w:end w:w="120" w:type="dxa"/>
+            </w:tcMar>
+            <w:vAlign w:val="center"/>
+          </w:tcPr>
+          <w:p>
+            <w:pPr>
+              <w:spacing w:after="0"/>
+            </w:pPr>
+            <w:r>
+              <w:rPr>
+                <w:sz w:val="18"/>
+              </w:rPr>
+              <w:t>Order exists but no Kafka message</w:t>
+            </w:r>
+          </w:p>
+        </w:tc>
+        <w:tc>
+          <w:tcPr>
+            <w:tcW w:type="dxa" w:w="3100"/>
+            <w:tcMar>
+              <w:top w:w="80" w:type="dxa"/>
+              <w:start w:w="120" w:type="dxa"/>
+              <w:bottom w:w="80" w:type="dxa"/>
+              <w:end w:w="120" w:type="dxa"/>
+            </w:tcMar>
+            <w:vAlign w:val="center"/>
+          </w:tcPr>
+          <w:p>
+            <w:pPr>
+              <w:spacing w:after="0"/>
+            </w:pPr>
+            <w:r>
+              <w:rPr>
+                <w:sz w:val="18"/>
+              </w:rPr>
+              <w:t>Outbox publisher has not published yet or Kafka is down</w:t>
+            </w:r>
+          </w:p>
+        </w:tc>
+        <w:tc>
+          <w:tcPr>
+            <w:tcW w:type="dxa" w:w="4360"/>
+            <w:tcMar>
+              <w:top w:w="80" w:type="dxa"/>
+              <w:start w:w="120" w:type="dxa"/>
+              <w:bottom w:w="80" w:type="dxa"/>
+              <w:end w:w="120" w:type="dxa"/>
+            </w:tcMar>
+            <w:vAlign w:val="center"/>
+          </w:tcPr>
+          <w:p>
+            <w:pPr>
+              <w:spacing w:after="0"/>
+            </w:pPr>
+            <w:r>
+              <w:rPr>
+                <w:sz w:val="18"/>
+              </w:rPr>
+              <w:t>Check `eventcart_order.outbox_events` status and order-service logs</w:t>
             </w:r>
           </w:p>
         </w:tc>
@@ -8783,6 +11035,148 @@
               <w:rPr>
                 <w:sz w:val="18"/>
               </w:rPr>
+              <w:t>Message appears in `.dlq` topic</w:t>
+            </w:r>
+          </w:p>
+        </w:tc>
+        <w:tc>
+          <w:tcPr>
+            <w:tcW w:type="dxa" w:w="3100"/>
+            <w:tcMar>
+              <w:top w:w="80" w:type="dxa"/>
+              <w:start w:w="120" w:type="dxa"/>
+              <w:bottom w:w="80" w:type="dxa"/>
+              <w:end w:w="120" w:type="dxa"/>
+            </w:tcMar>
+            <w:vAlign w:val="center"/>
+          </w:tcPr>
+          <w:p>
+            <w:pPr>
+              <w:spacing w:after="0"/>
+            </w:pPr>
+            <w:r>
+              <w:rPr>
+                <w:sz w:val="18"/>
+              </w:rPr>
+              <w:t>Consumer failed all retry attempts</w:t>
+            </w:r>
+          </w:p>
+        </w:tc>
+        <w:tc>
+          <w:tcPr>
+            <w:tcW w:type="dxa" w:w="4360"/>
+            <w:tcMar>
+              <w:top w:w="80" w:type="dxa"/>
+              <w:start w:w="120" w:type="dxa"/>
+              <w:bottom w:w="80" w:type="dxa"/>
+              <w:end w:w="120" w:type="dxa"/>
+            </w:tcMar>
+            <w:vAlign w:val="center"/>
+          </w:tcPr>
+          <w:p>
+            <w:pPr>
+              <w:spacing w:after="0"/>
+            </w:pPr>
+            <w:r>
+              <w:rPr>
+                <w:sz w:val="18"/>
+              </w:rPr>
+              <w:t>Inspect service logs and the DLQ record payload</w:t>
+            </w:r>
+          </w:p>
+        </w:tc>
+      </w:tr>
+      <w:tr>
+        <w:tc>
+          <w:tcPr>
+            <w:tcW w:type="dxa" w:w="1900"/>
+            <w:tcMar>
+              <w:top w:w="80" w:type="dxa"/>
+              <w:start w:w="120" w:type="dxa"/>
+              <w:bottom w:w="80" w:type="dxa"/>
+              <w:end w:w="120" w:type="dxa"/>
+            </w:tcMar>
+            <w:vAlign w:val="center"/>
+          </w:tcPr>
+          <w:p>
+            <w:pPr>
+              <w:spacing w:after="0"/>
+            </w:pPr>
+            <w:r>
+              <w:rPr>
+                <w:sz w:val="18"/>
+              </w:rPr>
+              <w:t>Notification missing</w:t>
+            </w:r>
+          </w:p>
+        </w:tc>
+        <w:tc>
+          <w:tcPr>
+            <w:tcW w:type="dxa" w:w="3100"/>
+            <w:tcMar>
+              <w:top w:w="80" w:type="dxa"/>
+              <w:start w:w="120" w:type="dxa"/>
+              <w:bottom w:w="80" w:type="dxa"/>
+              <w:end w:w="120" w:type="dxa"/>
+            </w:tcMar>
+            <w:vAlign w:val="center"/>
+          </w:tcPr>
+          <w:p>
+            <w:pPr>
+              <w:spacing w:after="0"/>
+            </w:pPr>
+            <w:r>
+              <w:rPr>
+                <w:sz w:val="18"/>
+              </w:rPr>
+              <w:t>notification-service is down or has not consumed the event yet</w:t>
+            </w:r>
+          </w:p>
+        </w:tc>
+        <w:tc>
+          <w:tcPr>
+            <w:tcW w:type="dxa" w:w="4360"/>
+            <w:tcMar>
+              <w:top w:w="80" w:type="dxa"/>
+              <w:start w:w="120" w:type="dxa"/>
+              <w:bottom w:w="80" w:type="dxa"/>
+              <w:end w:w="120" w:type="dxa"/>
+            </w:tcMar>
+            <w:vAlign w:val="center"/>
+          </w:tcPr>
+          <w:p>
+            <w:pPr>
+              <w:spacing w:after="0"/>
+            </w:pPr>
+            <w:r>
+              <w:rPr>
+                <w:sz w:val="18"/>
+              </w:rPr>
+              <w:t>Check notification-service logs and relevant Kafka topics</w:t>
+            </w:r>
+          </w:p>
+        </w:tc>
+      </w:tr>
+      <w:tr>
+        <w:tc>
+          <w:tcPr>
+            <w:tcW w:type="dxa" w:w="1900"/>
+            <w:tcMar>
+              <w:top w:w="80" w:type="dxa"/>
+              <w:start w:w="120" w:type="dxa"/>
+              <w:bottom w:w="80" w:type="dxa"/>
+              <w:end w:w="120" w:type="dxa"/>
+            </w:tcMar>
+            <w:vAlign w:val="center"/>
+          </w:tcPr>
+          <w:p>
+            <w:pPr>
+              <w:spacing w:after="0"/>
+            </w:pPr>
+            <w:r>
+              <w:rPr>
+                <w:sz w:val="18"/>
+              </w:rPr>
               <w:t>Cart not cleared after success</w:t>
             </w:r>
           </w:p>
@@ -9163,7 +11557,59 @@
         <w:pStyle w:val="ListBullet"/>
       </w:pPr>
       <w:r>
-        <w:t>Why the outbox pattern will be useful later.</w:t>
+        <w:t xml:space="preserve">Why order-service uses the outbox pattern before publishing </w:t>
+      </w:r>
+      <w:r>
+        <w:rPr>
+          <w:rFonts w:ascii="Courier New" w:hAnsi="Courier New"/>
+          <w:sz w:val="19"/>
+        </w:rPr>
+        <w:t>OrderCreatedEvent</w:t>
+      </w:r>
+      <w:r>
+        <w:t>.</w:t>
+      </w:r>
+    </w:p>
+    <w:p>
+      <w:pPr>
+        <w:pStyle w:val="ListBullet"/>
+      </w:pPr>
+      <w:r>
+        <w:t>Why consumers need retry and DLQ handling.</w:t>
+      </w:r>
+    </w:p>
+    <w:p>
+      <w:pPr>
+        <w:pStyle w:val="ListBullet"/>
+      </w:pPr>
+      <w:r>
+        <w:t>Why Keycloak/JWT is used with role-based access.</w:t>
+      </w:r>
+    </w:p>
+    <w:p>
+      <w:pPr>
+        <w:pStyle w:val="ListBullet"/>
+      </w:pPr>
+      <w:r>
+        <w:t>Why the gateway is useful even though backend services still validate JWTs.</w:t>
+      </w:r>
+    </w:p>
+    <w:p>
+      <w:pPr>
+        <w:pStyle w:val="ListBullet"/>
+      </w:pPr>
+      <w:r>
+        <w:t xml:space="preserve">How </w:t>
+      </w:r>
+      <w:r>
+        <w:rPr>
+          <w:rFonts w:ascii="Courier New" w:hAnsi="Courier New"/>
+          <w:sz w:val="19"/>
+        </w:rPr>
+        <w:t>X-Correlation-Id</w:t>
+      </w:r>
+      <w:r>
+        <w:t xml:space="preserve"> helps trace one flow across REST calls and Kafka events.</w:t>
       </w:r>
     </w:p>
     <w:p>

</xml_diff>

<commit_message>
added Full E2E tests, EMAIl and SMS notification with env config, Prometheus, Grafana, OpenTelemetry Collector configs and Compose wiring. added dockerfiles and CI/CD
</commit_message>
<xml_diff>
--- a/docs/EventCart-QA-Application-Flow.docx
+++ b/docs/EventCart-QA-Application-Flow.docx
@@ -135,7 +135,7 @@
               <w:rPr>
                 <w:sz w:val="19"/>
               </w:rPr>
-              <w:t>Gateway, JWT security, catalog, cart, order, outbox, inventory, payment, notification, DLQ, observability</w:t>
+              <w:t>Gateway, JWT/ownership security, catalog, cart, order/inventory/payment outbox, notification providers, DLQ, observability, deployment</w:t>
             </w:r>
           </w:p>
         </w:tc>
@@ -185,7 +185,7 @@
               <w:rPr>
                 <w:sz w:val="19"/>
               </w:rPr>
-              <w:t>2026-08-02</w:t>
+              <w:t>2026-08-03</w:t>
             </w:r>
           </w:p>
         </w:tc>
@@ -210,7 +210,7 @@
     </w:p>
     <w:p>
       <w:r>
-        <w:t>Last updated: 2026-08-02</w:t>
+        <w:t>Last updated: 2026-08-03</w:t>
       </w:r>
     </w:p>
     <w:p>
@@ -276,7 +276,7 @@
     </w:p>
     <w:p>
       <w:r>
-        <w:t>The current working slice covers API Gateway routing, Keycloak JWT security, product catalog, cart, order placement, outbox publishing, inventory reservation, payment simulation, notification history, Redis idempotency, Kafka retry/DLQ handling, and Kafka-based order status updates.</w:t>
+        <w:t>The current working slice covers API Gateway routing, Keycloak JWT security, customer ownership checks, product catalog, cart, order placement, transactional outbox publishing in order/inventory/payment services, inventory reservation, payment simulation, notification history, optional email/SMS delivery, Redis idempotency, Kafka retry/DLQ handling, observability, Docker/CI/Kubernetes packaging, and Kafka-based order status updates.</w:t>
       </w:r>
     </w:p>
     <w:tbl>
@@ -579,7 +579,7 @@
               <w:rPr>
                 <w:sz w:val="18"/>
               </w:rPr>
-              <w:t>Consume inventory success events, simulate payment, publish payment result events</w:t>
+              <w:t>Consume inventory success events, simulate payment, publish payment result events through outbox</w:t>
             </w:r>
           </w:p>
         </w:tc>
@@ -627,7 +627,7 @@
               <w:rPr>
                 <w:sz w:val="18"/>
               </w:rPr>
-              <w:t>Consume order/payment events and store customer notification history</w:t>
+              <w:t>Consume order/payment events, store customer notification history, optionally deliver email/SMS</w:t>
             </w:r>
           </w:p>
         </w:tc>
@@ -723,7 +723,7 @@
               <w:rPr>
                 <w:sz w:val="18"/>
               </w:rPr>
-              <w:t>Keycloak realm with `ADMIN`, `CUSTOMER`, and `SUPPORT` roles</w:t>
+              <w:t>Keycloak realm with `ADMIN`, `CUSTOMER`, and `SUPPORT` roles plus customer ownership checks</w:t>
             </w:r>
           </w:p>
         </w:tc>
@@ -771,7 +771,7 @@
               <w:rPr>
                 <w:sz w:val="18"/>
               </w:rPr>
-              <w:t>Store order-created events before Kafka publication</w:t>
+              <w:t>Store order, inventory, and payment events before Kafka publication</w:t>
             </w:r>
           </w:p>
         </w:tc>
@@ -916,6 +916,150 @@
                 <w:sz w:val="18"/>
               </w:rPr>
               <w:t>Store order idempotency keys for safe order-placement retries</w:t>
+            </w:r>
+          </w:p>
+        </w:tc>
+      </w:tr>
+      <w:tr>
+        <w:tc>
+          <w:tcPr>
+            <w:tcW w:type="dxa" w:w="2200"/>
+            <w:tcMar>
+              <w:top w:w="80" w:type="dxa"/>
+              <w:start w:w="120" w:type="dxa"/>
+              <w:bottom w:w="80" w:type="dxa"/>
+              <w:end w:w="120" w:type="dxa"/>
+            </w:tcMar>
+            <w:vAlign w:val="center"/>
+          </w:tcPr>
+          <w:p>
+            <w:pPr>
+              <w:spacing w:after="0"/>
+            </w:pPr>
+            <w:r>
+              <w:rPr>
+                <w:sz w:val="18"/>
+              </w:rPr>
+              <w:t>Observability</w:t>
+            </w:r>
+          </w:p>
+        </w:tc>
+        <w:tc>
+          <w:tcPr>
+            <w:tcW w:type="dxa" w:w="7160"/>
+            <w:tcMar>
+              <w:top w:w="80" w:type="dxa"/>
+              <w:start w:w="120" w:type="dxa"/>
+              <w:bottom w:w="80" w:type="dxa"/>
+              <w:end w:w="120" w:type="dxa"/>
+            </w:tcMar>
+            <w:vAlign w:val="center"/>
+          </w:tcPr>
+          <w:p>
+            <w:pPr>
+              <w:spacing w:after="0"/>
+            </w:pPr>
+            <w:r>
+              <w:rPr>
+                <w:sz w:val="18"/>
+              </w:rPr>
+              <w:t>Expose Actuator/Prometheus metrics, OTLP traces, and Grafana dashboard</w:t>
+            </w:r>
+          </w:p>
+        </w:tc>
+      </w:tr>
+      <w:tr>
+        <w:tc>
+          <w:tcPr>
+            <w:tcW w:type="dxa" w:w="2200"/>
+            <w:tcMar>
+              <w:top w:w="80" w:type="dxa"/>
+              <w:start w:w="120" w:type="dxa"/>
+              <w:bottom w:w="80" w:type="dxa"/>
+              <w:end w:w="120" w:type="dxa"/>
+            </w:tcMar>
+            <w:vAlign w:val="center"/>
+          </w:tcPr>
+          <w:p>
+            <w:pPr>
+              <w:spacing w:after="0"/>
+            </w:pPr>
+            <w:r>
+              <w:rPr>
+                <w:sz w:val="18"/>
+              </w:rPr>
+              <w:t>Deployment</w:t>
+            </w:r>
+          </w:p>
+        </w:tc>
+        <w:tc>
+          <w:tcPr>
+            <w:tcW w:type="dxa" w:w="7160"/>
+            <w:tcMar>
+              <w:top w:w="80" w:type="dxa"/>
+              <w:start w:w="120" w:type="dxa"/>
+              <w:bottom w:w="80" w:type="dxa"/>
+              <w:end w:w="120" w:type="dxa"/>
+            </w:tcMar>
+            <w:vAlign w:val="center"/>
+          </w:tcPr>
+          <w:p>
+            <w:pPr>
+              <w:spacing w:after="0"/>
+            </w:pPr>
+            <w:r>
+              <w:rPr>
+                <w:sz w:val="18"/>
+              </w:rPr>
+              <w:t>Dockerfiles, GitHub Actions workflow, Kubernetes manifests, and secret templates</w:t>
+            </w:r>
+          </w:p>
+        </w:tc>
+      </w:tr>
+      <w:tr>
+        <w:tc>
+          <w:tcPr>
+            <w:tcW w:type="dxa" w:w="2200"/>
+            <w:tcMar>
+              <w:top w:w="80" w:type="dxa"/>
+              <w:start w:w="120" w:type="dxa"/>
+              <w:bottom w:w="80" w:type="dxa"/>
+              <w:end w:w="120" w:type="dxa"/>
+            </w:tcMar>
+            <w:vAlign w:val="center"/>
+          </w:tcPr>
+          <w:p>
+            <w:pPr>
+              <w:spacing w:after="0"/>
+            </w:pPr>
+            <w:r>
+              <w:rPr>
+                <w:sz w:val="18"/>
+              </w:rPr>
+              <w:t>E2E tests</w:t>
+            </w:r>
+          </w:p>
+        </w:tc>
+        <w:tc>
+          <w:tcPr>
+            <w:tcW w:type="dxa" w:w="7160"/>
+            <w:tcMar>
+              <w:top w:w="80" w:type="dxa"/>
+              <w:start w:w="120" w:type="dxa"/>
+              <w:bottom w:w="80" w:type="dxa"/>
+              <w:end w:w="120" w:type="dxa"/>
+            </w:tcMar>
+            <w:vAlign w:val="center"/>
+          </w:tcPr>
+          <w:p>
+            <w:pPr>
+              <w:spacing w:after="0"/>
+            </w:pPr>
+            <w:r>
+              <w:rPr>
+                <w:sz w:val="18"/>
+              </w:rPr>
+              <w:t>Docker-backed test launches service jars and verifies order-to-notification flow</w:t>
             </w:r>
           </w:p>
         </w:tc>
@@ -2133,6 +2277,288 @@
           </w:p>
         </w:tc>
       </w:tr>
+      <w:tr>
+        <w:tc>
+          <w:tcPr>
+            <w:tcW w:type="dxa" w:w="1800"/>
+            <w:tcMar>
+              <w:top w:w="80" w:type="dxa"/>
+              <w:start w:w="120" w:type="dxa"/>
+              <w:bottom w:w="80" w:type="dxa"/>
+              <w:end w:w="120" w:type="dxa"/>
+            </w:tcMar>
+            <w:vAlign w:val="center"/>
+          </w:tcPr>
+          <w:p>
+            <w:pPr>
+              <w:spacing w:after="0"/>
+            </w:pPr>
+            <w:r>
+              <w:rPr>
+                <w:sz w:val="18"/>
+              </w:rPr>
+              <w:t>Prometheus</w:t>
+            </w:r>
+          </w:p>
+        </w:tc>
+        <w:tc>
+          <w:tcPr>
+            <w:tcW w:type="dxa" w:w="2100"/>
+            <w:tcMar>
+              <w:top w:w="80" w:type="dxa"/>
+              <w:start w:w="120" w:type="dxa"/>
+              <w:bottom w:w="80" w:type="dxa"/>
+              <w:end w:w="120" w:type="dxa"/>
+            </w:tcMar>
+            <w:vAlign w:val="center"/>
+          </w:tcPr>
+          <w:p>
+            <w:pPr>
+              <w:spacing w:after="0"/>
+            </w:pPr>
+            <w:r>
+              <w:rPr>
+                <w:sz w:val="18"/>
+              </w:rPr>
+              <w:t>9090</w:t>
+            </w:r>
+          </w:p>
+        </w:tc>
+        <w:tc>
+          <w:tcPr>
+            <w:tcW w:type="dxa" w:w="2300"/>
+            <w:tcMar>
+              <w:top w:w="80" w:type="dxa"/>
+              <w:start w:w="120" w:type="dxa"/>
+              <w:bottom w:w="80" w:type="dxa"/>
+              <w:end w:w="120" w:type="dxa"/>
+            </w:tcMar>
+            <w:vAlign w:val="center"/>
+          </w:tcPr>
+          <w:p>
+            <w:pPr>
+              <w:spacing w:after="0"/>
+            </w:pPr>
+            <w:r>
+              <w:rPr>
+                <w:sz w:val="18"/>
+              </w:rPr>
+              <w:t>Metrics scraping and query UI</w:t>
+            </w:r>
+          </w:p>
+        </w:tc>
+        <w:tc>
+          <w:tcPr>
+            <w:tcW w:type="dxa" w:w="3160"/>
+            <w:tcMar>
+              <w:top w:w="80" w:type="dxa"/>
+              <w:start w:w="120" w:type="dxa"/>
+              <w:bottom w:w="80" w:type="dxa"/>
+              <w:end w:w="120" w:type="dxa"/>
+            </w:tcMar>
+            <w:vAlign w:val="center"/>
+          </w:tcPr>
+          <w:p>
+            <w:pPr>
+              <w:spacing w:after="0"/>
+            </w:pPr>
+            <w:r>
+              <w:rPr>
+                <w:sz w:val="18"/>
+              </w:rPr>
+              <w:t>Docker container `eventcart-prometheus`</w:t>
+            </w:r>
+          </w:p>
+        </w:tc>
+      </w:tr>
+      <w:tr>
+        <w:tc>
+          <w:tcPr>
+            <w:tcW w:type="dxa" w:w="1800"/>
+            <w:tcMar>
+              <w:top w:w="80" w:type="dxa"/>
+              <w:start w:w="120" w:type="dxa"/>
+              <w:bottom w:w="80" w:type="dxa"/>
+              <w:end w:w="120" w:type="dxa"/>
+            </w:tcMar>
+            <w:vAlign w:val="center"/>
+          </w:tcPr>
+          <w:p>
+            <w:pPr>
+              <w:spacing w:after="0"/>
+            </w:pPr>
+            <w:r>
+              <w:rPr>
+                <w:sz w:val="18"/>
+              </w:rPr>
+              <w:t>Grafana</w:t>
+            </w:r>
+          </w:p>
+        </w:tc>
+        <w:tc>
+          <w:tcPr>
+            <w:tcW w:type="dxa" w:w="2100"/>
+            <w:tcMar>
+              <w:top w:w="80" w:type="dxa"/>
+              <w:start w:w="120" w:type="dxa"/>
+              <w:bottom w:w="80" w:type="dxa"/>
+              <w:end w:w="120" w:type="dxa"/>
+            </w:tcMar>
+            <w:vAlign w:val="center"/>
+          </w:tcPr>
+          <w:p>
+            <w:pPr>
+              <w:spacing w:after="0"/>
+            </w:pPr>
+            <w:r>
+              <w:rPr>
+                <w:sz w:val="18"/>
+              </w:rPr>
+              <w:t>3000</w:t>
+            </w:r>
+          </w:p>
+        </w:tc>
+        <w:tc>
+          <w:tcPr>
+            <w:tcW w:type="dxa" w:w="2300"/>
+            <w:tcMar>
+              <w:top w:w="80" w:type="dxa"/>
+              <w:start w:w="120" w:type="dxa"/>
+              <w:bottom w:w="80" w:type="dxa"/>
+              <w:end w:w="120" w:type="dxa"/>
+            </w:tcMar>
+            <w:vAlign w:val="center"/>
+          </w:tcPr>
+          <w:p>
+            <w:pPr>
+              <w:spacing w:after="0"/>
+            </w:pPr>
+            <w:r>
+              <w:rPr>
+                <w:sz w:val="18"/>
+              </w:rPr>
+              <w:t>Metrics dashboard UI</w:t>
+            </w:r>
+          </w:p>
+        </w:tc>
+        <w:tc>
+          <w:tcPr>
+            <w:tcW w:type="dxa" w:w="3160"/>
+            <w:tcMar>
+              <w:top w:w="80" w:type="dxa"/>
+              <w:start w:w="120" w:type="dxa"/>
+              <w:bottom w:w="80" w:type="dxa"/>
+              <w:end w:w="120" w:type="dxa"/>
+            </w:tcMar>
+            <w:vAlign w:val="center"/>
+          </w:tcPr>
+          <w:p>
+            <w:pPr>
+              <w:spacing w:after="0"/>
+            </w:pPr>
+            <w:r>
+              <w:rPr>
+                <w:sz w:val="18"/>
+              </w:rPr>
+              <w:t>Docker container `eventcart-grafana`</w:t>
+            </w:r>
+          </w:p>
+        </w:tc>
+      </w:tr>
+      <w:tr>
+        <w:tc>
+          <w:tcPr>
+            <w:tcW w:type="dxa" w:w="1800"/>
+            <w:tcMar>
+              <w:top w:w="80" w:type="dxa"/>
+              <w:start w:w="120" w:type="dxa"/>
+              <w:bottom w:w="80" w:type="dxa"/>
+              <w:end w:w="120" w:type="dxa"/>
+            </w:tcMar>
+            <w:vAlign w:val="center"/>
+          </w:tcPr>
+          <w:p>
+            <w:pPr>
+              <w:spacing w:after="0"/>
+            </w:pPr>
+            <w:r>
+              <w:rPr>
+                <w:sz w:val="18"/>
+              </w:rPr>
+              <w:t>OpenTelemetry Collector</w:t>
+            </w:r>
+          </w:p>
+        </w:tc>
+        <w:tc>
+          <w:tcPr>
+            <w:tcW w:type="dxa" w:w="2100"/>
+            <w:tcMar>
+              <w:top w:w="80" w:type="dxa"/>
+              <w:start w:w="120" w:type="dxa"/>
+              <w:bottom w:w="80" w:type="dxa"/>
+              <w:end w:w="120" w:type="dxa"/>
+            </w:tcMar>
+            <w:vAlign w:val="center"/>
+          </w:tcPr>
+          <w:p>
+            <w:pPr>
+              <w:spacing w:after="0"/>
+            </w:pPr>
+            <w:r>
+              <w:rPr>
+                <w:sz w:val="18"/>
+              </w:rPr>
+              <w:t>4317/4318</w:t>
+            </w:r>
+          </w:p>
+        </w:tc>
+        <w:tc>
+          <w:tcPr>
+            <w:tcW w:type="dxa" w:w="2300"/>
+            <w:tcMar>
+              <w:top w:w="80" w:type="dxa"/>
+              <w:start w:w="120" w:type="dxa"/>
+              <w:bottom w:w="80" w:type="dxa"/>
+              <w:end w:w="120" w:type="dxa"/>
+            </w:tcMar>
+            <w:vAlign w:val="center"/>
+          </w:tcPr>
+          <w:p>
+            <w:pPr>
+              <w:spacing w:after="0"/>
+            </w:pPr>
+            <w:r>
+              <w:rPr>
+                <w:sz w:val="18"/>
+              </w:rPr>
+              <w:t>Trace/metric collector endpoint</w:t>
+            </w:r>
+          </w:p>
+        </w:tc>
+        <w:tc>
+          <w:tcPr>
+            <w:tcW w:type="dxa" w:w="3160"/>
+            <w:tcMar>
+              <w:top w:w="80" w:type="dxa"/>
+              <w:start w:w="120" w:type="dxa"/>
+              <w:bottom w:w="80" w:type="dxa"/>
+              <w:end w:w="120" w:type="dxa"/>
+            </w:tcMar>
+            <w:vAlign w:val="center"/>
+          </w:tcPr>
+          <w:p>
+            <w:pPr>
+              <w:spacing w:after="0"/>
+            </w:pPr>
+            <w:r>
+              <w:rPr>
+                <w:sz w:val="18"/>
+              </w:rPr>
+              <w:t>Docker container `eventcart-otel-collector`</w:t>
+            </w:r>
+          </w:p>
+        </w:tc>
+      </w:tr>
     </w:tbl>
     <w:p>
       <w:pPr>
@@ -2354,7 +2780,7 @@
           <w:rFonts w:ascii="Courier New" w:hAnsi="Courier New"/>
           <w:sz w:val="17"/>
         </w:rPr>
-        <w:t xml:space="preserve">    K --&gt; M["inventory-service publishes InventoryReservedEvent"]</w:t>
+        <w:t xml:space="preserve">    K --&gt; M1["inventory-service stores InventoryReservedEvent in outbox"]</w:t>
       </w:r>
     </w:p>
     <w:p>
@@ -2368,7 +2794,35 @@
           <w:rFonts w:ascii="Courier New" w:hAnsi="Courier New"/>
           <w:sz w:val="17"/>
         </w:rPr>
-        <w:t xml:space="preserve">    L --&gt; N["inventory-service publishes InventoryReservationFailedEvent"]</w:t>
+        <w:t xml:space="preserve">    L --&gt; N1["inventory-service stores InventoryReservationFailedEvent in outbox"]</w:t>
+      </w:r>
+    </w:p>
+    <w:p>
+      <w:pPr>
+        <w:spacing w:before="0" w:after="0"/>
+        <w:ind w:left="216"/>
+        <w:shd w:fill="F4F6F9"/>
+      </w:pPr>
+      <w:r>
+        <w:rPr>
+          <w:rFonts w:ascii="Courier New" w:hAnsi="Courier New"/>
+          <w:sz w:val="17"/>
+        </w:rPr>
+        <w:t xml:space="preserve">    M1 --&gt; M["inventory-service outbox publisher sends InventoryReservedEvent"]</w:t>
+      </w:r>
+    </w:p>
+    <w:p>
+      <w:pPr>
+        <w:spacing w:before="0" w:after="0"/>
+        <w:ind w:left="216"/>
+        <w:shd w:fill="F4F6F9"/>
+      </w:pPr>
+      <w:r>
+        <w:rPr>
+          <w:rFonts w:ascii="Courier New" w:hAnsi="Courier New"/>
+          <w:sz w:val="17"/>
+        </w:rPr>
+        <w:t xml:space="preserve">    N1 --&gt; N["inventory-service outbox publisher sends InventoryReservationFailedEvent"]</w:t>
       </w:r>
     </w:p>
     <w:p>
@@ -2438,7 +2892,7 @@
           <w:rFonts w:ascii="Courier New" w:hAnsi="Courier New"/>
           <w:sz w:val="17"/>
         </w:rPr>
-        <w:t xml:space="preserve">    S --&gt;|Yes| T["payment-service publishes PaymentCompletedEvent"]</w:t>
+        <w:t xml:space="preserve">    S --&gt;|Yes| T1["payment-service stores PaymentCompletedEvent in outbox"]</w:t>
       </w:r>
     </w:p>
     <w:p>
@@ -2452,7 +2906,35 @@
           <w:rFonts w:ascii="Courier New" w:hAnsi="Courier New"/>
           <w:sz w:val="17"/>
         </w:rPr>
-        <w:t xml:space="preserve">    S --&gt;|No| U["payment-service publishes PaymentFailedEvent"]</w:t>
+        <w:t xml:space="preserve">    S --&gt;|No| U1["payment-service stores PaymentFailedEvent in outbox"]</w:t>
+      </w:r>
+    </w:p>
+    <w:p>
+      <w:pPr>
+        <w:spacing w:before="0" w:after="0"/>
+        <w:ind w:left="216"/>
+        <w:shd w:fill="F4F6F9"/>
+      </w:pPr>
+      <w:r>
+        <w:rPr>
+          <w:rFonts w:ascii="Courier New" w:hAnsi="Courier New"/>
+          <w:sz w:val="17"/>
+        </w:rPr>
+        <w:t xml:space="preserve">    T1 --&gt; T["payment-service outbox publisher sends PaymentCompletedEvent"]</w:t>
+      </w:r>
+    </w:p>
+    <w:p>
+      <w:pPr>
+        <w:spacing w:before="0" w:after="0"/>
+        <w:ind w:left="216"/>
+        <w:shd w:fill="F4F6F9"/>
+      </w:pPr>
+      <w:r>
+        <w:rPr>
+          <w:rFonts w:ascii="Courier New" w:hAnsi="Courier New"/>
+          <w:sz w:val="17"/>
+        </w:rPr>
+        <w:t xml:space="preserve">    U1 --&gt; U["payment-service outbox publisher sends PaymentFailedEvent"]</w:t>
       </w:r>
     </w:p>
     <w:p>
@@ -2630,6 +3112,11 @@
     </w:p>
     <w:p>
       <w:r>
+        <w:t>This starts MongoDB, Kafka, Redis, Keycloak, OpenTelemetry Collector, Prometheus, and Grafana.</w:t>
+      </w:r>
+    </w:p>
+    <w:p>
+      <w:r>
         <w:t>Verify containers:</w:t>
       </w:r>
     </w:p>
@@ -2654,6 +3141,58 @@
     </w:p>
     <w:p>
       <w:r>
+        <w:t>Optional observability checks:</w:t>
+      </w:r>
+    </w:p>
+    <w:p>
+      <w:pPr>
+        <w:spacing w:before="0" w:after="0"/>
+        <w:ind w:left="216"/>
+        <w:shd w:fill="F4F6F9"/>
+      </w:pPr>
+      <w:r>
+        <w:rPr>
+          <w:rFonts w:ascii="Courier New" w:hAnsi="Courier New"/>
+          <w:sz w:val="17"/>
+        </w:rPr>
+        <w:t>Prometheus: http://localhost:9090</w:t>
+      </w:r>
+    </w:p>
+    <w:p>
+      <w:pPr>
+        <w:spacing w:before="0" w:after="0"/>
+        <w:ind w:left="216"/>
+        <w:shd w:fill="F4F6F9"/>
+      </w:pPr>
+      <w:r>
+        <w:rPr>
+          <w:rFonts w:ascii="Courier New" w:hAnsi="Courier New"/>
+          <w:sz w:val="17"/>
+        </w:rPr>
+        <w:t>Grafana: http://localhost:3000</w:t>
+      </w:r>
+    </w:p>
+    <w:p>
+      <w:pPr>
+        <w:spacing w:before="0" w:after="0"/>
+        <w:ind w:left="216"/>
+        <w:shd w:fill="F4F6F9"/>
+      </w:pPr>
+      <w:r>
+        <w:rPr>
+          <w:rFonts w:ascii="Courier New" w:hAnsi="Courier New"/>
+          <w:sz w:val="17"/>
+        </w:rPr>
+        <w:t>OTLP HTTP endpoint: http://localhost:4318</w:t>
+      </w:r>
+    </w:p>
+    <w:p>
+      <w:pPr>
+        <w:spacing w:after="80"/>
+      </w:pPr>
+    </w:p>
+    <w:p>
+      <w:r>
         <w:t>Start services in separate terminals, in this order:</w:t>
       </w:r>
     </w:p>
@@ -2766,6 +3305,35 @@
       </w:r>
     </w:p>
     <w:p>
+      <w:r>
+        <w:t>For an automated platform smoke test with Docker-backed MongoDB, Kafka, and Redis:</w:t>
+      </w:r>
+    </w:p>
+    <w:p>
+      <w:pPr>
+        <w:spacing w:before="0" w:after="0"/>
+        <w:ind w:left="216"/>
+        <w:shd w:fill="F4F6F9"/>
+      </w:pPr>
+      <w:r>
+        <w:rPr>
+          <w:rFonts w:ascii="Courier New" w:hAnsi="Courier New"/>
+          <w:sz w:val="17"/>
+        </w:rPr>
+        <w:t>.\mvnw.cmd -P integration-tests -pl e2e-tests -am verify</w:t>
+      </w:r>
+    </w:p>
+    <w:p>
+      <w:pPr>
+        <w:spacing w:after="80"/>
+      </w:pPr>
+    </w:p>
+    <w:p>
+      <w:r>
+        <w:t>This launches the service jars and verifies product creation, inventory seed, cart add, order placement, inventory reservation, payment completion, final order status, and notifications.</w:t>
+      </w:r>
+    </w:p>
+    <w:p>
       <w:pPr>
         <w:pStyle w:val="Heading1"/>
       </w:pPr>
@@ -2985,6 +3553,31 @@
       <w:pPr>
         <w:spacing w:after="80"/>
       </w:pPr>
+    </w:p>
+    <w:p>
+      <w:r>
+        <w:t xml:space="preserve">The local </w:t>
+      </w:r>
+      <w:r>
+        <w:rPr>
+          <w:rFonts w:ascii="Courier New" w:hAnsi="Courier New"/>
+          <w:sz w:val="19"/>
+        </w:rPr>
+        <w:t>customer-user</w:t>
+      </w:r>
+      <w:r>
+        <w:t xml:space="preserve"> token contains </w:t>
+      </w:r>
+      <w:r>
+        <w:rPr>
+          <w:rFonts w:ascii="Courier New" w:hAnsi="Courier New"/>
+          <w:sz w:val="19"/>
+        </w:rPr>
+        <w:t>customer_id=customer-1</w:t>
+      </w:r>
+      <w:r>
+        <w:t>. Customer APIs reject requests for a different customer ID unless the caller has an admin/support role.</w:t>
+      </w:r>
     </w:p>
     <w:p>
       <w:r>
@@ -3809,7 +4402,7 @@
           <w:rFonts w:ascii="Courier New" w:hAnsi="Courier New"/>
           <w:sz w:val="19"/>
         </w:rPr>
-        <w:t>data.productId</w:t>
+        <w:t>data.id</w:t>
       </w:r>
       <w:r>
         <w:t>.</w:t>
@@ -4906,6 +5499,14 @@
         <w:pStyle w:val="ListBullet"/>
       </w:pPr>
       <w:r>
+        <w:t>order-service forwards the customer JWT to cart-service while reading the cart.</w:t>
+      </w:r>
+    </w:p>
+    <w:p>
+      <w:pPr>
+        <w:pStyle w:val="ListBullet"/>
+      </w:pPr>
+      <w:r>
         <w:t>The initial order API response can return before inventory processing completes.</w:t>
       </w:r>
     </w:p>
@@ -5065,6 +5666,41 @@
     </w:p>
     <w:p>
       <w:r>
+        <w:t xml:space="preserve">Expected outbox result: an </w:t>
+      </w:r>
+      <w:r>
+        <w:rPr>
+          <w:rFonts w:ascii="Courier New" w:hAnsi="Courier New"/>
+          <w:sz w:val="19"/>
+        </w:rPr>
+        <w:t>ORDER</w:t>
+      </w:r>
+      <w:r>
+        <w:t xml:space="preserve"> aggregate record exists. Its </w:t>
+      </w:r>
+      <w:r>
+        <w:rPr>
+          <w:rFonts w:ascii="Courier New" w:hAnsi="Courier New"/>
+          <w:sz w:val="19"/>
+        </w:rPr>
+        <w:t>status</w:t>
+      </w:r>
+      <w:r>
+        <w:t xml:space="preserve"> should become </w:t>
+      </w:r>
+      <w:r>
+        <w:rPr>
+          <w:rFonts w:ascii="Courier New" w:hAnsi="Courier New"/>
+          <w:sz w:val="19"/>
+        </w:rPr>
+        <w:t>PUBLISHED</w:t>
+      </w:r>
+      <w:r>
+        <w:t xml:space="preserve"> after the scheduler publishes it to Kafka.</w:t>
+      </w:r>
+    </w:p>
+    <w:p>
+      <w:r>
         <w:t>Verify Redis idempotency key:</w:t>
       </w:r>
     </w:p>
@@ -5343,6 +5979,79 @@
       </w:r>
     </w:p>
     <w:p>
+      <w:r>
+        <w:t>Verify inventory outbox:</w:t>
+      </w:r>
+    </w:p>
+    <w:p>
+      <w:pPr>
+        <w:spacing w:before="0" w:after="0"/>
+        <w:ind w:left="216"/>
+        <w:shd w:fill="F4F6F9"/>
+      </w:pPr>
+      <w:r>
+        <w:rPr>
+          <w:rFonts w:ascii="Courier New" w:hAnsi="Courier New"/>
+          <w:sz w:val="17"/>
+        </w:rPr>
+        <w:t>use eventcart_inventory</w:t>
+      </w:r>
+    </w:p>
+    <w:p>
+      <w:pPr>
+        <w:spacing w:before="0" w:after="0"/>
+        <w:ind w:left="216"/>
+        <w:shd w:fill="F4F6F9"/>
+      </w:pPr>
+      <w:r>
+        <w:rPr>
+          <w:rFonts w:ascii="Courier New" w:hAnsi="Courier New"/>
+          <w:sz w:val="17"/>
+        </w:rPr>
+        <w:t>db.outbox_events.find({ aggregateId: "&lt;order-id&gt;" }).pretty()</w:t>
+      </w:r>
+    </w:p>
+    <w:p>
+      <w:pPr>
+        <w:spacing w:after="80"/>
+      </w:pPr>
+    </w:p>
+    <w:p>
+      <w:r>
+        <w:t xml:space="preserve">Expected outbox result: an </w:t>
+      </w:r>
+      <w:r>
+        <w:rPr>
+          <w:rFonts w:ascii="Courier New" w:hAnsi="Courier New"/>
+          <w:sz w:val="19"/>
+        </w:rPr>
+        <w:t>INVENTORY</w:t>
+      </w:r>
+      <w:r>
+        <w:t xml:space="preserve"> aggregate record exists for either the reserved or failed event, and its </w:t>
+      </w:r>
+      <w:r>
+        <w:rPr>
+          <w:rFonts w:ascii="Courier New" w:hAnsi="Courier New"/>
+          <w:sz w:val="19"/>
+        </w:rPr>
+        <w:t>status</w:t>
+      </w:r>
+      <w:r>
+        <w:t xml:space="preserve"> should become </w:t>
+      </w:r>
+      <w:r>
+        <w:rPr>
+          <w:rFonts w:ascii="Courier New" w:hAnsi="Courier New"/>
+          <w:sz w:val="19"/>
+        </w:rPr>
+        <w:t>PUBLISHED</w:t>
+      </w:r>
+      <w:r>
+        <w:t>.</w:t>
+      </w:r>
+    </w:p>
+    <w:p>
       <w:pPr>
         <w:pStyle w:val="Heading2"/>
       </w:pPr>
@@ -5637,8 +6346,57 @@
     </w:p>
     <w:p>
       <w:pPr>
+        <w:spacing w:before="0" w:after="0"/>
+        <w:ind w:left="216"/>
+        <w:shd w:fill="F4F6F9"/>
+      </w:pPr>
+      <w:r>
+        <w:rPr>
+          <w:rFonts w:ascii="Courier New" w:hAnsi="Courier New"/>
+          <w:sz w:val="17"/>
+        </w:rPr>
+        <w:t>db.outbox_events.find({ aggregateId: "&lt;order-id&gt;" }).pretty()</w:t>
+      </w:r>
+    </w:p>
+    <w:p>
+      <w:pPr>
         <w:spacing w:after="80"/>
       </w:pPr>
+    </w:p>
+    <w:p>
+      <w:r>
+        <w:t xml:space="preserve">Expected outbox result: a </w:t>
+      </w:r>
+      <w:r>
+        <w:rPr>
+          <w:rFonts w:ascii="Courier New" w:hAnsi="Courier New"/>
+          <w:sz w:val="19"/>
+        </w:rPr>
+        <w:t>PAYMENT</w:t>
+      </w:r>
+      <w:r>
+        <w:t xml:space="preserve"> aggregate record exists for the completed or failed event, and its </w:t>
+      </w:r>
+      <w:r>
+        <w:rPr>
+          <w:rFonts w:ascii="Courier New" w:hAnsi="Courier New"/>
+          <w:sz w:val="19"/>
+        </w:rPr>
+        <w:t>status</w:t>
+      </w:r>
+      <w:r>
+        <w:t xml:space="preserve"> should become </w:t>
+      </w:r>
+      <w:r>
+        <w:rPr>
+          <w:rFonts w:ascii="Courier New" w:hAnsi="Courier New"/>
+          <w:sz w:val="19"/>
+        </w:rPr>
+        <w:t>PUBLISHED</w:t>
+      </w:r>
+      <w:r>
+        <w:t>.</w:t>
+      </w:r>
     </w:p>
     <w:p>
       <w:r>
@@ -6202,7 +6960,7 @@
     </w:p>
     <w:p>
       <w:r>
-        <w:t>notification-service creates in-app notifications asynchronously from Kafka events.</w:t>
+        <w:t>notification-service creates persisted notifications asynchronously from Kafka events. If email or SMS providers are enabled, it attempts delivery after saving the notification record.</w:t>
       </w:r>
     </w:p>
     <w:p>
@@ -6357,6 +7115,135 @@
       <w:pPr>
         <w:spacing w:after="80"/>
       </w:pPr>
+    </w:p>
+    <w:p>
+      <w:r>
+        <w:t>Optional provider configuration:</w:t>
+      </w:r>
+    </w:p>
+    <w:p>
+      <w:pPr>
+        <w:spacing w:before="0" w:after="0"/>
+        <w:ind w:left="216"/>
+        <w:shd w:fill="F4F6F9"/>
+      </w:pPr>
+      <w:r>
+        <w:rPr>
+          <w:rFonts w:ascii="Courier New" w:hAnsi="Courier New"/>
+          <w:sz w:val="17"/>
+        </w:rPr>
+        <w:t>$env:SPRING_MAIL_HOST = "smtp.example.com"</w:t>
+      </w:r>
+    </w:p>
+    <w:p>
+      <w:pPr>
+        <w:spacing w:before="0" w:after="0"/>
+        <w:ind w:left="216"/>
+        <w:shd w:fill="F4F6F9"/>
+      </w:pPr>
+      <w:r>
+        <w:rPr>
+          <w:rFonts w:ascii="Courier New" w:hAnsi="Courier New"/>
+          <w:sz w:val="17"/>
+        </w:rPr>
+        <w:t>$env:SPRING_MAIL_USERNAME = "smtp-user"</w:t>
+      </w:r>
+    </w:p>
+    <w:p>
+      <w:pPr>
+        <w:spacing w:before="0" w:after="0"/>
+        <w:ind w:left="216"/>
+        <w:shd w:fill="F4F6F9"/>
+      </w:pPr>
+      <w:r>
+        <w:rPr>
+          <w:rFonts w:ascii="Courier New" w:hAnsi="Courier New"/>
+          <w:sz w:val="17"/>
+        </w:rPr>
+        <w:t>$env:SPRING_MAIL_PASSWORD = "smtp-password"</w:t>
+      </w:r>
+    </w:p>
+    <w:p>
+      <w:pPr>
+        <w:spacing w:before="0" w:after="0"/>
+        <w:ind w:left="216"/>
+        <w:shd w:fill="F4F6F9"/>
+      </w:pPr>
+      <w:r>
+        <w:rPr>
+          <w:rFonts w:ascii="Courier New" w:hAnsi="Courier New"/>
+          <w:sz w:val="17"/>
+        </w:rPr>
+        <w:t>$env:TWILIO_ACCOUNT_SID = "replace-me"</w:t>
+      </w:r>
+    </w:p>
+    <w:p>
+      <w:pPr>
+        <w:spacing w:before="0" w:after="0"/>
+        <w:ind w:left="216"/>
+        <w:shd w:fill="F4F6F9"/>
+      </w:pPr>
+      <w:r>
+        <w:rPr>
+          <w:rFonts w:ascii="Courier New" w:hAnsi="Courier New"/>
+          <w:sz w:val="17"/>
+        </w:rPr>
+        <w:t>$env:TWILIO_AUTH_TOKEN = "replace-me"</w:t>
+      </w:r>
+    </w:p>
+    <w:p>
+      <w:pPr>
+        <w:spacing w:before="0" w:after="0"/>
+        <w:ind w:left="216"/>
+        <w:shd w:fill="F4F6F9"/>
+      </w:pPr>
+      <w:r>
+        <w:rPr>
+          <w:rFonts w:ascii="Courier New" w:hAnsi="Courier New"/>
+          <w:sz w:val="17"/>
+        </w:rPr>
+        <w:t>$env:TWILIO_FROM_NUMBER = "+15555550100"</w:t>
+      </w:r>
+    </w:p>
+    <w:p>
+      <w:pPr>
+        <w:spacing w:after="80"/>
+      </w:pPr>
+    </w:p>
+    <w:p>
+      <w:r>
+        <w:t xml:space="preserve">Then enable </w:t>
+      </w:r>
+      <w:r>
+        <w:rPr>
+          <w:rFonts w:ascii="Courier New" w:hAnsi="Courier New"/>
+          <w:sz w:val="19"/>
+        </w:rPr>
+        <w:t>eventcart.notifications.email.enabled</w:t>
+      </w:r>
+      <w:r>
+        <w:t xml:space="preserve"> or </w:t>
+      </w:r>
+      <w:r>
+        <w:rPr>
+          <w:rFonts w:ascii="Courier New" w:hAnsi="Courier New"/>
+          <w:sz w:val="19"/>
+        </w:rPr>
+        <w:t>eventcart.notifications.sms.enabled</w:t>
+      </w:r>
+      <w:r>
+        <w:t xml:space="preserve"> in notification-service configuration and make sure the customer has contact details under </w:t>
+      </w:r>
+      <w:r>
+        <w:rPr>
+          <w:rFonts w:ascii="Courier New" w:hAnsi="Courier New"/>
+          <w:sz w:val="19"/>
+        </w:rPr>
+        <w:t>eventcart.notifications.contacts</w:t>
+      </w:r>
+      <w:r>
+        <w:t>.</w:t>
+      </w:r>
     </w:p>
     <w:p>
       <w:r>
@@ -8242,7 +9129,7 @@
               <w:rPr>
                 <w:sz w:val="18"/>
               </w:rPr>
-              <w:t>`Placing order`, `Order saved`, `Publishing OrderCreated event`</w:t>
+              <w:t>`Placing order`, `Order saved`, `OrderCreated event stored in outbox`</w:t>
             </w:r>
           </w:p>
         </w:tc>
@@ -8455,7 +9342,7 @@
               <w:rPr>
                 <w:sz w:val="18"/>
               </w:rPr>
-              <w:t>`Consumed OrderCreated event`, `Reserving inventory`, `Inventory reserved`</w:t>
+              <w:t>`Consumed OrderCreated event`, `Reserving inventory`, `Inventory reserved`, `Inventory event stored in outbox`</w:t>
             </w:r>
           </w:p>
         </w:tc>
@@ -8526,7 +9413,7 @@
               <w:rPr>
                 <w:sz w:val="18"/>
               </w:rPr>
-              <w:t>`Reservation stock check failed`, `Inventory reservation failed`</w:t>
+              <w:t>`Reservation stock check failed`, `Inventory reservation failed`, `Inventory outbox event published`</w:t>
             </w:r>
           </w:p>
         </w:tc>
@@ -8739,7 +9626,7 @@
               <w:rPr>
                 <w:sz w:val="18"/>
               </w:rPr>
-              <w:t>`Consumed InventoryReserved event`, `Processing payment`, `Payment completed`, `Payment failed`</w:t>
+              <w:t>`Consumed InventoryReserved event`, `Processing payment`, `Payment completed`, `Payment failed`, `Payment event stored in outbox`</w:t>
             </w:r>
           </w:p>
         </w:tc>
@@ -8952,7 +9839,7 @@
               <w:rPr>
                 <w:sz w:val="18"/>
               </w:rPr>
-              <w:t>`Consumed OrderCreated event for notification`, `Notification stored`, `Notification marked read`</w:t>
+              <w:t>`Consumed OrderCreated event for notification`, `Notification stored`, `Email notification sent`, `SMS notification sent`, `Notification marked read`</w:t>
             </w:r>
           </w:p>
         </w:tc>
@@ -9212,7 +10099,7 @@
               <w:rPr>
                 <w:sz w:val="18"/>
               </w:rPr>
-              <w:t>MongoDB, Kafka, Redis, and Keycloak are healthy</w:t>
+              <w:t>MongoDB, Kafka, Redis, Keycloak, OpenTelemetry Collector, Prometheus, and Grafana are healthy</w:t>
             </w:r>
           </w:p>
         </w:tc>
@@ -9573,7 +10460,7 @@
               <w:rPr>
                 <w:sz w:val="18"/>
               </w:rPr>
-              <w:t>Outbox event stored</w:t>
+              <w:t>Order outbox event stored</w:t>
             </w:r>
           </w:p>
         </w:tc>
@@ -9717,6 +10604,54 @@
               <w:rPr>
                 <w:sz w:val="18"/>
               </w:rPr>
+              <w:t>Inventory outbox event stored</w:t>
+            </w:r>
+          </w:p>
+        </w:tc>
+        <w:tc>
+          <w:tcPr>
+            <w:tcW w:type="dxa" w:w="7160"/>
+            <w:tcMar>
+              <w:top w:w="80" w:type="dxa"/>
+              <w:start w:w="120" w:type="dxa"/>
+              <w:bottom w:w="80" w:type="dxa"/>
+              <w:end w:w="120" w:type="dxa"/>
+            </w:tcMar>
+            <w:vAlign w:val="center"/>
+          </w:tcPr>
+          <w:p>
+            <w:pPr>
+              <w:spacing w:after="0"/>
+            </w:pPr>
+            <w:r>
+              <w:rPr>
+                <w:sz w:val="18"/>
+              </w:rPr>
+              <w:t>`eventcart_inventory.outbox_events` contains the reservation result event</w:t>
+            </w:r>
+          </w:p>
+        </w:tc>
+      </w:tr>
+      <w:tr>
+        <w:tc>
+          <w:tcPr>
+            <w:tcW w:type="dxa" w:w="2200"/>
+            <w:tcMar>
+              <w:top w:w="80" w:type="dxa"/>
+              <w:start w:w="120" w:type="dxa"/>
+              <w:bottom w:w="80" w:type="dxa"/>
+              <w:end w:w="120" w:type="dxa"/>
+            </w:tcMar>
+            <w:vAlign w:val="center"/>
+          </w:tcPr>
+          <w:p>
+            <w:pPr>
+              <w:spacing w:after="0"/>
+            </w:pPr>
+            <w:r>
+              <w:rPr>
+                <w:sz w:val="18"/>
+              </w:rPr>
               <w:t>Inventory order status updated</w:t>
             </w:r>
           </w:p>
@@ -9789,6 +10724,54 @@
                 <w:sz w:val="18"/>
               </w:rPr>
               <w:t>Payment exists in `eventcart_payment.payment_attempts`</w:t>
+            </w:r>
+          </w:p>
+        </w:tc>
+      </w:tr>
+      <w:tr>
+        <w:tc>
+          <w:tcPr>
+            <w:tcW w:type="dxa" w:w="2200"/>
+            <w:tcMar>
+              <w:top w:w="80" w:type="dxa"/>
+              <w:start w:w="120" w:type="dxa"/>
+              <w:bottom w:w="80" w:type="dxa"/>
+              <w:end w:w="120" w:type="dxa"/>
+            </w:tcMar>
+            <w:vAlign w:val="center"/>
+          </w:tcPr>
+          <w:p>
+            <w:pPr>
+              <w:spacing w:after="0"/>
+            </w:pPr>
+            <w:r>
+              <w:rPr>
+                <w:sz w:val="18"/>
+              </w:rPr>
+              <w:t>Payment outbox event stored</w:t>
+            </w:r>
+          </w:p>
+        </w:tc>
+        <w:tc>
+          <w:tcPr>
+            <w:tcW w:type="dxa" w:w="7160"/>
+            <w:tcMar>
+              <w:top w:w="80" w:type="dxa"/>
+              <w:start w:w="120" w:type="dxa"/>
+              <w:bottom w:w="80" w:type="dxa"/>
+              <w:end w:w="120" w:type="dxa"/>
+            </w:tcMar>
+            <w:vAlign w:val="center"/>
+          </w:tcPr>
+          <w:p>
+            <w:pPr>
+              <w:spacing w:after="0"/>
+            </w:pPr>
+            <w:r>
+              <w:rPr>
+                <w:sz w:val="18"/>
+              </w:rPr>
+              <w:t>`eventcart_payment.outbox_events` contains the payment result event</w:t>
             </w:r>
           </w:p>
         </w:tc>
@@ -10053,6 +11036,102 @@
               <w:rPr>
                 <w:sz w:val="18"/>
               </w:rPr>
+              <w:t>Provider delivery optional</w:t>
+            </w:r>
+          </w:p>
+        </w:tc>
+        <w:tc>
+          <w:tcPr>
+            <w:tcW w:type="dxa" w:w="7160"/>
+            <w:tcMar>
+              <w:top w:w="80" w:type="dxa"/>
+              <w:start w:w="120" w:type="dxa"/>
+              <w:bottom w:w="80" w:type="dxa"/>
+              <w:end w:w="120" w:type="dxa"/>
+            </w:tcMar>
+            <w:vAlign w:val="center"/>
+          </w:tcPr>
+          <w:p>
+            <w:pPr>
+              <w:spacing w:after="0"/>
+            </w:pPr>
+            <w:r>
+              <w:rPr>
+                <w:sz w:val="18"/>
+              </w:rPr>
+              <w:t>Email/SMS delivery logs appear only when providers are enabled and contacts exist</w:t>
+            </w:r>
+          </w:p>
+        </w:tc>
+      </w:tr>
+      <w:tr>
+        <w:tc>
+          <w:tcPr>
+            <w:tcW w:type="dxa" w:w="2200"/>
+            <w:tcMar>
+              <w:top w:w="80" w:type="dxa"/>
+              <w:start w:w="120" w:type="dxa"/>
+              <w:bottom w:w="80" w:type="dxa"/>
+              <w:end w:w="120" w:type="dxa"/>
+            </w:tcMar>
+            <w:vAlign w:val="center"/>
+          </w:tcPr>
+          <w:p>
+            <w:pPr>
+              <w:spacing w:after="0"/>
+            </w:pPr>
+            <w:r>
+              <w:rPr>
+                <w:sz w:val="18"/>
+              </w:rPr>
+              <w:t>Ownership enforced</w:t>
+            </w:r>
+          </w:p>
+        </w:tc>
+        <w:tc>
+          <w:tcPr>
+            <w:tcW w:type="dxa" w:w="7160"/>
+            <w:tcMar>
+              <w:top w:w="80" w:type="dxa"/>
+              <w:start w:w="120" w:type="dxa"/>
+              <w:bottom w:w="80" w:type="dxa"/>
+              <w:end w:w="120" w:type="dxa"/>
+            </w:tcMar>
+            <w:vAlign w:val="center"/>
+          </w:tcPr>
+          <w:p>
+            <w:pPr>
+              <w:spacing w:after="0"/>
+            </w:pPr>
+            <w:r>
+              <w:rPr>
+                <w:sz w:val="18"/>
+              </w:rPr>
+              <w:t>`customer-user` can access `customer-1`; another customer ID returns `403`</w:t>
+            </w:r>
+          </w:p>
+        </w:tc>
+      </w:tr>
+      <w:tr>
+        <w:tc>
+          <w:tcPr>
+            <w:tcW w:type="dxa" w:w="2200"/>
+            <w:tcMar>
+              <w:top w:w="80" w:type="dxa"/>
+              <w:start w:w="120" w:type="dxa"/>
+              <w:bottom w:w="80" w:type="dxa"/>
+              <w:end w:w="120" w:type="dxa"/>
+            </w:tcMar>
+            <w:vAlign w:val="center"/>
+          </w:tcPr>
+          <w:p>
+            <w:pPr>
+              <w:spacing w:after="0"/>
+            </w:pPr>
+            <w:r>
+              <w:rPr>
+                <w:sz w:val="18"/>
+              </w:rPr>
               <w:t>Correlation ID present</w:t>
             </w:r>
           </w:p>
@@ -10125,6 +11204,54 @@
                 <w:sz w:val="18"/>
               </w:rPr>
               <w:t>`&lt;topic&gt;.dlq` topics appear in Kafka topic list</w:t>
+            </w:r>
+          </w:p>
+        </w:tc>
+      </w:tr>
+      <w:tr>
+        <w:tc>
+          <w:tcPr>
+            <w:tcW w:type="dxa" w:w="2200"/>
+            <w:tcMar>
+              <w:top w:w="80" w:type="dxa"/>
+              <w:start w:w="120" w:type="dxa"/>
+              <w:bottom w:w="80" w:type="dxa"/>
+              <w:end w:w="120" w:type="dxa"/>
+            </w:tcMar>
+            <w:vAlign w:val="center"/>
+          </w:tcPr>
+          <w:p>
+            <w:pPr>
+              <w:spacing w:after="0"/>
+            </w:pPr>
+            <w:r>
+              <w:rPr>
+                <w:sz w:val="18"/>
+              </w:rPr>
+              <w:t>Observability available</w:t>
+            </w:r>
+          </w:p>
+        </w:tc>
+        <w:tc>
+          <w:tcPr>
+            <w:tcW w:type="dxa" w:w="7160"/>
+            <w:tcMar>
+              <w:top w:w="80" w:type="dxa"/>
+              <w:start w:w="120" w:type="dxa"/>
+              <w:bottom w:w="80" w:type="dxa"/>
+              <w:end w:w="120" w:type="dxa"/>
+            </w:tcMar>
+            <w:vAlign w:val="center"/>
+          </w:tcPr>
+          <w:p>
+            <w:pPr>
+              <w:spacing w:after="0"/>
+            </w:pPr>
+            <w:r>
+              <w:rPr>
+                <w:sz w:val="18"/>
+              </w:rPr>
+              <w:t>Prometheus and Grafana are reachable on local ports</w:t>
             </w:r>
           </w:p>
         </w:tc>
@@ -10419,7 +11546,7 @@
               <w:rPr>
                 <w:sz w:val="18"/>
               </w:rPr>
-              <w:t>Token role is not allowed for that API</w:t>
+              <w:t>Token role is not allowed or customer ownership check failed</w:t>
             </w:r>
           </w:p>
         </w:tc>
@@ -10442,7 +11569,7 @@
               <w:rPr>
                 <w:sz w:val="18"/>
               </w:rPr>
-              <w:t>Use `ADMIN` for product/inventory, `CUSTOMER` for cart/order/notifications, or `SUPPORT` for lookup APIs</w:t>
+              <w:t>Use `ADMIN` for product/inventory, `CUSTOMER` for cart/order/notifications, `SUPPORT` for lookup APIs, and make sure customer token matches the requested `customerId`</w:t>
             </w:r>
           </w:p>
         </w:tc>
@@ -10585,6 +11712,148 @@
                 <w:sz w:val="18"/>
               </w:rPr>
               <w:t>Check `eventcart_order.outbox_events` status and order-service logs</w:t>
+            </w:r>
+          </w:p>
+        </w:tc>
+      </w:tr>
+      <w:tr>
+        <w:tc>
+          <w:tcPr>
+            <w:tcW w:type="dxa" w:w="1900"/>
+            <w:tcMar>
+              <w:top w:w="80" w:type="dxa"/>
+              <w:start w:w="120" w:type="dxa"/>
+              <w:bottom w:w="80" w:type="dxa"/>
+              <w:end w:w="120" w:type="dxa"/>
+            </w:tcMar>
+            <w:vAlign w:val="center"/>
+          </w:tcPr>
+          <w:p>
+            <w:pPr>
+              <w:spacing w:after="0"/>
+            </w:pPr>
+            <w:r>
+              <w:rPr>
+                <w:sz w:val="18"/>
+              </w:rPr>
+              <w:t>Inventory result not published</w:t>
+            </w:r>
+          </w:p>
+        </w:tc>
+        <w:tc>
+          <w:tcPr>
+            <w:tcW w:type="dxa" w:w="3100"/>
+            <w:tcMar>
+              <w:top w:w="80" w:type="dxa"/>
+              <w:start w:w="120" w:type="dxa"/>
+              <w:bottom w:w="80" w:type="dxa"/>
+              <w:end w:w="120" w:type="dxa"/>
+            </w:tcMar>
+            <w:vAlign w:val="center"/>
+          </w:tcPr>
+          <w:p>
+            <w:pPr>
+              <w:spacing w:after="0"/>
+            </w:pPr>
+            <w:r>
+              <w:rPr>
+                <w:sz w:val="18"/>
+              </w:rPr>
+              <w:t>Inventory outbox publisher has not published yet or Kafka is down</w:t>
+            </w:r>
+          </w:p>
+        </w:tc>
+        <w:tc>
+          <w:tcPr>
+            <w:tcW w:type="dxa" w:w="4360"/>
+            <w:tcMar>
+              <w:top w:w="80" w:type="dxa"/>
+              <w:start w:w="120" w:type="dxa"/>
+              <w:bottom w:w="80" w:type="dxa"/>
+              <w:end w:w="120" w:type="dxa"/>
+            </w:tcMar>
+            <w:vAlign w:val="center"/>
+          </w:tcPr>
+          <w:p>
+            <w:pPr>
+              <w:spacing w:after="0"/>
+            </w:pPr>
+            <w:r>
+              <w:rPr>
+                <w:sz w:val="18"/>
+              </w:rPr>
+              <w:t>Check `eventcart_inventory.outbox_events` status and inventory-service logs</w:t>
+            </w:r>
+          </w:p>
+        </w:tc>
+      </w:tr>
+      <w:tr>
+        <w:tc>
+          <w:tcPr>
+            <w:tcW w:type="dxa" w:w="1900"/>
+            <w:tcMar>
+              <w:top w:w="80" w:type="dxa"/>
+              <w:start w:w="120" w:type="dxa"/>
+              <w:bottom w:w="80" w:type="dxa"/>
+              <w:end w:w="120" w:type="dxa"/>
+            </w:tcMar>
+            <w:vAlign w:val="center"/>
+          </w:tcPr>
+          <w:p>
+            <w:pPr>
+              <w:spacing w:after="0"/>
+            </w:pPr>
+            <w:r>
+              <w:rPr>
+                <w:sz w:val="18"/>
+              </w:rPr>
+              <w:t>Payment result not published</w:t>
+            </w:r>
+          </w:p>
+        </w:tc>
+        <w:tc>
+          <w:tcPr>
+            <w:tcW w:type="dxa" w:w="3100"/>
+            <w:tcMar>
+              <w:top w:w="80" w:type="dxa"/>
+              <w:start w:w="120" w:type="dxa"/>
+              <w:bottom w:w="80" w:type="dxa"/>
+              <w:end w:w="120" w:type="dxa"/>
+            </w:tcMar>
+            <w:vAlign w:val="center"/>
+          </w:tcPr>
+          <w:p>
+            <w:pPr>
+              <w:spacing w:after="0"/>
+            </w:pPr>
+            <w:r>
+              <w:rPr>
+                <w:sz w:val="18"/>
+              </w:rPr>
+              <w:t>Payment outbox publisher has not published yet or Kafka is down</w:t>
+            </w:r>
+          </w:p>
+        </w:tc>
+        <w:tc>
+          <w:tcPr>
+            <w:tcW w:type="dxa" w:w="4360"/>
+            <w:tcMar>
+              <w:top w:w="80" w:type="dxa"/>
+              <w:start w:w="120" w:type="dxa"/>
+              <w:bottom w:w="80" w:type="dxa"/>
+              <w:end w:w="120" w:type="dxa"/>
+            </w:tcMar>
+            <w:vAlign w:val="center"/>
+          </w:tcPr>
+          <w:p>
+            <w:pPr>
+              <w:spacing w:after="0"/>
+            </w:pPr>
+            <w:r>
+              <w:rPr>
+                <w:sz w:val="18"/>
+              </w:rPr>
+              <w:t>Check `eventcart_payment.outbox_events` status and payment-service logs</w:t>
             </w:r>
           </w:p>
         </w:tc>
@@ -11177,6 +12446,77 @@
               <w:rPr>
                 <w:sz w:val="18"/>
               </w:rPr>
+              <w:t>Email/SMS not delivered</w:t>
+            </w:r>
+          </w:p>
+        </w:tc>
+        <w:tc>
+          <w:tcPr>
+            <w:tcW w:type="dxa" w:w="3100"/>
+            <w:tcMar>
+              <w:top w:w="80" w:type="dxa"/>
+              <w:start w:w="120" w:type="dxa"/>
+              <w:bottom w:w="80" w:type="dxa"/>
+              <w:end w:w="120" w:type="dxa"/>
+            </w:tcMar>
+            <w:vAlign w:val="center"/>
+          </w:tcPr>
+          <w:p>
+            <w:pPr>
+              <w:spacing w:after="0"/>
+            </w:pPr>
+            <w:r>
+              <w:rPr>
+                <w:sz w:val="18"/>
+              </w:rPr>
+              <w:t>Provider disabled, missing credentials, or missing customer contact</w:t>
+            </w:r>
+          </w:p>
+        </w:tc>
+        <w:tc>
+          <w:tcPr>
+            <w:tcW w:type="dxa" w:w="4360"/>
+            <w:tcMar>
+              <w:top w:w="80" w:type="dxa"/>
+              <w:start w:w="120" w:type="dxa"/>
+              <w:bottom w:w="80" w:type="dxa"/>
+              <w:end w:w="120" w:type="dxa"/>
+            </w:tcMar>
+            <w:vAlign w:val="center"/>
+          </w:tcPr>
+          <w:p>
+            <w:pPr>
+              <w:spacing w:after="0"/>
+            </w:pPr>
+            <w:r>
+              <w:rPr>
+                <w:sz w:val="18"/>
+              </w:rPr>
+              <w:t>Check notification-service provider settings and logs</w:t>
+            </w:r>
+          </w:p>
+        </w:tc>
+      </w:tr>
+      <w:tr>
+        <w:tc>
+          <w:tcPr>
+            <w:tcW w:type="dxa" w:w="1900"/>
+            <w:tcMar>
+              <w:top w:w="80" w:type="dxa"/>
+              <w:start w:w="120" w:type="dxa"/>
+              <w:bottom w:w="80" w:type="dxa"/>
+              <w:end w:w="120" w:type="dxa"/>
+            </w:tcMar>
+            <w:vAlign w:val="center"/>
+          </w:tcPr>
+          <w:p>
+            <w:pPr>
+              <w:spacing w:after="0"/>
+            </w:pPr>
+            <w:r>
+              <w:rPr>
+                <w:sz w:val="18"/>
+              </w:rPr>
               <w:t>Cart not cleared after success</w:t>
             </w:r>
           </w:p>
@@ -11200,7 +12540,7 @@
               <w:rPr>
                 <w:sz w:val="18"/>
               </w:rPr>
-              <w:t>cart-service was unavailable during cleanup</w:t>
+              <w:t>cart-service was unavailable or internal service token mismatch</w:t>
             </w:r>
           </w:p>
         </w:tc>
@@ -11223,7 +12563,7 @@
               <w:rPr>
                 <w:sz w:val="18"/>
               </w:rPr>
-              <w:t>Check order-service warning logs and cart-service health</w:t>
+              <w:t>Check order-service warning logs, cart-service health, and `EVENTCART_INTERNAL_SERVICE_TOKEN`</w:t>
             </w:r>
           </w:p>
         </w:tc>
@@ -11390,6 +12730,77 @@
               <w:rPr>
                 <w:sz w:val="18"/>
               </w:rPr>
+              <w:t>Grafana dashboard empty</w:t>
+            </w:r>
+          </w:p>
+        </w:tc>
+        <w:tc>
+          <w:tcPr>
+            <w:tcW w:type="dxa" w:w="3100"/>
+            <w:tcMar>
+              <w:top w:w="80" w:type="dxa"/>
+              <w:start w:w="120" w:type="dxa"/>
+              <w:bottom w:w="80" w:type="dxa"/>
+              <w:end w:w="120" w:type="dxa"/>
+            </w:tcMar>
+            <w:vAlign w:val="center"/>
+          </w:tcPr>
+          <w:p>
+            <w:pPr>
+              <w:spacing w:after="0"/>
+            </w:pPr>
+            <w:r>
+              <w:rPr>
+                <w:sz w:val="18"/>
+              </w:rPr>
+              <w:t>Services are not running or Prometheus scrape targets are down</w:t>
+            </w:r>
+          </w:p>
+        </w:tc>
+        <w:tc>
+          <w:tcPr>
+            <w:tcW w:type="dxa" w:w="4360"/>
+            <w:tcMar>
+              <w:top w:w="80" w:type="dxa"/>
+              <w:start w:w="120" w:type="dxa"/>
+              <w:bottom w:w="80" w:type="dxa"/>
+              <w:end w:w="120" w:type="dxa"/>
+            </w:tcMar>
+            <w:vAlign w:val="center"/>
+          </w:tcPr>
+          <w:p>
+            <w:pPr>
+              <w:spacing w:after="0"/>
+            </w:pPr>
+            <w:r>
+              <w:rPr>
+                <w:sz w:val="18"/>
+              </w:rPr>
+              <w:t>Check `http://localhost:9090/targets` and service `/actuator/prometheus` endpoints</w:t>
+            </w:r>
+          </w:p>
+        </w:tc>
+      </w:tr>
+      <w:tr>
+        <w:tc>
+          <w:tcPr>
+            <w:tcW w:type="dxa" w:w="1900"/>
+            <w:tcMar>
+              <w:top w:w="80" w:type="dxa"/>
+              <w:start w:w="120" w:type="dxa"/>
+              <w:bottom w:w="80" w:type="dxa"/>
+              <w:end w:w="120" w:type="dxa"/>
+            </w:tcMar>
+            <w:vAlign w:val="center"/>
+          </w:tcPr>
+          <w:p>
+            <w:pPr>
+              <w:spacing w:after="0"/>
+            </w:pPr>
+            <w:r>
+              <w:rPr>
+                <w:sz w:val="18"/>
+              </w:rPr>
               <w:t>Port already in use</w:t>
             </w:r>
           </w:p>
@@ -11557,17 +12968,7 @@
         <w:pStyle w:val="ListBullet"/>
       </w:pPr>
       <w:r>
-        <w:t xml:space="preserve">Why order-service uses the outbox pattern before publishing </w:t>
-      </w:r>
-      <w:r>
-        <w:rPr>
-          <w:rFonts w:ascii="Courier New" w:hAnsi="Courier New"/>
-          <w:sz w:val="19"/>
-        </w:rPr>
-        <w:t>OrderCreatedEvent</w:t>
-      </w:r>
-      <w:r>
-        <w:t>.</w:t>
+        <w:t>Why order-service, inventory-service, and payment-service use the outbox pattern before publishing events.</w:t>
       </w:r>
     </w:p>
     <w:p>
@@ -11591,7 +12992,23 @@
         <w:pStyle w:val="ListBullet"/>
       </w:pPr>
       <w:r>
+        <w:t>Why customer ownership checks are needed in addition to role-based access.</w:t>
+      </w:r>
+    </w:p>
+    <w:p>
+      <w:pPr>
+        <w:pStyle w:val="ListBullet"/>
+      </w:pPr>
+      <w:r>
         <w:t>Why the gateway is useful even though backend services still validate JWTs.</w:t>
+      </w:r>
+    </w:p>
+    <w:p>
+      <w:pPr>
+        <w:pStyle w:val="ListBullet"/>
+      </w:pPr>
+      <w:r>
+        <w:t>Why asynchronous service-to-service cleanup needs a separate internal credential.</w:t>
       </w:r>
     </w:p>
     <w:p>
@@ -11614,6 +13031,30 @@
     </w:p>
     <w:p>
       <w:pPr>
+        <w:pStyle w:val="ListBullet"/>
+      </w:pPr>
+      <w:r>
+        <w:t>How Prometheus, Grafana, and OpenTelemetry fit together.</w:t>
+      </w:r>
+    </w:p>
+    <w:p>
+      <w:pPr>
+        <w:pStyle w:val="ListBullet"/>
+      </w:pPr>
+      <w:r>
+        <w:t>Why secrets should be injected from environment variables, CI/CD stores, or Kubernetes secret integrations.</w:t>
+      </w:r>
+    </w:p>
+    <w:p>
+      <w:pPr>
+        <w:pStyle w:val="ListBullet"/>
+      </w:pPr>
+      <w:r>
+        <w:t>Why notification history is persisted before email/SMS provider delivery is attempted.</w:t>
+      </w:r>
+    </w:p>
+    <w:p>
+      <w:pPr>
         <w:pStyle w:val="Heading1"/>
       </w:pPr>
       <w:r>
@@ -11663,6 +13104,30 @@
       </w:pPr>
       <w:r>
         <w:t>Service startup order, port, or local infrastructure changes.</w:t>
+      </w:r>
+    </w:p>
+    <w:p>
+      <w:pPr>
+        <w:pStyle w:val="ListBullet"/>
+      </w:pPr>
+      <w:r>
+        <w:t>Security rules, ownership checks, or internal service-token behavior changes.</w:t>
+      </w:r>
+    </w:p>
+    <w:p>
+      <w:pPr>
+        <w:pStyle w:val="ListBullet"/>
+      </w:pPr>
+      <w:r>
+        <w:t>Notification provider configuration or contact resolution changes.</w:t>
+      </w:r>
+    </w:p>
+    <w:p>
+      <w:pPr>
+        <w:pStyle w:val="ListBullet"/>
+      </w:pPr>
+      <w:r>
+        <w:t>Observability, Docker, CI/CD, Kubernetes, or secret handling changes.</w:t>
       </w:r>
     </w:p>
     <w:p>

</xml_diff>

<commit_message>
added frontEND UI using react
</commit_message>
<xml_diff>
--- a/docs/EventCart-QA-Application-Flow.docx
+++ b/docs/EventCart-QA-Application-Flow.docx
@@ -247,6 +247,14 @@
         <w:pStyle w:val="ListBullet"/>
       </w:pPr>
       <w:r>
+        <w:t>Execute the same flow through the React UI.</w:t>
+      </w:r>
+    </w:p>
+    <w:p>
+      <w:pPr>
+        <w:pStyle w:val="ListBullet"/>
+      </w:pPr>
+      <w:r>
         <w:t>Verify where data is stored after each step.</w:t>
       </w:r>
     </w:p>
@@ -276,7 +284,7 @@
     </w:p>
     <w:p>
       <w:r>
-        <w:t>The current working slice covers API Gateway routing, Keycloak JWT security, customer ownership checks, product catalog, cart, order placement, transactional outbox publishing in order/inventory/payment services, inventory reservation, payment simulation, notification history, optional email/SMS delivery, Redis idempotency, Kafka retry/DLQ handling, observability, Docker/CI/Kubernetes packaging, and Kafka-based order status updates.</w:t>
+        <w:t>The current working slice covers React UI, API Gateway routing, Keycloak JWT security, customer ownership checks, product catalog, cart, order placement, transactional outbox publishing in order/inventory/payment services, inventory reservation, payment simulation, notification history, optional email/SMS delivery, Redis idempotency, Kafka retry/DLQ handling, observability, Docker/CI/Kubernetes packaging, and Kafka-based order status updates.</w:t>
       </w:r>
     </w:p>
     <w:tbl>
@@ -1112,6 +1120,54 @@
           </w:p>
         </w:tc>
       </w:tr>
+      <w:tr>
+        <w:tc>
+          <w:tcPr>
+            <w:tcW w:type="dxa" w:w="2200"/>
+            <w:tcMar>
+              <w:top w:w="80" w:type="dxa"/>
+              <w:start w:w="120" w:type="dxa"/>
+              <w:bottom w:w="80" w:type="dxa"/>
+              <w:end w:w="120" w:type="dxa"/>
+            </w:tcMar>
+            <w:vAlign w:val="center"/>
+          </w:tcPr>
+          <w:p>
+            <w:pPr>
+              <w:spacing w:after="0"/>
+            </w:pPr>
+            <w:r>
+              <w:rPr>
+                <w:sz w:val="18"/>
+              </w:rPr>
+              <w:t>React UI</w:t>
+            </w:r>
+          </w:p>
+        </w:tc>
+        <w:tc>
+          <w:tcPr>
+            <w:tcW w:type="dxa" w:w="7160"/>
+            <w:tcMar>
+              <w:top w:w="80" w:type="dxa"/>
+              <w:start w:w="120" w:type="dxa"/>
+              <w:bottom w:w="80" w:type="dxa"/>
+              <w:end w:w="120" w:type="dxa"/>
+            </w:tcMar>
+            <w:vAlign w:val="center"/>
+          </w:tcPr>
+          <w:p>
+            <w:pPr>
+              <w:spacing w:after="0"/>
+            </w:pPr>
+            <w:r>
+              <w:rPr>
+                <w:sz w:val="18"/>
+              </w:rPr>
+              <w:t>Browser console for catalog, cart, order tracking, notification review, and admin setup</w:t>
+            </w:r>
+          </w:p>
+        </w:tc>
+      </w:tr>
     </w:tbl>
     <w:p>
       <w:pPr>
@@ -1921,6 +1977,100 @@
               <w:rPr>
                 <w:sz w:val="18"/>
               </w:rPr>
+              <w:t>eventcart-ui</w:t>
+            </w:r>
+          </w:p>
+        </w:tc>
+        <w:tc>
+          <w:tcPr>
+            <w:tcW w:type="dxa" w:w="2100"/>
+            <w:tcMar>
+              <w:top w:w="80" w:type="dxa"/>
+              <w:start w:w="120" w:type="dxa"/>
+              <w:bottom w:w="80" w:type="dxa"/>
+              <w:end w:w="120" w:type="dxa"/>
+            </w:tcMar>
+            <w:vAlign w:val="center"/>
+          </w:tcPr>
+          <w:p>
+            <w:pPr>
+              <w:spacing w:after="0"/>
+            </w:pPr>
+            <w:r>
+              <w:rPr>
+                <w:sz w:val="18"/>
+              </w:rPr>
+              <w:t>5173</w:t>
+            </w:r>
+          </w:p>
+        </w:tc>
+        <w:tc>
+          <w:tcPr>
+            <w:tcW w:type="dxa" w:w="2300"/>
+            <w:tcMar>
+              <w:top w:w="80" w:type="dxa"/>
+              <w:start w:w="120" w:type="dxa"/>
+              <w:bottom w:w="80" w:type="dxa"/>
+              <w:end w:w="120" w:type="dxa"/>
+            </w:tcMar>
+            <w:vAlign w:val="center"/>
+          </w:tcPr>
+          <w:p>
+            <w:pPr>
+              <w:spacing w:after="0"/>
+            </w:pPr>
+            <w:r>
+              <w:rPr>
+                <w:sz w:val="18"/>
+              </w:rPr>
+              <w:t>React local development console</w:t>
+            </w:r>
+          </w:p>
+        </w:tc>
+        <w:tc>
+          <w:tcPr>
+            <w:tcW w:type="dxa" w:w="3160"/>
+            <w:tcMar>
+              <w:top w:w="80" w:type="dxa"/>
+              <w:start w:w="120" w:type="dxa"/>
+              <w:bottom w:w="80" w:type="dxa"/>
+              <w:end w:w="120" w:type="dxa"/>
+            </w:tcMar>
+            <w:vAlign w:val="center"/>
+          </w:tcPr>
+          <w:p>
+            <w:pPr>
+              <w:spacing w:after="0"/>
+            </w:pPr>
+            <w:r>
+              <w:rPr>
+                <w:sz w:val="18"/>
+              </w:rPr>
+              <w:t>Calls API Gateway through Vite proxy</w:t>
+            </w:r>
+          </w:p>
+        </w:tc>
+      </w:tr>
+      <w:tr>
+        <w:tc>
+          <w:tcPr>
+            <w:tcW w:type="dxa" w:w="1800"/>
+            <w:tcMar>
+              <w:top w:w="80" w:type="dxa"/>
+              <w:start w:w="120" w:type="dxa"/>
+              <w:bottom w:w="80" w:type="dxa"/>
+              <w:end w:w="120" w:type="dxa"/>
+            </w:tcMar>
+            <w:vAlign w:val="center"/>
+          </w:tcPr>
+          <w:p>
+            <w:pPr>
+              <w:spacing w:after="0"/>
+            </w:pPr>
+            <w:r>
+              <w:rPr>
+                <w:sz w:val="18"/>
+              </w:rPr>
               <w:t>MongoDB</w:t>
             </w:r>
           </w:p>
@@ -3302,6 +3452,171 @@
     <w:p>
       <w:r>
         <w:t>The startup order matters for manual testing because cart-service calls catalog-service, order-service calls cart-service, api-gateway routes to every backend service, and inventory/order/payment/notification communicate through Kafka.</w:t>
+      </w:r>
+    </w:p>
+    <w:p>
+      <w:r>
+        <w:t>Start the React UI after the gateway is running:</w:t>
+      </w:r>
+    </w:p>
+    <w:p>
+      <w:pPr>
+        <w:spacing w:before="0" w:after="0"/>
+        <w:ind w:left="216"/>
+        <w:shd w:fill="F4F6F9"/>
+      </w:pPr>
+      <w:r>
+        <w:rPr>
+          <w:rFonts w:ascii="Courier New" w:hAnsi="Courier New"/>
+          <w:sz w:val="17"/>
+        </w:rPr>
+        <w:t>cd C:\Users\HP\Documents\Study\EventCart\frontend\eventcart-ui</w:t>
+      </w:r>
+    </w:p>
+    <w:p>
+      <w:pPr>
+        <w:spacing w:before="0" w:after="0"/>
+        <w:ind w:left="216"/>
+        <w:shd w:fill="F4F6F9"/>
+      </w:pPr>
+      <w:r>
+        <w:rPr>
+          <w:rFonts w:ascii="Courier New" w:hAnsi="Courier New"/>
+          <w:sz w:val="17"/>
+        </w:rPr>
+        <w:t>npm.cmd install</w:t>
+      </w:r>
+    </w:p>
+    <w:p>
+      <w:pPr>
+        <w:spacing w:before="0" w:after="0"/>
+        <w:ind w:left="216"/>
+        <w:shd w:fill="F4F6F9"/>
+      </w:pPr>
+      <w:r>
+        <w:rPr>
+          <w:rFonts w:ascii="Courier New" w:hAnsi="Courier New"/>
+          <w:sz w:val="17"/>
+        </w:rPr>
+        <w:t>npm.cmd run dev</w:t>
+      </w:r>
+    </w:p>
+    <w:p>
+      <w:pPr>
+        <w:spacing w:after="80"/>
+      </w:pPr>
+    </w:p>
+    <w:p>
+      <w:r>
+        <w:t>Open:</w:t>
+      </w:r>
+    </w:p>
+    <w:p>
+      <w:pPr>
+        <w:spacing w:before="0" w:after="0"/>
+        <w:ind w:left="216"/>
+        <w:shd w:fill="F4F6F9"/>
+      </w:pPr>
+      <w:r>
+        <w:rPr>
+          <w:rFonts w:ascii="Courier New" w:hAnsi="Courier New"/>
+          <w:sz w:val="17"/>
+        </w:rPr>
+        <w:t>http://localhost:5173</w:t>
+      </w:r>
+    </w:p>
+    <w:p>
+      <w:pPr>
+        <w:spacing w:after="80"/>
+      </w:pPr>
+    </w:p>
+    <w:p>
+      <w:r>
+        <w:t>Recommended UI smoke path:</w:t>
+      </w:r>
+    </w:p>
+    <w:p>
+      <w:pPr>
+        <w:pStyle w:val="ListNumber"/>
+      </w:pPr>
+      <w:r>
+        <w:t xml:space="preserve">Sign in as </w:t>
+      </w:r>
+      <w:r>
+        <w:rPr>
+          <w:rFonts w:ascii="Courier New" w:hAnsi="Courier New"/>
+          <w:sz w:val="19"/>
+        </w:rPr>
+        <w:t>admin-user/admin</w:t>
+      </w:r>
+      <w:r>
+        <w:t>.</w:t>
+      </w:r>
+    </w:p>
+    <w:p>
+      <w:pPr>
+        <w:pStyle w:val="ListNumber"/>
+      </w:pPr>
+      <w:r>
+        <w:t>Create a product from Admin.</w:t>
+      </w:r>
+    </w:p>
+    <w:p>
+      <w:pPr>
+        <w:pStyle w:val="ListNumber"/>
+      </w:pPr>
+      <w:r>
+        <w:t>Seed inventory from Admin.</w:t>
+      </w:r>
+    </w:p>
+    <w:p>
+      <w:pPr>
+        <w:pStyle w:val="ListNumber"/>
+      </w:pPr>
+      <w:r>
+        <w:t xml:space="preserve">Sign in as </w:t>
+      </w:r>
+      <w:r>
+        <w:rPr>
+          <w:rFonts w:ascii="Courier New" w:hAnsi="Courier New"/>
+          <w:sz w:val="19"/>
+        </w:rPr>
+        <w:t>customer-user/customer</w:t>
+      </w:r>
+      <w:r>
+        <w:t>.</w:t>
+      </w:r>
+    </w:p>
+    <w:p>
+      <w:pPr>
+        <w:pStyle w:val="ListNumber"/>
+      </w:pPr>
+      <w:r>
+        <w:t>Add the product from Catalog to Cart.</w:t>
+      </w:r>
+    </w:p>
+    <w:p>
+      <w:pPr>
+        <w:pStyle w:val="ListNumber"/>
+      </w:pPr>
+      <w:r>
+        <w:t>Place the order from Cart.</w:t>
+      </w:r>
+    </w:p>
+    <w:p>
+      <w:pPr>
+        <w:pStyle w:val="ListNumber"/>
+      </w:pPr>
+      <w:r>
+        <w:t>Track the order in Orders.</w:t>
+      </w:r>
+    </w:p>
+    <w:p>
+      <w:pPr>
+        <w:pStyle w:val="ListNumber"/>
+      </w:pPr>
+      <w:r>
+        <w:t>Verify notifications in Notifications.</w:t>
       </w:r>
     </w:p>
     <w:p>
@@ -13127,6 +13442,14 @@
         <w:pStyle w:val="ListBullet"/>
       </w:pPr>
       <w:r>
+        <w:t>React route, screen, form, authentication, or UI smoke flow changes.</w:t>
+      </w:r>
+    </w:p>
+    <w:p>
+      <w:pPr>
+        <w:pStyle w:val="ListBullet"/>
+      </w:pPr>
+      <w:r>
         <w:t>Observability, Docker, CI/CD, Kubernetes, or secret handling changes.</w:t>
       </w:r>
     </w:p>

</xml_diff>